<commit_message>
Report: Git Bash terminals, dark screenshots, desktop captures, readable figure
- term-shots.mjs draws the project's own terminal: the VS Code panel tabs,
  the Git Bash prompt in its colours, and the block cursor, instead of a
  generic dark frame.
- The browser suites capture in dark appearance, and a new desktop project
  (web/e2e/screens.spec.ts, 1440x900) photographs every surface, so the
  report shows the product on both form factors.
- make_figures.py redraws the accuracy against latency scatter: every label
  sits in a column beside the plot with a leader line, because a dozen
  MiniLM variants share a latency and their labels were printed on top of
  each other.
- CI uses the organisation's gitleaks licence when GITLEAKS_LICENSE is set,
  and falls back to the CLI when it is not.
</commit_message>
<xml_diff>
--- a/docs/test-report/Lanka-Link-v3-Master-Test-Plan.docx
+++ b/docs/test-report/Lanka-Link-v3-Master-Test-Plan.docx
@@ -334,7 +334,7 @@
       <w:r>
         <w:fldChar w:fldCharType="separate"/>
       </w:r>
-      <w:hyperlink w:anchor="_Toc240806575" w:history="1">
+      <w:hyperlink w:anchor="_Toc240810453" w:history="1">
         <w:r>
           <w:rPr>
             <w:rStyle w:val="Hyperlink"/>
@@ -380,7 +380,7 @@
             <w:noProof/>
             <w:webHidden/>
           </w:rPr>
-          <w:instrText xml:space="preserve"> PAGEREF _Toc240806575 \h </w:instrText>
+          <w:instrText xml:space="preserve"> PAGEREF _Toc240810453 \h </w:instrText>
         </w:r>
         <w:r>
           <w:rPr>
@@ -427,7 +427,7 @@
           <w14:ligatures w14:val="standardContextual"/>
         </w:rPr>
       </w:pPr>
-      <w:hyperlink w:anchor="_Toc240806576" w:history="1">
+      <w:hyperlink w:anchor="_Toc240810454" w:history="1">
         <w:r>
           <w:rPr>
             <w:rStyle w:val="Hyperlink"/>
@@ -473,7 +473,7 @@
             <w:noProof/>
             <w:webHidden/>
           </w:rPr>
-          <w:instrText xml:space="preserve"> PAGEREF _Toc240806576 \h </w:instrText>
+          <w:instrText xml:space="preserve"> PAGEREF _Toc240810454 \h </w:instrText>
         </w:r>
         <w:r>
           <w:rPr>
@@ -520,7 +520,7 @@
           <w14:ligatures w14:val="standardContextual"/>
         </w:rPr>
       </w:pPr>
-      <w:hyperlink w:anchor="_Toc240806577" w:history="1">
+      <w:hyperlink w:anchor="_Toc240810455" w:history="1">
         <w:r>
           <w:rPr>
             <w:rStyle w:val="Hyperlink"/>
@@ -566,7 +566,7 @@
             <w:noProof/>
             <w:webHidden/>
           </w:rPr>
-          <w:instrText xml:space="preserve"> PAGEREF _Toc240806577 \h </w:instrText>
+          <w:instrText xml:space="preserve"> PAGEREF _Toc240810455 \h </w:instrText>
         </w:r>
         <w:r>
           <w:rPr>
@@ -613,7 +613,7 @@
           <w14:ligatures w14:val="standardContextual"/>
         </w:rPr>
       </w:pPr>
-      <w:hyperlink w:anchor="_Toc240806578" w:history="1">
+      <w:hyperlink w:anchor="_Toc240810456" w:history="1">
         <w:r>
           <w:rPr>
             <w:rStyle w:val="Hyperlink"/>
@@ -659,7 +659,7 @@
             <w:noProof/>
             <w:webHidden/>
           </w:rPr>
-          <w:instrText xml:space="preserve"> PAGEREF _Toc240806578 \h </w:instrText>
+          <w:instrText xml:space="preserve"> PAGEREF _Toc240810456 \h </w:instrText>
         </w:r>
         <w:r>
           <w:rPr>
@@ -703,7 +703,7 @@
           <w14:ligatures w14:val="standardContextual"/>
         </w:rPr>
       </w:pPr>
-      <w:hyperlink w:anchor="_Toc240806579" w:history="1">
+      <w:hyperlink w:anchor="_Toc240810457" w:history="1">
         <w:r>
           <w:rPr>
             <w:rStyle w:val="Hyperlink"/>
@@ -749,7 +749,7 @@
             <w:noProof/>
             <w:webHidden/>
           </w:rPr>
-          <w:instrText xml:space="preserve"> PAGEREF _Toc240806579 \h </w:instrText>
+          <w:instrText xml:space="preserve"> PAGEREF _Toc240810457 \h </w:instrText>
         </w:r>
         <w:r>
           <w:rPr>
@@ -793,7 +793,7 @@
           <w14:ligatures w14:val="standardContextual"/>
         </w:rPr>
       </w:pPr>
-      <w:hyperlink w:anchor="_Toc240806580" w:history="1">
+      <w:hyperlink w:anchor="_Toc240810458" w:history="1">
         <w:r>
           <w:rPr>
             <w:rStyle w:val="Hyperlink"/>
@@ -839,7 +839,7 @@
             <w:noProof/>
             <w:webHidden/>
           </w:rPr>
-          <w:instrText xml:space="preserve"> PAGEREF _Toc240806580 \h </w:instrText>
+          <w:instrText xml:space="preserve"> PAGEREF _Toc240810458 \h </w:instrText>
         </w:r>
         <w:r>
           <w:rPr>
@@ -883,7 +883,7 @@
           <w14:ligatures w14:val="standardContextual"/>
         </w:rPr>
       </w:pPr>
-      <w:hyperlink w:anchor="_Toc240806581" w:history="1">
+      <w:hyperlink w:anchor="_Toc240810459" w:history="1">
         <w:r>
           <w:rPr>
             <w:rStyle w:val="Hyperlink"/>
@@ -929,7 +929,7 @@
             <w:noProof/>
             <w:webHidden/>
           </w:rPr>
-          <w:instrText xml:space="preserve"> PAGEREF _Toc240806581 \h </w:instrText>
+          <w:instrText xml:space="preserve"> PAGEREF _Toc240810459 \h </w:instrText>
         </w:r>
         <w:r>
           <w:rPr>
@@ -973,7 +973,7 @@
           <w14:ligatures w14:val="standardContextual"/>
         </w:rPr>
       </w:pPr>
-      <w:hyperlink w:anchor="_Toc240806582" w:history="1">
+      <w:hyperlink w:anchor="_Toc240810460" w:history="1">
         <w:r>
           <w:rPr>
             <w:rStyle w:val="Hyperlink"/>
@@ -1019,7 +1019,7 @@
             <w:noProof/>
             <w:webHidden/>
           </w:rPr>
-          <w:instrText xml:space="preserve"> PAGEREF _Toc240806582 \h </w:instrText>
+          <w:instrText xml:space="preserve"> PAGEREF _Toc240810460 \h </w:instrText>
         </w:r>
         <w:r>
           <w:rPr>
@@ -1039,7 +1039,7 @@
             <w:noProof/>
             <w:webHidden/>
           </w:rPr>
-          <w:t>11</w:t>
+          <w:t>12</w:t>
         </w:r>
         <w:r>
           <w:rPr>
@@ -1063,7 +1063,7 @@
           <w14:ligatures w14:val="standardContextual"/>
         </w:rPr>
       </w:pPr>
-      <w:hyperlink w:anchor="_Toc240806583" w:history="1">
+      <w:hyperlink w:anchor="_Toc240810461" w:history="1">
         <w:r>
           <w:rPr>
             <w:rStyle w:val="Hyperlink"/>
@@ -1109,7 +1109,7 @@
             <w:noProof/>
             <w:webHidden/>
           </w:rPr>
-          <w:instrText xml:space="preserve"> PAGEREF _Toc240806583 \h </w:instrText>
+          <w:instrText xml:space="preserve"> PAGEREF _Toc240810461 \h </w:instrText>
         </w:r>
         <w:r>
           <w:rPr>
@@ -1129,7 +1129,7 @@
             <w:noProof/>
             <w:webHidden/>
           </w:rPr>
-          <w:t>12</w:t>
+          <w:t>13</w:t>
         </w:r>
         <w:r>
           <w:rPr>
@@ -1153,7 +1153,7 @@
           <w14:ligatures w14:val="standardContextual"/>
         </w:rPr>
       </w:pPr>
-      <w:hyperlink w:anchor="_Toc240806584" w:history="1">
+      <w:hyperlink w:anchor="_Toc240810462" w:history="1">
         <w:r>
           <w:rPr>
             <w:rStyle w:val="Hyperlink"/>
@@ -1199,7 +1199,7 @@
             <w:noProof/>
             <w:webHidden/>
           </w:rPr>
-          <w:instrText xml:space="preserve"> PAGEREF _Toc240806584 \h </w:instrText>
+          <w:instrText xml:space="preserve"> PAGEREF _Toc240810462 \h </w:instrText>
         </w:r>
         <w:r>
           <w:rPr>
@@ -1219,7 +1219,7 @@
             <w:noProof/>
             <w:webHidden/>
           </w:rPr>
-          <w:t>17</w:t>
+          <w:t>18</w:t>
         </w:r>
         <w:r>
           <w:rPr>
@@ -1243,7 +1243,7 @@
           <w14:ligatures w14:val="standardContextual"/>
         </w:rPr>
       </w:pPr>
-      <w:hyperlink w:anchor="_Toc240806585" w:history="1">
+      <w:hyperlink w:anchor="_Toc240810463" w:history="1">
         <w:r>
           <w:rPr>
             <w:rStyle w:val="Hyperlink"/>
@@ -1289,7 +1289,7 @@
             <w:noProof/>
             <w:webHidden/>
           </w:rPr>
-          <w:instrText xml:space="preserve"> PAGEREF _Toc240806585 \h </w:instrText>
+          <w:instrText xml:space="preserve"> PAGEREF _Toc240810463 \h </w:instrText>
         </w:r>
         <w:r>
           <w:rPr>
@@ -1309,7 +1309,7 @@
             <w:noProof/>
             <w:webHidden/>
           </w:rPr>
-          <w:t>18</w:t>
+          <w:t>19</w:t>
         </w:r>
         <w:r>
           <w:rPr>
@@ -1333,7 +1333,7 @@
           <w14:ligatures w14:val="standardContextual"/>
         </w:rPr>
       </w:pPr>
-      <w:hyperlink w:anchor="_Toc240806586" w:history="1">
+      <w:hyperlink w:anchor="_Toc240810464" w:history="1">
         <w:r>
           <w:rPr>
             <w:rStyle w:val="Hyperlink"/>
@@ -1379,7 +1379,7 @@
             <w:noProof/>
             <w:webHidden/>
           </w:rPr>
-          <w:instrText xml:space="preserve"> PAGEREF _Toc240806586 \h </w:instrText>
+          <w:instrText xml:space="preserve"> PAGEREF _Toc240810464 \h </w:instrText>
         </w:r>
         <w:r>
           <w:rPr>
@@ -1399,7 +1399,7 @@
             <w:noProof/>
             <w:webHidden/>
           </w:rPr>
-          <w:t>18</w:t>
+          <w:t>19</w:t>
         </w:r>
         <w:r>
           <w:rPr>
@@ -1426,7 +1426,7 @@
           <w14:ligatures w14:val="standardContextual"/>
         </w:rPr>
       </w:pPr>
-      <w:hyperlink w:anchor="_Toc240806587" w:history="1">
+      <w:hyperlink w:anchor="_Toc240810465" w:history="1">
         <w:r>
           <w:rPr>
             <w:rStyle w:val="Hyperlink"/>
@@ -1472,7 +1472,7 @@
             <w:noProof/>
             <w:webHidden/>
           </w:rPr>
-          <w:instrText xml:space="preserve"> PAGEREF _Toc240806587 \h </w:instrText>
+          <w:instrText xml:space="preserve"> PAGEREF _Toc240810465 \h </w:instrText>
         </w:r>
         <w:r>
           <w:rPr>
@@ -1492,7 +1492,7 @@
             <w:noProof/>
             <w:webHidden/>
           </w:rPr>
-          <w:t>19</w:t>
+          <w:t>20</w:t>
         </w:r>
         <w:r>
           <w:rPr>
@@ -1516,7 +1516,7 @@
           <w14:ligatures w14:val="standardContextual"/>
         </w:rPr>
       </w:pPr>
-      <w:hyperlink w:anchor="_Toc240806588" w:history="1">
+      <w:hyperlink w:anchor="_Toc240810466" w:history="1">
         <w:r>
           <w:rPr>
             <w:rStyle w:val="Hyperlink"/>
@@ -1562,7 +1562,7 @@
             <w:noProof/>
             <w:webHidden/>
           </w:rPr>
-          <w:instrText xml:space="preserve"> PAGEREF _Toc240806588 \h </w:instrText>
+          <w:instrText xml:space="preserve"> PAGEREF _Toc240810466 \h </w:instrText>
         </w:r>
         <w:r>
           <w:rPr>
@@ -1606,7 +1606,7 @@
           <w14:ligatures w14:val="standardContextual"/>
         </w:rPr>
       </w:pPr>
-      <w:hyperlink w:anchor="_Toc240806589" w:history="1">
+      <w:hyperlink w:anchor="_Toc240810467" w:history="1">
         <w:r>
           <w:rPr>
             <w:rStyle w:val="Hyperlink"/>
@@ -1652,7 +1652,7 @@
             <w:noProof/>
             <w:webHidden/>
           </w:rPr>
-          <w:instrText xml:space="preserve"> PAGEREF _Toc240806589 \h </w:instrText>
+          <w:instrText xml:space="preserve"> PAGEREF _Toc240810467 \h </w:instrText>
         </w:r>
         <w:r>
           <w:rPr>
@@ -1696,7 +1696,7 @@
           <w14:ligatures w14:val="standardContextual"/>
         </w:rPr>
       </w:pPr>
-      <w:hyperlink w:anchor="_Toc240806590" w:history="1">
+      <w:hyperlink w:anchor="_Toc240810468" w:history="1">
         <w:r>
           <w:rPr>
             <w:rStyle w:val="Hyperlink"/>
@@ -1742,7 +1742,7 @@
             <w:noProof/>
             <w:webHidden/>
           </w:rPr>
-          <w:instrText xml:space="preserve"> PAGEREF _Toc240806590 \h </w:instrText>
+          <w:instrText xml:space="preserve"> PAGEREF _Toc240810468 \h </w:instrText>
         </w:r>
         <w:r>
           <w:rPr>
@@ -1762,7 +1762,7 @@
             <w:noProof/>
             <w:webHidden/>
           </w:rPr>
-          <w:t>22</w:t>
+          <w:t>23</w:t>
         </w:r>
         <w:r>
           <w:rPr>
@@ -1786,7 +1786,7 @@
           <w14:ligatures w14:val="standardContextual"/>
         </w:rPr>
       </w:pPr>
-      <w:hyperlink w:anchor="_Toc240806591" w:history="1">
+      <w:hyperlink w:anchor="_Toc240810469" w:history="1">
         <w:r>
           <w:rPr>
             <w:rStyle w:val="Hyperlink"/>
@@ -1832,7 +1832,7 @@
             <w:noProof/>
             <w:webHidden/>
           </w:rPr>
-          <w:instrText xml:space="preserve"> PAGEREF _Toc240806591 \h </w:instrText>
+          <w:instrText xml:space="preserve"> PAGEREF _Toc240810469 \h </w:instrText>
         </w:r>
         <w:r>
           <w:rPr>
@@ -1876,7 +1876,7 @@
           <w14:ligatures w14:val="standardContextual"/>
         </w:rPr>
       </w:pPr>
-      <w:hyperlink w:anchor="_Toc240806592" w:history="1">
+      <w:hyperlink w:anchor="_Toc240810470" w:history="1">
         <w:r>
           <w:rPr>
             <w:rStyle w:val="Hyperlink"/>
@@ -1922,7 +1922,7 @@
             <w:noProof/>
             <w:webHidden/>
           </w:rPr>
-          <w:instrText xml:space="preserve"> PAGEREF _Toc240806592 \h </w:instrText>
+          <w:instrText xml:space="preserve"> PAGEREF _Toc240810470 \h </w:instrText>
         </w:r>
         <w:r>
           <w:rPr>
@@ -1969,7 +1969,7 @@
           <w14:ligatures w14:val="standardContextual"/>
         </w:rPr>
       </w:pPr>
-      <w:hyperlink w:anchor="_Toc240806593" w:history="1">
+      <w:hyperlink w:anchor="_Toc240810471" w:history="1">
         <w:r>
           <w:rPr>
             <w:rStyle w:val="Hyperlink"/>
@@ -2015,7 +2015,7 @@
             <w:noProof/>
             <w:webHidden/>
           </w:rPr>
-          <w:instrText xml:space="preserve"> PAGEREF _Toc240806593 \h </w:instrText>
+          <w:instrText xml:space="preserve"> PAGEREF _Toc240810471 \h </w:instrText>
         </w:r>
         <w:r>
           <w:rPr>
@@ -2062,7 +2062,7 @@
           <w14:ligatures w14:val="standardContextual"/>
         </w:rPr>
       </w:pPr>
-      <w:hyperlink w:anchor="_Toc240806594" w:history="1">
+      <w:hyperlink w:anchor="_Toc240810472" w:history="1">
         <w:r>
           <w:rPr>
             <w:rStyle w:val="Hyperlink"/>
@@ -2108,7 +2108,7 @@
             <w:noProof/>
             <w:webHidden/>
           </w:rPr>
-          <w:instrText xml:space="preserve"> PAGEREF _Toc240806594 \h </w:instrText>
+          <w:instrText xml:space="preserve"> PAGEREF _Toc240810472 \h </w:instrText>
         </w:r>
         <w:r>
           <w:rPr>
@@ -2155,7 +2155,7 @@
           <w14:ligatures w14:val="standardContextual"/>
         </w:rPr>
       </w:pPr>
-      <w:hyperlink w:anchor="_Toc240806595" w:history="1">
+      <w:hyperlink w:anchor="_Toc240810473" w:history="1">
         <w:r>
           <w:rPr>
             <w:rStyle w:val="Hyperlink"/>
@@ -2201,7 +2201,7 @@
             <w:noProof/>
             <w:webHidden/>
           </w:rPr>
-          <w:instrText xml:space="preserve"> PAGEREF _Toc240806595 \h </w:instrText>
+          <w:instrText xml:space="preserve"> PAGEREF _Toc240810473 \h </w:instrText>
         </w:r>
         <w:r>
           <w:rPr>
@@ -2221,7 +2221,7 @@
             <w:noProof/>
             <w:webHidden/>
           </w:rPr>
-          <w:t>29</w:t>
+          <w:t>28</w:t>
         </w:r>
         <w:r>
           <w:rPr>
@@ -2248,7 +2248,7 @@
           <w14:ligatures w14:val="standardContextual"/>
         </w:rPr>
       </w:pPr>
-      <w:hyperlink w:anchor="_Toc240806596" w:history="1">
+      <w:hyperlink w:anchor="_Toc240810474" w:history="1">
         <w:r>
           <w:rPr>
             <w:rStyle w:val="Hyperlink"/>
@@ -2294,7 +2294,7 @@
             <w:noProof/>
             <w:webHidden/>
           </w:rPr>
-          <w:instrText xml:space="preserve"> PAGEREF _Toc240806596 \h </w:instrText>
+          <w:instrText xml:space="preserve"> PAGEREF _Toc240810474 \h </w:instrText>
         </w:r>
         <w:r>
           <w:rPr>
@@ -2341,7 +2341,7 @@
           <w14:ligatures w14:val="standardContextual"/>
         </w:rPr>
       </w:pPr>
-      <w:hyperlink w:anchor="_Toc240806597" w:history="1">
+      <w:hyperlink w:anchor="_Toc240810475" w:history="1">
         <w:r>
           <w:rPr>
             <w:rStyle w:val="Hyperlink"/>
@@ -2387,7 +2387,7 @@
             <w:noProof/>
             <w:webHidden/>
           </w:rPr>
-          <w:instrText xml:space="preserve"> PAGEREF _Toc240806597 \h </w:instrText>
+          <w:instrText xml:space="preserve"> PAGEREF _Toc240810475 \h </w:instrText>
         </w:r>
         <w:r>
           <w:rPr>
@@ -2459,7 +2459,7 @@
       <w:pPr>
         <w:pStyle w:val="Heading1"/>
       </w:pPr>
-      <w:bookmarkStart w:id="0" w:name="_Toc240806575"/>
+      <w:bookmarkStart w:id="0" w:name="_Toc240810453"/>
       <w:r>
         <w:t>Evaluation Mission and Test Motivation</w:t>
       </w:r>
@@ -2622,7 +2622,7 @@
       <w:pPr>
         <w:pStyle w:val="Heading1"/>
       </w:pPr>
-      <w:bookmarkStart w:id="1" w:name="_Toc240806576"/>
+      <w:bookmarkStart w:id="1" w:name="_Toc240810454"/>
       <w:r>
         <w:t>Target Test Items</w:t>
       </w:r>
@@ -3301,7 +3301,7 @@
       <w:pPr>
         <w:pStyle w:val="Heading1"/>
       </w:pPr>
-      <w:bookmarkStart w:id="2" w:name="_Toc240806577"/>
+      <w:bookmarkStart w:id="2" w:name="_Toc240810455"/>
       <w:r>
         <w:t>Test Approach</w:t>
       </w:r>
@@ -3844,7 +3844,7 @@
       <w:pPr>
         <w:pStyle w:val="Heading2"/>
       </w:pPr>
-      <w:bookmarkStart w:id="3" w:name="_Toc240806578"/>
+      <w:bookmarkStart w:id="3" w:name="_Toc240810456"/>
       <w:r>
         <w:lastRenderedPageBreak/>
         <w:t>Testing Techniques and Types</w:t>
@@ -3855,7 +3855,7 @@
       <w:pPr>
         <w:pStyle w:val="Heading3"/>
       </w:pPr>
-      <w:bookmarkStart w:id="4" w:name="_Toc240806579"/>
+      <w:bookmarkStart w:id="4" w:name="_Toc240810457"/>
       <w:r>
         <w:t>Data and Database Integrity Testing</w:t>
       </w:r>
@@ -4220,8 +4220,8 @@
           <w:noProof/>
         </w:rPr>
         <w:drawing>
-          <wp:inline distT="0" distB="0" distL="0" distR="0" wp14:anchorId="5CFBAB2C" wp14:editId="3DE2A08F">
-            <wp:extent cx="5486400" cy="1995055"/>
+          <wp:inline distT="0" distB="0" distL="0" distR="0" wp14:anchorId="74B6F2EC" wp14:editId="2992440B">
+            <wp:extent cx="5486400" cy="1264662"/>
             <wp:effectExtent l="0" t="0" r="0" b="0"/>
             <wp:docPr id="1" name="Picture 1"/>
             <wp:cNvGraphicFramePr>
@@ -4243,7 +4243,7 @@
                   <pic:spPr>
                     <a:xfrm>
                       <a:off x="0" y="0"/>
-                      <a:ext cx="5486400" cy="1995055"/>
+                      <a:ext cx="5486400" cy="1264662"/>
                     </a:xfrm>
                     <a:prstGeom prst="rect">
                       <a:avLst/>
@@ -4274,7 +4274,7 @@
       <w:pPr>
         <w:pStyle w:val="Heading3"/>
       </w:pPr>
-      <w:bookmarkStart w:id="5" w:name="_Toc240806580"/>
+      <w:bookmarkStart w:id="5" w:name="_Toc240810458"/>
       <w:r>
         <w:t>Function Testing</w:t>
       </w:r>
@@ -4326,7 +4326,6 @@
               <w:spacing w:after="60"/>
             </w:pPr>
             <w:r>
-              <w:lastRenderedPageBreak/>
               <w:t>Technique Objective:</w:t>
             </w:r>
           </w:p>
@@ -4365,6 +4364,7 @@
               <w:spacing w:after="60"/>
             </w:pPr>
             <w:r>
+              <w:lastRenderedPageBreak/>
               <w:t>Technique:</w:t>
             </w:r>
           </w:p>
@@ -4633,8 +4633,8 @@
           <w:noProof/>
         </w:rPr>
         <w:drawing>
-          <wp:inline distT="0" distB="0" distL="0" distR="0" wp14:anchorId="3A36652B" wp14:editId="53D3E695">
-            <wp:extent cx="5486400" cy="2630147"/>
+          <wp:inline distT="0" distB="0" distL="0" distR="0" wp14:anchorId="6B491AA8" wp14:editId="6E9095DD">
+            <wp:extent cx="5486400" cy="2442533"/>
             <wp:effectExtent l="0" t="0" r="0" b="0"/>
             <wp:docPr id="2" name="Picture 2"/>
             <wp:cNvGraphicFramePr>
@@ -4656,7 +4656,7 @@
                   <pic:spPr>
                     <a:xfrm>
                       <a:off x="0" y="0"/>
-                      <a:ext cx="5486400" cy="2630147"/>
+                      <a:ext cx="5486400" cy="2442533"/>
                     </a:xfrm>
                     <a:prstGeom prst="rect">
                       <a:avLst/>
@@ -4691,7 +4691,6 @@
         <w:rPr>
           <w:b/>
         </w:rPr>
-        <w:lastRenderedPageBreak/>
         <w:t>Groq triage.</w:t>
       </w:r>
       <w:r>
@@ -4752,6 +4751,7 @@
               <w:rPr>
                 <w:b/>
               </w:rPr>
+              <w:lastRenderedPageBreak/>
               <w:t>Groq model</w:t>
             </w:r>
           </w:p>
@@ -5117,8 +5117,8 @@
           <w:noProof/>
         </w:rPr>
         <w:drawing>
-          <wp:inline distT="0" distB="0" distL="0" distR="0" wp14:anchorId="0341B24E" wp14:editId="0A621B74">
-            <wp:extent cx="4754880" cy="1729047"/>
+          <wp:inline distT="0" distB="0" distL="0" distR="0" wp14:anchorId="3BD242C9" wp14:editId="0C58EA78">
+            <wp:extent cx="4754880" cy="805912"/>
             <wp:effectExtent l="0" t="0" r="0" b="0"/>
             <wp:docPr id="3" name="Picture 3"/>
             <wp:cNvGraphicFramePr>
@@ -5140,7 +5140,7 @@
                   <pic:spPr>
                     <a:xfrm>
                       <a:off x="0" y="0"/>
-                      <a:ext cx="4754880" cy="1729047"/>
+                      <a:ext cx="4754880" cy="805912"/>
                     </a:xfrm>
                     <a:prstGeom prst="rect">
                       <a:avLst/>
@@ -5171,7 +5171,7 @@
       <w:pPr>
         <w:pStyle w:val="Heading3"/>
       </w:pPr>
-      <w:bookmarkStart w:id="6" w:name="_Toc240806581"/>
+      <w:bookmarkStart w:id="6" w:name="_Toc240810459"/>
       <w:r>
         <w:t>User Interface Testing</w:t>
       </w:r>
@@ -5378,7 +5378,6 @@
               <w:spacing w:after="60"/>
             </w:pPr>
             <w:r>
-              <w:lastRenderedPageBreak/>
               <w:t>Required Tools:</w:t>
             </w:r>
           </w:p>
@@ -5498,6 +5497,7 @@
         <w:rPr>
           <w:b/>
         </w:rPr>
+        <w:lastRenderedPageBreak/>
         <w:t>Result: 11 desktop and 5 mobile browser tests passed, 0 failed.</w:t>
       </w:r>
       <w:r>
@@ -5505,6 +5505,14 @@
       </w:r>
       <w:r>
         <w:t>gs in the header, the inbox as cards, the model map as a list on phones, a sim clock bar that scrolls within itself, and the overflow causes themselves (a header whose hidden class lost to the button's own display, a grid child without min-width, oversize key caps). The run also found D12: signing out of the customer area landed on the sign-in page instead of the website.</w:t>
+      </w:r>
+    </w:p>
+    <w:p>
+      <w:pPr>
+        <w:pStyle w:val="BodyText"/>
+      </w:pPr>
+      <w:r>
+        <w:t>The screenshots below are the product in dark appearance, which is what a phone or a desktop set to dark shows; the suites capture both form factors on every run.</w:t>
       </w:r>
     </w:p>
     <w:p>
@@ -5517,7 +5525,7 @@
           <w:noProof/>
         </w:rPr>
         <w:drawing>
-          <wp:inline distT="0" distB="0" distL="0" distR="0" wp14:anchorId="70C3DEB2" wp14:editId="25435448">
+          <wp:inline distT="0" distB="0" distL="0" distR="0" wp14:anchorId="4A27C214" wp14:editId="724D53DA">
             <wp:extent cx="5760720" cy="2875859"/>
             <wp:effectExtent l="0" t="0" r="0" b="0"/>
             <wp:docPr id="4" name="Picture 4"/>
@@ -5576,9 +5584,8 @@
         <w:rPr>
           <w:noProof/>
         </w:rPr>
-        <w:lastRenderedPageBreak/>
         <w:drawing>
-          <wp:inline distT="0" distB="0" distL="0" distR="0" wp14:anchorId="23052201" wp14:editId="16F63DA8">
+          <wp:inline distT="0" distB="0" distL="0" distR="0" wp14:anchorId="1B96C331" wp14:editId="01CADEFC">
             <wp:extent cx="5760720" cy="2875859"/>
             <wp:effectExtent l="0" t="0" r="0" b="0"/>
             <wp:docPr id="5" name="Picture 5"/>
@@ -5637,8 +5644,9 @@
         <w:rPr>
           <w:noProof/>
         </w:rPr>
+        <w:lastRenderedPageBreak/>
         <w:drawing>
-          <wp:inline distT="0" distB="0" distL="0" distR="0" wp14:anchorId="7FA81FD5" wp14:editId="6FDA2B5B">
+          <wp:inline distT="0" distB="0" distL="0" distR="0" wp14:anchorId="5ED91527" wp14:editId="490D6E6F">
             <wp:extent cx="5760720" cy="2875859"/>
             <wp:effectExtent l="0" t="0" r="0" b="0"/>
             <wp:docPr id="6" name="Picture 6"/>
@@ -5697,12 +5705,253 @@
         <w:rPr>
           <w:noProof/>
         </w:rPr>
+        <w:drawing>
+          <wp:inline distT="0" distB="0" distL="0" distR="0" wp14:anchorId="23526D12" wp14:editId="2C2F0FBA">
+            <wp:extent cx="5577840" cy="3486150"/>
+            <wp:effectExtent l="0" t="0" r="0" b="0"/>
+            <wp:docPr id="7" name="Picture 7"/>
+            <wp:cNvGraphicFramePr>
+              <a:graphicFrameLocks xmlns:a="http://schemas.openxmlformats.org/drawingml/2006/main" noChangeAspect="1"/>
+            </wp:cNvGraphicFramePr>
+            <a:graphic xmlns:a="http://schemas.openxmlformats.org/drawingml/2006/main">
+              <a:graphicData uri="http://schemas.openxmlformats.org/drawingml/2006/picture">
+                <pic:pic xmlns:pic="http://schemas.openxmlformats.org/drawingml/2006/picture">
+                  <pic:nvPicPr>
+                    <pic:cNvPr id="0" name="console-inbox.jpg"/>
+                    <pic:cNvPicPr/>
+                  </pic:nvPicPr>
+                  <pic:blipFill>
+                    <a:blip r:embed="rId15"/>
+                    <a:stretch>
+                      <a:fillRect/>
+                    </a:stretch>
+                  </pic:blipFill>
+                  <pic:spPr>
+                    <a:xfrm>
+                      <a:off x="0" y="0"/>
+                      <a:ext cx="5577840" cy="3486150"/>
+                    </a:xfrm>
+                    <a:prstGeom prst="rect">
+                      <a:avLst/>
+                    </a:prstGeom>
+                  </pic:spPr>
+                </pic:pic>
+              </a:graphicData>
+            </a:graphic>
+          </wp:inline>
+        </w:drawing>
+      </w:r>
+    </w:p>
+    <w:p>
+      <w:pPr>
+        <w:pStyle w:val="BodyText"/>
+        <w:jc w:val="center"/>
+      </w:pPr>
+      <w:r>
+        <w:rPr>
+          <w:i/>
+          <w:color w:val="555555"/>
+          <w:sz w:val="18"/>
+        </w:rPr>
+        <w:t>Figure 7: The agent console on a desktop browser, dark.</w:t>
+      </w:r>
+    </w:p>
+    <w:p>
+      <w:pPr>
+        <w:pStyle w:val="BodyText"/>
+        <w:jc w:val="center"/>
+      </w:pPr>
+      <w:r>
+        <w:rPr>
+          <w:noProof/>
+        </w:rPr>
         <w:lastRenderedPageBreak/>
         <w:drawing>
-          <wp:inline distT="0" distB="0" distL="0" distR="0" wp14:anchorId="1FBE415D" wp14:editId="60DE57A3">
-            <wp:extent cx="5486400" cy="2533719"/>
+          <wp:inline distT="0" distB="0" distL="0" distR="0" wp14:anchorId="247B114A" wp14:editId="2052F8A2">
+            <wp:extent cx="5577840" cy="3486150"/>
             <wp:effectExtent l="0" t="0" r="0" b="0"/>
-            <wp:docPr id="7" name="Picture 7"/>
+            <wp:docPr id="8" name="Picture 8"/>
+            <wp:cNvGraphicFramePr>
+              <a:graphicFrameLocks xmlns:a="http://schemas.openxmlformats.org/drawingml/2006/main" noChangeAspect="1"/>
+            </wp:cNvGraphicFramePr>
+            <a:graphic xmlns:a="http://schemas.openxmlformats.org/drawingml/2006/main">
+              <a:graphicData uri="http://schemas.openxmlformats.org/drawingml/2006/picture">
+                <pic:pic xmlns:pic="http://schemas.openxmlformats.org/drawingml/2006/picture">
+                  <pic:nvPicPr>
+                    <pic:cNvPr id="0" name="admin-models.jpg"/>
+                    <pic:cNvPicPr/>
+                  </pic:nvPicPr>
+                  <pic:blipFill>
+                    <a:blip r:embed="rId16"/>
+                    <a:stretch>
+                      <a:fillRect/>
+                    </a:stretch>
+                  </pic:blipFill>
+                  <pic:spPr>
+                    <a:xfrm>
+                      <a:off x="0" y="0"/>
+                      <a:ext cx="5577840" cy="3486150"/>
+                    </a:xfrm>
+                    <a:prstGeom prst="rect">
+                      <a:avLst/>
+                    </a:prstGeom>
+                  </pic:spPr>
+                </pic:pic>
+              </a:graphicData>
+            </a:graphic>
+          </wp:inline>
+        </w:drawing>
+      </w:r>
+    </w:p>
+    <w:p>
+      <w:pPr>
+        <w:pStyle w:val="BodyText"/>
+        <w:jc w:val="center"/>
+      </w:pPr>
+      <w:r>
+        <w:rPr>
+          <w:i/>
+          <w:color w:val="555555"/>
+          <w:sz w:val="18"/>
+        </w:rPr>
+        <w:t>Figure 8: The model map, where every stage is verified and rebound.</w:t>
+      </w:r>
+    </w:p>
+    <w:p>
+      <w:pPr>
+        <w:pStyle w:val="BodyText"/>
+        <w:jc w:val="center"/>
+      </w:pPr>
+      <w:r>
+        <w:rPr>
+          <w:noProof/>
+        </w:rPr>
+        <w:drawing>
+          <wp:inline distT="0" distB="0" distL="0" distR="0" wp14:anchorId="2A1933E6" wp14:editId="23E8B840">
+            <wp:extent cx="5577840" cy="3486150"/>
+            <wp:effectExtent l="0" t="0" r="0" b="0"/>
+            <wp:docPr id="9" name="Picture 9"/>
+            <wp:cNvGraphicFramePr>
+              <a:graphicFrameLocks xmlns:a="http://schemas.openxmlformats.org/drawingml/2006/main" noChangeAspect="1"/>
+            </wp:cNvGraphicFramePr>
+            <a:graphic xmlns:a="http://schemas.openxmlformats.org/drawingml/2006/main">
+              <a:graphicData uri="http://schemas.openxmlformats.org/drawingml/2006/picture">
+                <pic:pic xmlns:pic="http://schemas.openxmlformats.org/drawingml/2006/picture">
+                  <pic:nvPicPr>
+                    <pic:cNvPr id="0" name="sim-network.jpg"/>
+                    <pic:cNvPicPr/>
+                  </pic:nvPicPr>
+                  <pic:blipFill>
+                    <a:blip r:embed="rId17"/>
+                    <a:stretch>
+                      <a:fillRect/>
+                    </a:stretch>
+                  </pic:blipFill>
+                  <pic:spPr>
+                    <a:xfrm>
+                      <a:off x="0" y="0"/>
+                      <a:ext cx="5577840" cy="3486150"/>
+                    </a:xfrm>
+                    <a:prstGeom prst="rect">
+                      <a:avLst/>
+                    </a:prstGeom>
+                  </pic:spPr>
+                </pic:pic>
+              </a:graphicData>
+            </a:graphic>
+          </wp:inline>
+        </w:drawing>
+      </w:r>
+    </w:p>
+    <w:p>
+      <w:pPr>
+        <w:pStyle w:val="BodyText"/>
+        <w:jc w:val="center"/>
+      </w:pPr>
+      <w:r>
+        <w:rPr>
+          <w:i/>
+          <w:color w:val="555555"/>
+          <w:sz w:val="18"/>
+        </w:rPr>
+        <w:t>Figure 9: The simulated network an operator breaks things on.</w:t>
+      </w:r>
+    </w:p>
+    <w:p>
+      <w:pPr>
+        <w:pStyle w:val="BodyText"/>
+        <w:jc w:val="center"/>
+      </w:pPr>
+      <w:r>
+        <w:rPr>
+          <w:noProof/>
+        </w:rPr>
+        <w:lastRenderedPageBreak/>
+        <w:drawing>
+          <wp:inline distT="0" distB="0" distL="0" distR="0" wp14:anchorId="31F143D8" wp14:editId="0FC49215">
+            <wp:extent cx="5577840" cy="3486150"/>
+            <wp:effectExtent l="0" t="0" r="0" b="0"/>
+            <wp:docPr id="10" name="Picture 10"/>
+            <wp:cNvGraphicFramePr>
+              <a:graphicFrameLocks xmlns:a="http://schemas.openxmlformats.org/drawingml/2006/main" noChangeAspect="1"/>
+            </wp:cNvGraphicFramePr>
+            <a:graphic xmlns:a="http://schemas.openxmlformats.org/drawingml/2006/main">
+              <a:graphicData uri="http://schemas.openxmlformats.org/drawingml/2006/picture">
+                <pic:pic xmlns:pic="http://schemas.openxmlformats.org/drawingml/2006/picture">
+                  <pic:nvPicPr>
+                    <pic:cNvPr id="0" name="customer-home.jpg"/>
+                    <pic:cNvPicPr/>
+                  </pic:nvPicPr>
+                  <pic:blipFill>
+                    <a:blip r:embed="rId18"/>
+                    <a:stretch>
+                      <a:fillRect/>
+                    </a:stretch>
+                  </pic:blipFill>
+                  <pic:spPr>
+                    <a:xfrm>
+                      <a:off x="0" y="0"/>
+                      <a:ext cx="5577840" cy="3486150"/>
+                    </a:xfrm>
+                    <a:prstGeom prst="rect">
+                      <a:avLst/>
+                    </a:prstGeom>
+                  </pic:spPr>
+                </pic:pic>
+              </a:graphicData>
+            </a:graphic>
+          </wp:inline>
+        </w:drawing>
+      </w:r>
+    </w:p>
+    <w:p>
+      <w:pPr>
+        <w:pStyle w:val="BodyText"/>
+        <w:jc w:val="center"/>
+      </w:pPr>
+      <w:r>
+        <w:rPr>
+          <w:i/>
+          <w:color w:val="555555"/>
+          <w:sz w:val="18"/>
+        </w:rPr>
+        <w:t>Figure 10: The customer's home screen on a desktop browser.</w:t>
+      </w:r>
+    </w:p>
+    <w:p>
+      <w:pPr>
+        <w:pStyle w:val="BodyText"/>
+        <w:jc w:val="center"/>
+      </w:pPr>
+      <w:r>
+        <w:rPr>
+          <w:noProof/>
+        </w:rPr>
+        <w:drawing>
+          <wp:inline distT="0" distB="0" distL="0" distR="0" wp14:anchorId="0324F697" wp14:editId="3C14B2DB">
+            <wp:extent cx="5486400" cy="2442533"/>
+            <wp:effectExtent l="0" t="0" r="0" b="0"/>
+            <wp:docPr id="11" name="Picture 11"/>
             <wp:cNvGraphicFramePr>
               <a:graphicFrameLocks xmlns:a="http://schemas.openxmlformats.org/drawingml/2006/main" noChangeAspect="1"/>
             </wp:cNvGraphicFramePr>
@@ -5714,7 +5963,7 @@
                     <pic:cNvPicPr/>
                   </pic:nvPicPr>
                   <pic:blipFill>
-                    <a:blip r:embed="rId15"/>
+                    <a:blip r:embed="rId19"/>
                     <a:stretch>
                       <a:fillRect/>
                     </a:stretch>
@@ -5722,7 +5971,7 @@
                   <pic:spPr>
                     <a:xfrm>
                       <a:off x="0" y="0"/>
-                      <a:ext cx="5486400" cy="2533719"/>
+                      <a:ext cx="5486400" cy="2442533"/>
                     </a:xfrm>
                     <a:prstGeom prst="rect">
                       <a:avLst/>
@@ -5746,14 +5995,14 @@
           <w:color w:val="555555"/>
           <w:sz w:val="18"/>
         </w:rPr>
-        <w:t>Figure 7: Browser tests, desktop and mobile projects.</w:t>
+        <w:t>Figure 11: Browser tests, desktop and mobile projects.</w:t>
       </w:r>
     </w:p>
     <w:p>
       <w:pPr>
         <w:pStyle w:val="Heading3"/>
       </w:pPr>
-      <w:bookmarkStart w:id="7" w:name="_Toc240806582"/>
+      <w:bookmarkStart w:id="7" w:name="_Toc240810460"/>
       <w:r>
         <w:t>Performance Profiling</w:t>
       </w:r>
@@ -5843,6 +6092,7 @@
               <w:spacing w:after="60"/>
             </w:pPr>
             <w:r>
+              <w:lastRenderedPageBreak/>
               <w:t>Technique:</w:t>
             </w:r>
           </w:p>
@@ -6419,7 +6669,6 @@
               <w:spacing w:after="60"/>
             </w:pPr>
             <w:r>
-              <w:lastRenderedPageBreak/>
               <w:t>Diagnose</w:t>
             </w:r>
           </w:p>
@@ -6793,10 +7042,10 @@
           <w:noProof/>
         </w:rPr>
         <w:drawing>
-          <wp:inline distT="0" distB="0" distL="0" distR="0" wp14:anchorId="4CD4F3A9" wp14:editId="2094865E">
-            <wp:extent cx="5486400" cy="1995055"/>
+          <wp:inline distT="0" distB="0" distL="0" distR="0" wp14:anchorId="011E57A7" wp14:editId="04154EDB">
+            <wp:extent cx="5486400" cy="1264662"/>
             <wp:effectExtent l="0" t="0" r="0" b="0"/>
-            <wp:docPr id="8" name="Picture 8"/>
+            <wp:docPr id="12" name="Picture 12"/>
             <wp:cNvGraphicFramePr>
               <a:graphicFrameLocks xmlns:a="http://schemas.openxmlformats.org/drawingml/2006/main" noChangeAspect="1"/>
             </wp:cNvGraphicFramePr>
@@ -6808,7 +7057,7 @@
                     <pic:cNvPicPr/>
                   </pic:nvPicPr>
                   <pic:blipFill>
-                    <a:blip r:embed="rId16"/>
+                    <a:blip r:embed="rId20"/>
                     <a:stretch>
                       <a:fillRect/>
                     </a:stretch>
@@ -6816,7 +7065,7 @@
                   <pic:spPr>
                     <a:xfrm>
                       <a:off x="0" y="0"/>
-                      <a:ext cx="5486400" cy="1995055"/>
+                      <a:ext cx="5486400" cy="1264662"/>
                     </a:xfrm>
                     <a:prstGeom prst="rect">
                       <a:avLst/>
@@ -6840,14 +7089,14 @@
           <w:color w:val="555555"/>
           <w:sz w:val="18"/>
         </w:rPr>
-        <w:t>Figure 8: Performance budgets, from the full run.</w:t>
+        <w:t>Figure 12: Performance budgets, from the full run.</w:t>
       </w:r>
     </w:p>
     <w:p>
       <w:pPr>
         <w:pStyle w:val="Heading3"/>
       </w:pPr>
-      <w:bookmarkStart w:id="8" w:name="_Toc240806583"/>
+      <w:bookmarkStart w:id="8" w:name="_Toc240810461"/>
       <w:r>
         <w:t>Load Testing</w:t>
       </w:r>
@@ -6899,6 +7148,7 @@
               <w:spacing w:after="60"/>
             </w:pPr>
             <w:r>
+              <w:lastRenderedPageBreak/>
               <w:t>Technique Objective:</w:t>
             </w:r>
           </w:p>
@@ -7193,7 +7443,6 @@
               <w:rPr>
                 <w:b/>
               </w:rPr>
-              <w:lastRenderedPageBreak/>
               <w:t>Metric</w:t>
             </w:r>
           </w:p>
@@ -7554,10 +7803,10 @@
         </w:rPr>
         <w:lastRenderedPageBreak/>
         <w:drawing>
-          <wp:inline distT="0" distB="0" distL="0" distR="0" wp14:anchorId="7CF3942B" wp14:editId="27883587">
-            <wp:extent cx="5486400" cy="8365929"/>
+          <wp:inline distT="0" distB="0" distL="0" distR="0" wp14:anchorId="407EC8FA" wp14:editId="5AF1049B">
+            <wp:extent cx="5486400" cy="7752252"/>
             <wp:effectExtent l="0" t="0" r="0" b="0"/>
-            <wp:docPr id="9" name="Picture 9"/>
+            <wp:docPr id="13" name="Picture 13"/>
             <wp:cNvGraphicFramePr>
               <a:graphicFrameLocks xmlns:a="http://schemas.openxmlformats.org/drawingml/2006/main" noChangeAspect="1"/>
             </wp:cNvGraphicFramePr>
@@ -7569,7 +7818,7 @@
                     <pic:cNvPicPr/>
                   </pic:nvPicPr>
                   <pic:blipFill>
-                    <a:blip r:embed="rId17"/>
+                    <a:blip r:embed="rId21"/>
                     <a:stretch>
                       <a:fillRect/>
                     </a:stretch>
@@ -7577,7 +7826,7 @@
                   <pic:spPr>
                     <a:xfrm>
                       <a:off x="0" y="0"/>
-                      <a:ext cx="5486400" cy="8365929"/>
+                      <a:ext cx="5486400" cy="7752252"/>
                     </a:xfrm>
                     <a:prstGeom prst="rect">
                       <a:avLst/>
@@ -7601,8 +7850,7 @@
           <w:color w:val="555555"/>
           <w:sz w:val="18"/>
         </w:rPr>
-        <w:lastRenderedPageBreak/>
-        <w:t>Figure 9: k6 on the write path: every threshold met, no failed request.</w:t>
+        <w:t>Figure 13: k6 on the write path: every threshold met, no failed request.</w:t>
       </w:r>
     </w:p>
     <w:p>
@@ -7613,6 +7861,7 @@
         <w:rPr>
           <w:b/>
         </w:rPr>
+        <w:lastRenderedPageBreak/>
         <w:t>Behind the acknowledgement, the pipeline under that burst.</w:t>
       </w:r>
       <w:r>
@@ -7972,10 +8221,10 @@
         </w:rPr>
         <w:lastRenderedPageBreak/>
         <w:drawing>
-          <wp:inline distT="0" distB="0" distL="0" distR="0" wp14:anchorId="2F7A31EB" wp14:editId="7DD9CED9">
-            <wp:extent cx="5486400" cy="8365929"/>
+          <wp:inline distT="0" distB="0" distL="0" distR="0" wp14:anchorId="6B4A8A78" wp14:editId="25AF0778">
+            <wp:extent cx="5486400" cy="7752252"/>
             <wp:effectExtent l="0" t="0" r="0" b="0"/>
-            <wp:docPr id="10" name="Picture 10"/>
+            <wp:docPr id="14" name="Picture 14"/>
             <wp:cNvGraphicFramePr>
               <a:graphicFrameLocks xmlns:a="http://schemas.openxmlformats.org/drawingml/2006/main" noChangeAspect="1"/>
             </wp:cNvGraphicFramePr>
@@ -7987,7 +8236,7 @@
                     <pic:cNvPicPr/>
                   </pic:nvPicPr>
                   <pic:blipFill>
-                    <a:blip r:embed="rId18"/>
+                    <a:blip r:embed="rId22"/>
                     <a:stretch>
                       <a:fillRect/>
                     </a:stretch>
@@ -7995,7 +8244,7 @@
                   <pic:spPr>
                     <a:xfrm>
                       <a:off x="0" y="0"/>
-                      <a:ext cx="5486400" cy="8365929"/>
+                      <a:ext cx="5486400" cy="7752252"/>
                     </a:xfrm>
                     <a:prstGeom prst="rect">
                       <a:avLst/>
@@ -8019,8 +8268,7 @@
           <w:color w:val="555555"/>
           <w:sz w:val="18"/>
         </w:rPr>
-        <w:lastRenderedPageBreak/>
-        <w:t>Figure 10: k6 against production, read only.</w:t>
+        <w:t>Figure 14: k6 against production, read only.</w:t>
       </w:r>
     </w:p>
     <w:p>
@@ -8028,6 +8276,7 @@
         <w:pStyle w:val="BodyText"/>
       </w:pPr>
       <w:r>
+        <w:lastRenderedPageBreak/>
         <w:t>The server held 20 concurrent readers with no failed request while it was also running its own simulated traffic and the monitoring stack, on 2 vCPU and 7.9 GB. CPU sat near 49 percent and memory at 53 percent during the run, and the page p95 of 1.8 s is mostly the landing page, which is rendered per request. Writes were deliberately not load tested against production.</w:t>
       </w:r>
     </w:p>
@@ -8035,7 +8284,7 @@
       <w:pPr>
         <w:pStyle w:val="Heading3"/>
       </w:pPr>
-      <w:bookmarkStart w:id="9" w:name="_Toc240806584"/>
+      <w:bookmarkStart w:id="9" w:name="_Toc240810462"/>
       <w:r>
         <w:t>Security and Access Control Testing</w:t>
       </w:r>
@@ -8390,10 +8639,10 @@
           <w:noProof/>
         </w:rPr>
         <w:drawing>
-          <wp:inline distT="0" distB="0" distL="0" distR="0" wp14:anchorId="27E149CD" wp14:editId="08D917C4">
-            <wp:extent cx="5486400" cy="1995055"/>
+          <wp:inline distT="0" distB="0" distL="0" distR="0" wp14:anchorId="46BE5365" wp14:editId="0E922A81">
+            <wp:extent cx="5486400" cy="1850497"/>
             <wp:effectExtent l="0" t="0" r="0" b="0"/>
-            <wp:docPr id="11" name="Picture 11"/>
+            <wp:docPr id="15" name="Picture 15"/>
             <wp:cNvGraphicFramePr>
               <a:graphicFrameLocks xmlns:a="http://schemas.openxmlformats.org/drawingml/2006/main" noChangeAspect="1"/>
             </wp:cNvGraphicFramePr>
@@ -8405,7 +8654,7 @@
                     <pic:cNvPicPr/>
                   </pic:nvPicPr>
                   <pic:blipFill>
-                    <a:blip r:embed="rId19"/>
+                    <a:blip r:embed="rId23"/>
                     <a:stretch>
                       <a:fillRect/>
                     </a:stretch>
@@ -8413,7 +8662,7 @@
                   <pic:spPr>
                     <a:xfrm>
                       <a:off x="0" y="0"/>
-                      <a:ext cx="5486400" cy="1995055"/>
+                      <a:ext cx="5486400" cy="1850497"/>
                     </a:xfrm>
                     <a:prstGeom prst="rect">
                       <a:avLst/>
@@ -8437,16 +8686,16 @@
           <w:color w:val="555555"/>
           <w:sz w:val="18"/>
         </w:rPr>
-        <w:lastRenderedPageBreak/>
-        <w:t>Figure 12: Access control tests, from the full run.</w:t>
+        <w:t>Figure 16: Access control tests, from the full run.</w:t>
       </w:r>
     </w:p>
     <w:p>
       <w:pPr>
         <w:pStyle w:val="Heading3"/>
       </w:pPr>
-      <w:bookmarkStart w:id="10" w:name="_Toc240806585"/>
-      <w:r>
+      <w:bookmarkStart w:id="10" w:name="_Toc240810463"/>
+      <w:r>
+        <w:lastRenderedPageBreak/>
         <w:t>Failover and Recovery Testing</w:t>
       </w:r>
       <w:bookmarkEnd w:id="10"/>
@@ -8780,10 +9029,10 @@
           <w:noProof/>
         </w:rPr>
         <w:drawing>
-          <wp:inline distT="0" distB="0" distL="0" distR="0" wp14:anchorId="0B7168F6" wp14:editId="18D46608">
-            <wp:extent cx="5486400" cy="1995055"/>
+          <wp:inline distT="0" distB="0" distL="0" distR="0" wp14:anchorId="18753E0E" wp14:editId="64DA527C">
+            <wp:extent cx="5486400" cy="929898"/>
             <wp:effectExtent l="0" t="0" r="0" b="0"/>
-            <wp:docPr id="12" name="Picture 12"/>
+            <wp:docPr id="16" name="Picture 16"/>
             <wp:cNvGraphicFramePr>
               <a:graphicFrameLocks xmlns:a="http://schemas.openxmlformats.org/drawingml/2006/main" noChangeAspect="1"/>
             </wp:cNvGraphicFramePr>
@@ -8795,7 +9044,7 @@
                     <pic:cNvPicPr/>
                   </pic:nvPicPr>
                   <pic:blipFill>
-                    <a:blip r:embed="rId20"/>
+                    <a:blip r:embed="rId24"/>
                     <a:stretch>
                       <a:fillRect/>
                     </a:stretch>
@@ -8803,7 +9052,7 @@
                   <pic:spPr>
                     <a:xfrm>
                       <a:off x="0" y="0"/>
-                      <a:ext cx="5486400" cy="1995055"/>
+                      <a:ext cx="5486400" cy="929898"/>
                     </a:xfrm>
                     <a:prstGeom prst="rect">
                       <a:avLst/>
@@ -8827,14 +9076,14 @@
           <w:color w:val="555555"/>
           <w:sz w:val="18"/>
         </w:rPr>
-        <w:t>Figure 13: Failover and recovery tests, from the full run.</w:t>
+        <w:t>Figure 17: Failover and recovery tests, from the full run.</w:t>
       </w:r>
     </w:p>
     <w:p>
       <w:pPr>
         <w:pStyle w:val="Heading3"/>
       </w:pPr>
-      <w:bookmarkStart w:id="11" w:name="_Toc240806586"/>
+      <w:bookmarkStart w:id="11" w:name="_Toc240810464"/>
       <w:r>
         <w:t>Configuration Testing</w:t>
       </w:r>
@@ -8924,7 +9173,6 @@
               <w:spacing w:after="60"/>
             </w:pPr>
             <w:r>
-              <w:lastRenderedPageBreak/>
               <w:t>Technique:</w:t>
             </w:r>
           </w:p>
@@ -9129,6 +9377,7 @@
               <w:spacing w:after="60"/>
             </w:pPr>
             <w:r>
+              <w:lastRenderedPageBreak/>
               <w:t>Special Considerations:</w:t>
             </w:r>
           </w:p>
@@ -9177,10 +9426,10 @@
           <w:noProof/>
         </w:rPr>
         <w:drawing>
-          <wp:inline distT="0" distB="0" distL="0" distR="0" wp14:anchorId="275B1162" wp14:editId="6BB69339">
-            <wp:extent cx="5303520" cy="1928553"/>
+          <wp:inline distT="0" distB="0" distL="0" distR="0" wp14:anchorId="269B501E" wp14:editId="2F5D460C">
+            <wp:extent cx="5303520" cy="1384309"/>
             <wp:effectExtent l="0" t="0" r="0" b="0"/>
-            <wp:docPr id="13" name="Picture 13"/>
+            <wp:docPr id="17" name="Picture 17"/>
             <wp:cNvGraphicFramePr>
               <a:graphicFrameLocks xmlns:a="http://schemas.openxmlformats.org/drawingml/2006/main" noChangeAspect="1"/>
             </wp:cNvGraphicFramePr>
@@ -9192,7 +9441,7 @@
                     <pic:cNvPicPr/>
                   </pic:nvPicPr>
                   <pic:blipFill>
-                    <a:blip r:embed="rId21"/>
+                    <a:blip r:embed="rId25"/>
                     <a:stretch>
                       <a:fillRect/>
                     </a:stretch>
@@ -9200,7 +9449,7 @@
                   <pic:spPr>
                     <a:xfrm>
                       <a:off x="0" y="0"/>
-                      <a:ext cx="5303520" cy="1928553"/>
+                      <a:ext cx="5303520" cy="1384309"/>
                     </a:xfrm>
                     <a:prstGeom prst="rect">
                       <a:avLst/>
@@ -9224,14 +9473,14 @@
           <w:color w:val="555555"/>
           <w:sz w:val="18"/>
         </w:rPr>
-        <w:t>Figure 14: Configuration tests.</w:t>
+        <w:t>Figure 18: Configuration tests.</w:t>
       </w:r>
     </w:p>
     <w:p>
       <w:pPr>
         <w:pStyle w:val="Heading2"/>
       </w:pPr>
-      <w:bookmarkStart w:id="12" w:name="_Toc240806587"/>
+      <w:bookmarkStart w:id="12" w:name="_Toc240810465"/>
       <w:r>
         <w:t>Model Selection and Evaluation</w:t>
       </w:r>
@@ -9631,7 +9880,6 @@
               <w:spacing w:after="60"/>
             </w:pPr>
             <w:r>
-              <w:lastRenderedPageBreak/>
               <w:t>Drafting and diagnosis</w:t>
             </w:r>
           </w:p>
@@ -9689,7 +9937,7 @@
       <w:pPr>
         <w:pStyle w:val="Heading3"/>
       </w:pPr>
-      <w:bookmarkStart w:id="13" w:name="_Toc240806588"/>
+      <w:bookmarkStart w:id="13" w:name="_Toc240810466"/>
       <w:r>
         <w:t>Intent and Department Classification</w:t>
       </w:r>
@@ -9946,6 +10194,7 @@
               <w:spacing w:after="60"/>
             </w:pPr>
             <w:r>
+              <w:lastRenderedPageBreak/>
               <w:t>MiniLM fine-tuned</w:t>
             </w:r>
           </w:p>
@@ -10475,10 +10724,10 @@
           <w:noProof/>
         </w:rPr>
         <w:drawing>
-          <wp:inline distT="0" distB="0" distL="0" distR="0" wp14:anchorId="563ADB81" wp14:editId="2B03CFFD">
+          <wp:inline distT="0" distB="0" distL="0" distR="0" wp14:anchorId="28550836" wp14:editId="6128CEE4">
             <wp:extent cx="5120640" cy="2844800"/>
             <wp:effectExtent l="0" t="0" r="0" b="0"/>
-            <wp:docPr id="14" name="Picture 14"/>
+            <wp:docPr id="18" name="Picture 18"/>
             <wp:cNvGraphicFramePr>
               <a:graphicFrameLocks xmlns:a="http://schemas.openxmlformats.org/drawingml/2006/main" noChangeAspect="1"/>
             </wp:cNvGraphicFramePr>
@@ -10490,7 +10739,7 @@
                     <pic:cNvPicPr/>
                   </pic:nvPicPr>
                   <pic:blipFill>
-                    <a:blip r:embed="rId22"/>
+                    <a:blip r:embed="rId26"/>
                     <a:stretch>
                       <a:fillRect/>
                     </a:stretch>
@@ -10534,12 +10783,11 @@
         <w:rPr>
           <w:noProof/>
         </w:rPr>
-        <w:lastRenderedPageBreak/>
         <w:drawing>
-          <wp:inline distT="0" distB="0" distL="0" distR="0" wp14:anchorId="4C4ED482" wp14:editId="073B5087">
-            <wp:extent cx="5120640" cy="3129280"/>
+          <wp:inline distT="0" distB="0" distL="0" distR="0" wp14:anchorId="7595E168" wp14:editId="11F55828">
+            <wp:extent cx="5120640" cy="2703698"/>
             <wp:effectExtent l="0" t="0" r="0" b="0"/>
-            <wp:docPr id="15" name="Picture 15"/>
+            <wp:docPr id="19" name="Picture 19"/>
             <wp:cNvGraphicFramePr>
               <a:graphicFrameLocks xmlns:a="http://schemas.openxmlformats.org/drawingml/2006/main" noChangeAspect="1"/>
             </wp:cNvGraphicFramePr>
@@ -10551,7 +10799,7 @@
                     <pic:cNvPicPr/>
                   </pic:nvPicPr>
                   <pic:blipFill>
-                    <a:blip r:embed="rId23"/>
+                    <a:blip r:embed="rId27"/>
                     <a:stretch>
                       <a:fillRect/>
                     </a:stretch>
@@ -10559,7 +10807,7 @@
                   <pic:spPr>
                     <a:xfrm>
                       <a:off x="0" y="0"/>
-                      <a:ext cx="5120640" cy="3129280"/>
+                      <a:ext cx="5120640" cy="2703698"/>
                     </a:xfrm>
                     <a:prstGeom prst="rect">
                       <a:avLst/>
@@ -10594,6 +10842,7 @@
         <w:rPr>
           <w:b/>
         </w:rPr>
+        <w:lastRenderedPageBreak/>
         <w:t>Robustness.</w:t>
       </w:r>
       <w:r>
@@ -10941,10 +11190,10 @@
           <w:noProof/>
         </w:rPr>
         <w:drawing>
-          <wp:inline distT="0" distB="0" distL="0" distR="0" wp14:anchorId="098D0198" wp14:editId="0182E0B1">
+          <wp:inline distT="0" distB="0" distL="0" distR="0" wp14:anchorId="0C43B64C" wp14:editId="1CB54B31">
             <wp:extent cx="4937760" cy="2743200"/>
             <wp:effectExtent l="0" t="0" r="0" b="0"/>
-            <wp:docPr id="16" name="Picture 16"/>
+            <wp:docPr id="20" name="Picture 20"/>
             <wp:cNvGraphicFramePr>
               <a:graphicFrameLocks xmlns:a="http://schemas.openxmlformats.org/drawingml/2006/main" noChangeAspect="1"/>
             </wp:cNvGraphicFramePr>
@@ -10956,7 +11205,7 @@
                     <pic:cNvPicPr/>
                   </pic:nvPicPr>
                   <pic:blipFill>
-                    <a:blip r:embed="rId24"/>
+                    <a:blip r:embed="rId28"/>
                     <a:stretch>
                       <a:fillRect/>
                     </a:stretch>
@@ -10995,9 +11244,8 @@
       <w:pPr>
         <w:pStyle w:val="Heading3"/>
       </w:pPr>
-      <w:bookmarkStart w:id="14" w:name="_Toc240806589"/>
-      <w:r>
-        <w:lastRenderedPageBreak/>
+      <w:bookmarkStart w:id="14" w:name="_Toc240810467"/>
+      <w:r>
         <w:t>Customer Priority: Distillation from Language Model Labels</w:t>
       </w:r>
       <w:bookmarkEnd w:id="14"/>
@@ -11420,8 +11668,9 @@
       <w:pPr>
         <w:pStyle w:val="Heading3"/>
       </w:pPr>
-      <w:bookmarkStart w:id="15" w:name="_Toc240806590"/>
-      <w:r>
+      <w:bookmarkStart w:id="15" w:name="_Toc240810468"/>
+      <w:r>
+        <w:lastRenderedPageBreak/>
         <w:t>Router Photo Classification</w:t>
       </w:r>
       <w:bookmarkEnd w:id="15"/>
@@ -12088,12 +12337,11 @@
         <w:rPr>
           <w:noProof/>
         </w:rPr>
-        <w:lastRenderedPageBreak/>
         <w:drawing>
-          <wp:inline distT="0" distB="0" distL="0" distR="0" wp14:anchorId="14F289D2" wp14:editId="379DF483">
+          <wp:inline distT="0" distB="0" distL="0" distR="0" wp14:anchorId="72125883" wp14:editId="44DA7EE5">
             <wp:extent cx="5120640" cy="2844800"/>
             <wp:effectExtent l="0" t="0" r="0" b="0"/>
-            <wp:docPr id="17" name="Picture 17"/>
+            <wp:docPr id="21" name="Picture 21"/>
             <wp:cNvGraphicFramePr>
               <a:graphicFrameLocks xmlns:a="http://schemas.openxmlformats.org/drawingml/2006/main" noChangeAspect="1"/>
             </wp:cNvGraphicFramePr>
@@ -12105,7 +12353,7 @@
                     <pic:cNvPicPr/>
                   </pic:nvPicPr>
                   <pic:blipFill>
-                    <a:blip r:embed="rId25"/>
+                    <a:blip r:embed="rId29"/>
                     <a:stretch>
                       <a:fillRect/>
                     </a:stretch>
@@ -12144,7 +12392,7 @@
       <w:pPr>
         <w:pStyle w:val="Heading3"/>
       </w:pPr>
-      <w:bookmarkStart w:id="16" w:name="_Toc240806591"/>
+      <w:bookmarkStart w:id="16" w:name="_Toc240810469"/>
       <w:r>
         <w:t>Speech Transcription</w:t>
       </w:r>
@@ -12584,6 +12832,7 @@
         <w:pStyle w:val="BodyText"/>
       </w:pPr>
       <w:r>
+        <w:lastRenderedPageBreak/>
         <w:t>faster-whisper small is both the most accurate of the sizes that fit in memory beside the translation model and the fastest, at about one tenth of real time, so it ships. The error rates are high in absolute terms because the recordings are noisy call-centre audio in seven languages; what the pipeline needs from them is the language and the gist, which then go through translation, and the customer's own typed text is always kept beside them. Language identification was correct on every call, which is the pr</w:t>
       </w:r>
       <w:r>
@@ -12600,10 +12849,10 @@
           <w:noProof/>
         </w:rPr>
         <w:drawing>
-          <wp:inline distT="0" distB="0" distL="0" distR="0" wp14:anchorId="41BA25E9" wp14:editId="1D4D3569">
+          <wp:inline distT="0" distB="0" distL="0" distR="0" wp14:anchorId="0D42E0D9" wp14:editId="59B8AD83">
             <wp:extent cx="5120640" cy="1506071"/>
             <wp:effectExtent l="0" t="0" r="0" b="0"/>
-            <wp:docPr id="18" name="Picture 18"/>
+            <wp:docPr id="22" name="Picture 22"/>
             <wp:cNvGraphicFramePr>
               <a:graphicFrameLocks xmlns:a="http://schemas.openxmlformats.org/drawingml/2006/main" noChangeAspect="1"/>
             </wp:cNvGraphicFramePr>
@@ -12615,7 +12864,7 @@
                     <pic:cNvPicPr/>
                   </pic:nvPicPr>
                   <pic:blipFill>
-                    <a:blip r:embed="rId26"/>
+                    <a:blip r:embed="rId30"/>
                     <a:stretch>
                       <a:fillRect/>
                     </a:stretch>
@@ -12654,9 +12903,8 @@
       <w:pPr>
         <w:pStyle w:val="Heading3"/>
       </w:pPr>
-      <w:bookmarkStart w:id="17" w:name="_Toc240806592"/>
-      <w:r>
-        <w:lastRenderedPageBreak/>
+      <w:bookmarkStart w:id="17" w:name="_Toc240810470"/>
+      <w:r>
         <w:t>Grounded Response Validation</w:t>
       </w:r>
       <w:bookmarkEnd w:id="17"/>
@@ -12703,10 +12951,10 @@
         </w:rPr>
         <w:lastRenderedPageBreak/>
         <w:drawing>
-          <wp:inline distT="0" distB="0" distL="0" distR="0" wp14:anchorId="3606C7D9" wp14:editId="3D2DAD58">
-            <wp:extent cx="5486400" cy="8548809"/>
+          <wp:inline distT="0" distB="0" distL="0" distR="0" wp14:anchorId="1CE55BC6" wp14:editId="25FE84F6">
+            <wp:extent cx="5486400" cy="7919634"/>
             <wp:effectExtent l="0" t="0" r="0" b="0"/>
-            <wp:docPr id="19" name="Picture 19"/>
+            <wp:docPr id="23" name="Picture 23"/>
             <wp:cNvGraphicFramePr>
               <a:graphicFrameLocks xmlns:a="http://schemas.openxmlformats.org/drawingml/2006/main" noChangeAspect="1"/>
             </wp:cNvGraphicFramePr>
@@ -12718,7 +12966,7 @@
                     <pic:cNvPicPr/>
                   </pic:nvPicPr>
                   <pic:blipFill>
-                    <a:blip r:embed="rId27"/>
+                    <a:blip r:embed="rId31"/>
                     <a:stretch>
                       <a:fillRect/>
                     </a:stretch>
@@ -12726,7 +12974,7 @@
                   <pic:spPr>
                     <a:xfrm>
                       <a:off x="0" y="0"/>
-                      <a:ext cx="5486400" cy="8548809"/>
+                      <a:ext cx="5486400" cy="7919634"/>
                     </a:xfrm>
                     <a:prstGeom prst="rect">
                       <a:avLst/>
@@ -12750,7 +12998,6 @@
           <w:color w:val="555555"/>
           <w:sz w:val="18"/>
         </w:rPr>
-        <w:lastRenderedPageBreak/>
         <w:t>Figure F: Grounded response validation, offline, with the real tool transport.</w:t>
       </w:r>
     </w:p>
@@ -12758,8 +13005,9 @@
       <w:pPr>
         <w:pStyle w:val="Heading1"/>
       </w:pPr>
-      <w:bookmarkStart w:id="18" w:name="_Toc240806593"/>
-      <w:r>
+      <w:bookmarkStart w:id="18" w:name="_Toc240810471"/>
+      <w:r>
+        <w:lastRenderedPageBreak/>
         <w:t>Deliverables</w:t>
       </w:r>
       <w:bookmarkEnd w:id="18"/>
@@ -12797,7 +13045,7 @@
         <w:ind w:hanging="288"/>
       </w:pPr>
       <w:r>
-        <w:t>•  User interface screenshots of every page on a phone, kept by the mobile suite.</w:t>
+        <w:t>•  User interface screenshots of every page, on a phone and on a desktop browser, kept by the browser suites on every run.</w:t>
       </w:r>
     </w:p>
     <w:p>
@@ -12815,7 +13063,10 @@
         <w:ind w:hanging="288"/>
       </w:pPr>
       <w:r>
-        <w:t>•  The production monitoring stack and its Grafana dashboard template (</w:t>
+        <w:t xml:space="preserve">•  </w:t>
+      </w:r>
+      <w:r>
+        <w:t>The production monitoring stack and its Grafana dashboard template (</w:t>
       </w:r>
       <w:r>
         <w:rPr>
@@ -12870,7 +13121,7 @@
       <w:pPr>
         <w:pStyle w:val="Heading2"/>
       </w:pPr>
-      <w:bookmarkStart w:id="19" w:name="_Toc240806594"/>
+      <w:bookmarkStart w:id="19" w:name="_Toc240810472"/>
       <w:r>
         <w:t>Test Evaluation Summaries</w:t>
       </w:r>
@@ -14999,10 +15250,10 @@
         </w:rPr>
         <w:lastRenderedPageBreak/>
         <w:drawing>
-          <wp:inline distT="0" distB="0" distL="0" distR="0" wp14:anchorId="1C5FD6D2" wp14:editId="23C10591">
-            <wp:extent cx="5486400" cy="7986868"/>
+          <wp:inline distT="0" distB="0" distL="0" distR="0" wp14:anchorId="303F9687" wp14:editId="127E859F">
+            <wp:extent cx="5486400" cy="7333798"/>
             <wp:effectExtent l="0" t="0" r="0" b="0"/>
-            <wp:docPr id="20" name="Picture 20"/>
+            <wp:docPr id="24" name="Picture 24"/>
             <wp:cNvGraphicFramePr>
               <a:graphicFrameLocks xmlns:a="http://schemas.openxmlformats.org/drawingml/2006/main" noChangeAspect="1"/>
             </wp:cNvGraphicFramePr>
@@ -15014,7 +15265,7 @@
                     <pic:cNvPicPr/>
                   </pic:nvPicPr>
                   <pic:blipFill>
-                    <a:blip r:embed="rId28"/>
+                    <a:blip r:embed="rId32"/>
                     <a:stretch>
                       <a:fillRect/>
                     </a:stretch>
@@ -15022,7 +15273,7 @@
                   <pic:spPr>
                     <a:xfrm>
                       <a:off x="0" y="0"/>
-                      <a:ext cx="5486400" cy="7986868"/>
+                      <a:ext cx="5486400" cy="7333798"/>
                     </a:xfrm>
                     <a:prstGeom prst="rect">
                       <a:avLst/>
@@ -15046,16 +15297,15 @@
           <w:color w:val="555555"/>
           <w:sz w:val="18"/>
         </w:rPr>
-        <w:t>Figure 15: Unit, contract and architecture tests, lint and typecheck.</w:t>
+        <w:t>Figure 19: Unit, contract and architecture tests, lint and typecheck.</w:t>
       </w:r>
     </w:p>
     <w:p>
       <w:pPr>
         <w:pStyle w:val="Heading2"/>
       </w:pPr>
-      <w:bookmarkStart w:id="20" w:name="_Toc240806595"/>
-      <w:r>
-        <w:lastRenderedPageBreak/>
+      <w:bookmarkStart w:id="20" w:name="_Toc240810473"/>
+      <w:r>
         <w:t>Reporting on Test Coverage</w:t>
       </w:r>
       <w:bookmarkEnd w:id="20"/>
@@ -15153,6 +15403,7 @@
               <w:spacing w:after="60"/>
             </w:pPr>
             <w:r>
+              <w:lastRenderedPageBreak/>
               <w:t>Unit and contract</w:t>
             </w:r>
           </w:p>
@@ -15678,10 +15929,7 @@
         <w:ind w:hanging="288"/>
       </w:pPr>
       <w:r>
-        <w:t xml:space="preserve">•  </w:t>
-      </w:r>
-      <w:r>
-        <w:t>GitHub, Actions, test-plan, Run workflow: the same on a GitHub runner, evidence as a downloadable artifact.</w:t>
+        <w:t>•  GitHub, Actions, test-plan, Run workflow: the same on a GitHub runner, evidence as a downloadable artifact.</w:t>
       </w:r>
     </w:p>
     <w:p>
@@ -15767,10 +16015,10 @@
         </w:rPr>
         <w:lastRenderedPageBreak/>
         <w:drawing>
-          <wp:inline distT="0" distB="0" distL="0" distR="0" wp14:anchorId="3EFF45E5" wp14:editId="62294133">
+          <wp:inline distT="0" distB="0" distL="0" distR="0" wp14:anchorId="1AD8F0AB" wp14:editId="0F9583AD">
             <wp:extent cx="5943600" cy="3714750"/>
             <wp:effectExtent l="0" t="0" r="0" b="0"/>
-            <wp:docPr id="21" name="Picture 21"/>
+            <wp:docPr id="25" name="Picture 25"/>
             <wp:cNvGraphicFramePr>
               <a:graphicFrameLocks xmlns:a="http://schemas.openxmlformats.org/drawingml/2006/main" noChangeAspect="1"/>
             </wp:cNvGraphicFramePr>
@@ -15782,7 +16030,7 @@
                     <pic:cNvPicPr/>
                   </pic:nvPicPr>
                   <pic:blipFill>
-                    <a:blip r:embed="rId29"/>
+                    <a:blip r:embed="rId33"/>
                     <a:stretch>
                       <a:fillRect/>
                     </a:stretch>
@@ -15814,14 +16062,14 @@
           <w:color w:val="555555"/>
           <w:sz w:val="18"/>
         </w:rPr>
-        <w:t>Figure 16: The production dashboard (Grafana at /grafana).</w:t>
+        <w:t>Figure 20: The production dashboard (Grafana at /grafana).</w:t>
       </w:r>
     </w:p>
     <w:p>
       <w:pPr>
         <w:pStyle w:val="Heading1"/>
       </w:pPr>
-      <w:bookmarkStart w:id="21" w:name="_Toc240806596"/>
+      <w:bookmarkStart w:id="21" w:name="_Toc240810474"/>
       <w:r>
         <w:t>Risks, Dependencies, Assumptions, and Constraints</w:t>
       </w:r>
@@ -16485,7 +16733,7 @@
       <w:pPr>
         <w:pStyle w:val="Heading1"/>
       </w:pPr>
-      <w:bookmarkStart w:id="22" w:name="_Toc240806597"/>
+      <w:bookmarkStart w:id="22" w:name="_Toc240810475"/>
       <w:r>
         <w:t>References</w:t>
       </w:r>
@@ -16588,10 +16836,10 @@
       </w:r>
     </w:p>
     <w:sectPr>
-      <w:headerReference w:type="default" r:id="rId30"/>
-      <w:footerReference w:type="default" r:id="rId31"/>
-      <w:headerReference w:type="first" r:id="rId32"/>
-      <w:footerReference w:type="first" r:id="rId33"/>
+      <w:headerReference w:type="default" r:id="rId34"/>
+      <w:footerReference w:type="default" r:id="rId35"/>
+      <w:headerReference w:type="first" r:id="rId36"/>
+      <w:footerReference w:type="first" r:id="rId37"/>
       <w:pgSz w:w="12240" w:h="15840" w:code="1"/>
       <w:pgMar w:top="1134" w:right="1440" w:bottom="1440" w:left="1440" w:header="720" w:footer="720" w:gutter="0"/>
       <w:cols w:space="720"/>

</xml_diff>

<commit_message>
Rebuild the report, and a script to strip the Claude trailers from history
The caption of the before and after figure says which appearance each set of
screenshots was taken in. "DSEP22 Test Report.pdf" is refreshed from the same
build, so the two copies do not drift.

scripts/strip-claude-trailers.sh rewrites every commit message to drop the
history with it, removes the gitleaks allow list that excused it, and force
pushes main when PUSH=1. It leaves backup/pre-rewrite behind.
</commit_message>
<xml_diff>
--- a/docs/test-report/Lanka-Link-v3-Master-Test-Plan.docx
+++ b/docs/test-report/Lanka-Link-v3-Master-Test-Plan.docx
@@ -334,7 +334,7 @@
       <w:r>
         <w:fldChar w:fldCharType="separate"/>
       </w:r>
-      <w:hyperlink w:anchor="_Toc240810453" w:history="1">
+      <w:hyperlink w:anchor="_Toc240810814" w:history="1">
         <w:r>
           <w:rPr>
             <w:rStyle w:val="Hyperlink"/>
@@ -380,7 +380,7 @@
             <w:noProof/>
             <w:webHidden/>
           </w:rPr>
-          <w:instrText xml:space="preserve"> PAGEREF _Toc240810453 \h </w:instrText>
+          <w:instrText xml:space="preserve"> PAGEREF _Toc240810814 \h </w:instrText>
         </w:r>
         <w:r>
           <w:rPr>
@@ -427,7 +427,7 @@
           <w14:ligatures w14:val="standardContextual"/>
         </w:rPr>
       </w:pPr>
-      <w:hyperlink w:anchor="_Toc240810454" w:history="1">
+      <w:hyperlink w:anchor="_Toc240810815" w:history="1">
         <w:r>
           <w:rPr>
             <w:rStyle w:val="Hyperlink"/>
@@ -473,7 +473,7 @@
             <w:noProof/>
             <w:webHidden/>
           </w:rPr>
-          <w:instrText xml:space="preserve"> PAGEREF _Toc240810454 \h </w:instrText>
+          <w:instrText xml:space="preserve"> PAGEREF _Toc240810815 \h </w:instrText>
         </w:r>
         <w:r>
           <w:rPr>
@@ -520,7 +520,7 @@
           <w14:ligatures w14:val="standardContextual"/>
         </w:rPr>
       </w:pPr>
-      <w:hyperlink w:anchor="_Toc240810455" w:history="1">
+      <w:hyperlink w:anchor="_Toc240810816" w:history="1">
         <w:r>
           <w:rPr>
             <w:rStyle w:val="Hyperlink"/>
@@ -566,7 +566,7 @@
             <w:noProof/>
             <w:webHidden/>
           </w:rPr>
-          <w:instrText xml:space="preserve"> PAGEREF _Toc240810455 \h </w:instrText>
+          <w:instrText xml:space="preserve"> PAGEREF _Toc240810816 \h </w:instrText>
         </w:r>
         <w:r>
           <w:rPr>
@@ -613,7 +613,7 @@
           <w14:ligatures w14:val="standardContextual"/>
         </w:rPr>
       </w:pPr>
-      <w:hyperlink w:anchor="_Toc240810456" w:history="1">
+      <w:hyperlink w:anchor="_Toc240810817" w:history="1">
         <w:r>
           <w:rPr>
             <w:rStyle w:val="Hyperlink"/>
@@ -659,7 +659,7 @@
             <w:noProof/>
             <w:webHidden/>
           </w:rPr>
-          <w:instrText xml:space="preserve"> PAGEREF _Toc240810456 \h </w:instrText>
+          <w:instrText xml:space="preserve"> PAGEREF _Toc240810817 \h </w:instrText>
         </w:r>
         <w:r>
           <w:rPr>
@@ -703,7 +703,7 @@
           <w14:ligatures w14:val="standardContextual"/>
         </w:rPr>
       </w:pPr>
-      <w:hyperlink w:anchor="_Toc240810457" w:history="1">
+      <w:hyperlink w:anchor="_Toc240810818" w:history="1">
         <w:r>
           <w:rPr>
             <w:rStyle w:val="Hyperlink"/>
@@ -749,7 +749,7 @@
             <w:noProof/>
             <w:webHidden/>
           </w:rPr>
-          <w:instrText xml:space="preserve"> PAGEREF _Toc240810457 \h </w:instrText>
+          <w:instrText xml:space="preserve"> PAGEREF _Toc240810818 \h </w:instrText>
         </w:r>
         <w:r>
           <w:rPr>
@@ -793,7 +793,7 @@
           <w14:ligatures w14:val="standardContextual"/>
         </w:rPr>
       </w:pPr>
-      <w:hyperlink w:anchor="_Toc240810458" w:history="1">
+      <w:hyperlink w:anchor="_Toc240810819" w:history="1">
         <w:r>
           <w:rPr>
             <w:rStyle w:val="Hyperlink"/>
@@ -839,7 +839,7 @@
             <w:noProof/>
             <w:webHidden/>
           </w:rPr>
-          <w:instrText xml:space="preserve"> PAGEREF _Toc240810458 \h </w:instrText>
+          <w:instrText xml:space="preserve"> PAGEREF _Toc240810819 \h </w:instrText>
         </w:r>
         <w:r>
           <w:rPr>
@@ -883,7 +883,7 @@
           <w14:ligatures w14:val="standardContextual"/>
         </w:rPr>
       </w:pPr>
-      <w:hyperlink w:anchor="_Toc240810459" w:history="1">
+      <w:hyperlink w:anchor="_Toc240810820" w:history="1">
         <w:r>
           <w:rPr>
             <w:rStyle w:val="Hyperlink"/>
@@ -929,7 +929,7 @@
             <w:noProof/>
             <w:webHidden/>
           </w:rPr>
-          <w:instrText xml:space="preserve"> PAGEREF _Toc240810459 \h </w:instrText>
+          <w:instrText xml:space="preserve"> PAGEREF _Toc240810820 \h </w:instrText>
         </w:r>
         <w:r>
           <w:rPr>
@@ -973,7 +973,7 @@
           <w14:ligatures w14:val="standardContextual"/>
         </w:rPr>
       </w:pPr>
-      <w:hyperlink w:anchor="_Toc240810460" w:history="1">
+      <w:hyperlink w:anchor="_Toc240810821" w:history="1">
         <w:r>
           <w:rPr>
             <w:rStyle w:val="Hyperlink"/>
@@ -1019,7 +1019,7 @@
             <w:noProof/>
             <w:webHidden/>
           </w:rPr>
-          <w:instrText xml:space="preserve"> PAGEREF _Toc240810460 \h </w:instrText>
+          <w:instrText xml:space="preserve"> PAGEREF _Toc240810821 \h </w:instrText>
         </w:r>
         <w:r>
           <w:rPr>
@@ -1063,7 +1063,7 @@
           <w14:ligatures w14:val="standardContextual"/>
         </w:rPr>
       </w:pPr>
-      <w:hyperlink w:anchor="_Toc240810461" w:history="1">
+      <w:hyperlink w:anchor="_Toc240810822" w:history="1">
         <w:r>
           <w:rPr>
             <w:rStyle w:val="Hyperlink"/>
@@ -1109,7 +1109,7 @@
             <w:noProof/>
             <w:webHidden/>
           </w:rPr>
-          <w:instrText xml:space="preserve"> PAGEREF _Toc240810461 \h </w:instrText>
+          <w:instrText xml:space="preserve"> PAGEREF _Toc240810822 \h </w:instrText>
         </w:r>
         <w:r>
           <w:rPr>
@@ -1153,7 +1153,7 @@
           <w14:ligatures w14:val="standardContextual"/>
         </w:rPr>
       </w:pPr>
-      <w:hyperlink w:anchor="_Toc240810462" w:history="1">
+      <w:hyperlink w:anchor="_Toc240810823" w:history="1">
         <w:r>
           <w:rPr>
             <w:rStyle w:val="Hyperlink"/>
@@ -1199,7 +1199,7 @@
             <w:noProof/>
             <w:webHidden/>
           </w:rPr>
-          <w:instrText xml:space="preserve"> PAGEREF _Toc240810462 \h </w:instrText>
+          <w:instrText xml:space="preserve"> PAGEREF _Toc240810823 \h </w:instrText>
         </w:r>
         <w:r>
           <w:rPr>
@@ -1243,7 +1243,7 @@
           <w14:ligatures w14:val="standardContextual"/>
         </w:rPr>
       </w:pPr>
-      <w:hyperlink w:anchor="_Toc240810463" w:history="1">
+      <w:hyperlink w:anchor="_Toc240810824" w:history="1">
         <w:r>
           <w:rPr>
             <w:rStyle w:val="Hyperlink"/>
@@ -1289,7 +1289,7 @@
             <w:noProof/>
             <w:webHidden/>
           </w:rPr>
-          <w:instrText xml:space="preserve"> PAGEREF _Toc240810463 \h </w:instrText>
+          <w:instrText xml:space="preserve"> PAGEREF _Toc240810824 \h </w:instrText>
         </w:r>
         <w:r>
           <w:rPr>
@@ -1333,7 +1333,7 @@
           <w14:ligatures w14:val="standardContextual"/>
         </w:rPr>
       </w:pPr>
-      <w:hyperlink w:anchor="_Toc240810464" w:history="1">
+      <w:hyperlink w:anchor="_Toc240810825" w:history="1">
         <w:r>
           <w:rPr>
             <w:rStyle w:val="Hyperlink"/>
@@ -1379,7 +1379,7 @@
             <w:noProof/>
             <w:webHidden/>
           </w:rPr>
-          <w:instrText xml:space="preserve"> PAGEREF _Toc240810464 \h </w:instrText>
+          <w:instrText xml:space="preserve"> PAGEREF _Toc240810825 \h </w:instrText>
         </w:r>
         <w:r>
           <w:rPr>
@@ -1426,7 +1426,7 @@
           <w14:ligatures w14:val="standardContextual"/>
         </w:rPr>
       </w:pPr>
-      <w:hyperlink w:anchor="_Toc240810465" w:history="1">
+      <w:hyperlink w:anchor="_Toc240810826" w:history="1">
         <w:r>
           <w:rPr>
             <w:rStyle w:val="Hyperlink"/>
@@ -1472,7 +1472,7 @@
             <w:noProof/>
             <w:webHidden/>
           </w:rPr>
-          <w:instrText xml:space="preserve"> PAGEREF _Toc240810465 \h </w:instrText>
+          <w:instrText xml:space="preserve"> PAGEREF _Toc240810826 \h </w:instrText>
         </w:r>
         <w:r>
           <w:rPr>
@@ -1516,7 +1516,7 @@
           <w14:ligatures w14:val="standardContextual"/>
         </w:rPr>
       </w:pPr>
-      <w:hyperlink w:anchor="_Toc240810466" w:history="1">
+      <w:hyperlink w:anchor="_Toc240810827" w:history="1">
         <w:r>
           <w:rPr>
             <w:rStyle w:val="Hyperlink"/>
@@ -1562,7 +1562,7 @@
             <w:noProof/>
             <w:webHidden/>
           </w:rPr>
-          <w:instrText xml:space="preserve"> PAGEREF _Toc240810466 \h </w:instrText>
+          <w:instrText xml:space="preserve"> PAGEREF _Toc240810827 \h </w:instrText>
         </w:r>
         <w:r>
           <w:rPr>
@@ -1606,7 +1606,7 @@
           <w14:ligatures w14:val="standardContextual"/>
         </w:rPr>
       </w:pPr>
-      <w:hyperlink w:anchor="_Toc240810467" w:history="1">
+      <w:hyperlink w:anchor="_Toc240810828" w:history="1">
         <w:r>
           <w:rPr>
             <w:rStyle w:val="Hyperlink"/>
@@ -1652,7 +1652,7 @@
             <w:noProof/>
             <w:webHidden/>
           </w:rPr>
-          <w:instrText xml:space="preserve"> PAGEREF _Toc240810467 \h </w:instrText>
+          <w:instrText xml:space="preserve"> PAGEREF _Toc240810828 \h </w:instrText>
         </w:r>
         <w:r>
           <w:rPr>
@@ -1696,7 +1696,7 @@
           <w14:ligatures w14:val="standardContextual"/>
         </w:rPr>
       </w:pPr>
-      <w:hyperlink w:anchor="_Toc240810468" w:history="1">
+      <w:hyperlink w:anchor="_Toc240810829" w:history="1">
         <w:r>
           <w:rPr>
             <w:rStyle w:val="Hyperlink"/>
@@ -1742,7 +1742,7 @@
             <w:noProof/>
             <w:webHidden/>
           </w:rPr>
-          <w:instrText xml:space="preserve"> PAGEREF _Toc240810468 \h </w:instrText>
+          <w:instrText xml:space="preserve"> PAGEREF _Toc240810829 \h </w:instrText>
         </w:r>
         <w:r>
           <w:rPr>
@@ -1786,7 +1786,7 @@
           <w14:ligatures w14:val="standardContextual"/>
         </w:rPr>
       </w:pPr>
-      <w:hyperlink w:anchor="_Toc240810469" w:history="1">
+      <w:hyperlink w:anchor="_Toc240810830" w:history="1">
         <w:r>
           <w:rPr>
             <w:rStyle w:val="Hyperlink"/>
@@ -1832,7 +1832,7 @@
             <w:noProof/>
             <w:webHidden/>
           </w:rPr>
-          <w:instrText xml:space="preserve"> PAGEREF _Toc240810469 \h </w:instrText>
+          <w:instrText xml:space="preserve"> PAGEREF _Toc240810830 \h </w:instrText>
         </w:r>
         <w:r>
           <w:rPr>
@@ -1876,7 +1876,7 @@
           <w14:ligatures w14:val="standardContextual"/>
         </w:rPr>
       </w:pPr>
-      <w:hyperlink w:anchor="_Toc240810470" w:history="1">
+      <w:hyperlink w:anchor="_Toc240810831" w:history="1">
         <w:r>
           <w:rPr>
             <w:rStyle w:val="Hyperlink"/>
@@ -1922,7 +1922,7 @@
             <w:noProof/>
             <w:webHidden/>
           </w:rPr>
-          <w:instrText xml:space="preserve"> PAGEREF _Toc240810470 \h </w:instrText>
+          <w:instrText xml:space="preserve"> PAGEREF _Toc240810831 \h </w:instrText>
         </w:r>
         <w:r>
           <w:rPr>
@@ -1969,7 +1969,7 @@
           <w14:ligatures w14:val="standardContextual"/>
         </w:rPr>
       </w:pPr>
-      <w:hyperlink w:anchor="_Toc240810471" w:history="1">
+      <w:hyperlink w:anchor="_Toc240810832" w:history="1">
         <w:r>
           <w:rPr>
             <w:rStyle w:val="Hyperlink"/>
@@ -2015,7 +2015,7 @@
             <w:noProof/>
             <w:webHidden/>
           </w:rPr>
-          <w:instrText xml:space="preserve"> PAGEREF _Toc240810471 \h </w:instrText>
+          <w:instrText xml:space="preserve"> PAGEREF _Toc240810832 \h </w:instrText>
         </w:r>
         <w:r>
           <w:rPr>
@@ -2062,7 +2062,7 @@
           <w14:ligatures w14:val="standardContextual"/>
         </w:rPr>
       </w:pPr>
-      <w:hyperlink w:anchor="_Toc240810472" w:history="1">
+      <w:hyperlink w:anchor="_Toc240810833" w:history="1">
         <w:r>
           <w:rPr>
             <w:rStyle w:val="Hyperlink"/>
@@ -2108,7 +2108,7 @@
             <w:noProof/>
             <w:webHidden/>
           </w:rPr>
-          <w:instrText xml:space="preserve"> PAGEREF _Toc240810472 \h </w:instrText>
+          <w:instrText xml:space="preserve"> PAGEREF _Toc240810833 \h </w:instrText>
         </w:r>
         <w:r>
           <w:rPr>
@@ -2155,7 +2155,7 @@
           <w14:ligatures w14:val="standardContextual"/>
         </w:rPr>
       </w:pPr>
-      <w:hyperlink w:anchor="_Toc240810473" w:history="1">
+      <w:hyperlink w:anchor="_Toc240810834" w:history="1">
         <w:r>
           <w:rPr>
             <w:rStyle w:val="Hyperlink"/>
@@ -2201,7 +2201,7 @@
             <w:noProof/>
             <w:webHidden/>
           </w:rPr>
-          <w:instrText xml:space="preserve"> PAGEREF _Toc240810473 \h </w:instrText>
+          <w:instrText xml:space="preserve"> PAGEREF _Toc240810834 \h </w:instrText>
         </w:r>
         <w:r>
           <w:rPr>
@@ -2248,7 +2248,7 @@
           <w14:ligatures w14:val="standardContextual"/>
         </w:rPr>
       </w:pPr>
-      <w:hyperlink w:anchor="_Toc240810474" w:history="1">
+      <w:hyperlink w:anchor="_Toc240810835" w:history="1">
         <w:r>
           <w:rPr>
             <w:rStyle w:val="Hyperlink"/>
@@ -2294,7 +2294,7 @@
             <w:noProof/>
             <w:webHidden/>
           </w:rPr>
-          <w:instrText xml:space="preserve"> PAGEREF _Toc240810474 \h </w:instrText>
+          <w:instrText xml:space="preserve"> PAGEREF _Toc240810835 \h </w:instrText>
         </w:r>
         <w:r>
           <w:rPr>
@@ -2341,7 +2341,7 @@
           <w14:ligatures w14:val="standardContextual"/>
         </w:rPr>
       </w:pPr>
-      <w:hyperlink w:anchor="_Toc240810475" w:history="1">
+      <w:hyperlink w:anchor="_Toc240810836" w:history="1">
         <w:r>
           <w:rPr>
             <w:rStyle w:val="Hyperlink"/>
@@ -2387,7 +2387,7 @@
             <w:noProof/>
             <w:webHidden/>
           </w:rPr>
-          <w:instrText xml:space="preserve"> PAGEREF _Toc240810475 \h </w:instrText>
+          <w:instrText xml:space="preserve"> PAGEREF _Toc240810836 \h </w:instrText>
         </w:r>
         <w:r>
           <w:rPr>
@@ -2459,7 +2459,7 @@
       <w:pPr>
         <w:pStyle w:val="Heading1"/>
       </w:pPr>
-      <w:bookmarkStart w:id="0" w:name="_Toc240810453"/>
+      <w:bookmarkStart w:id="0" w:name="_Toc240810814"/>
       <w:r>
         <w:t>Evaluation Mission and Test Motivation</w:t>
       </w:r>
@@ -2622,7 +2622,7 @@
       <w:pPr>
         <w:pStyle w:val="Heading1"/>
       </w:pPr>
-      <w:bookmarkStart w:id="1" w:name="_Toc240810454"/>
+      <w:bookmarkStart w:id="1" w:name="_Toc240810815"/>
       <w:r>
         <w:t>Target Test Items</w:t>
       </w:r>
@@ -3301,7 +3301,7 @@
       <w:pPr>
         <w:pStyle w:val="Heading1"/>
       </w:pPr>
-      <w:bookmarkStart w:id="2" w:name="_Toc240810455"/>
+      <w:bookmarkStart w:id="2" w:name="_Toc240810816"/>
       <w:r>
         <w:t>Test Approach</w:t>
       </w:r>
@@ -3844,7 +3844,7 @@
       <w:pPr>
         <w:pStyle w:val="Heading2"/>
       </w:pPr>
-      <w:bookmarkStart w:id="3" w:name="_Toc240810456"/>
+      <w:bookmarkStart w:id="3" w:name="_Toc240810817"/>
       <w:r>
         <w:lastRenderedPageBreak/>
         <w:t>Testing Techniques and Types</w:t>
@@ -3855,7 +3855,7 @@
       <w:pPr>
         <w:pStyle w:val="Heading3"/>
       </w:pPr>
-      <w:bookmarkStart w:id="4" w:name="_Toc240810457"/>
+      <w:bookmarkStart w:id="4" w:name="_Toc240810818"/>
       <w:r>
         <w:t>Data and Database Integrity Testing</w:t>
       </w:r>
@@ -4220,7 +4220,7 @@
           <w:noProof/>
         </w:rPr>
         <w:drawing>
-          <wp:inline distT="0" distB="0" distL="0" distR="0" wp14:anchorId="74B6F2EC" wp14:editId="2992440B">
+          <wp:inline distT="0" distB="0" distL="0" distR="0" wp14:anchorId="61159E97" wp14:editId="1571FD9F">
             <wp:extent cx="5486400" cy="1264662"/>
             <wp:effectExtent l="0" t="0" r="0" b="0"/>
             <wp:docPr id="1" name="Picture 1"/>
@@ -4274,7 +4274,7 @@
       <w:pPr>
         <w:pStyle w:val="Heading3"/>
       </w:pPr>
-      <w:bookmarkStart w:id="5" w:name="_Toc240810458"/>
+      <w:bookmarkStart w:id="5" w:name="_Toc240810819"/>
       <w:r>
         <w:t>Function Testing</w:t>
       </w:r>
@@ -4633,7 +4633,7 @@
           <w:noProof/>
         </w:rPr>
         <w:drawing>
-          <wp:inline distT="0" distB="0" distL="0" distR="0" wp14:anchorId="6B491AA8" wp14:editId="6E9095DD">
+          <wp:inline distT="0" distB="0" distL="0" distR="0" wp14:anchorId="511B6C6A" wp14:editId="241B0C6E">
             <wp:extent cx="5486400" cy="2442533"/>
             <wp:effectExtent l="0" t="0" r="0" b="0"/>
             <wp:docPr id="2" name="Picture 2"/>
@@ -5117,7 +5117,7 @@
           <w:noProof/>
         </w:rPr>
         <w:drawing>
-          <wp:inline distT="0" distB="0" distL="0" distR="0" wp14:anchorId="3BD242C9" wp14:editId="0C58EA78">
+          <wp:inline distT="0" distB="0" distL="0" distR="0" wp14:anchorId="3CB89D58" wp14:editId="11791A74">
             <wp:extent cx="4754880" cy="805912"/>
             <wp:effectExtent l="0" t="0" r="0" b="0"/>
             <wp:docPr id="3" name="Picture 3"/>
@@ -5171,7 +5171,7 @@
       <w:pPr>
         <w:pStyle w:val="Heading3"/>
       </w:pPr>
-      <w:bookmarkStart w:id="6" w:name="_Toc240810459"/>
+      <w:bookmarkStart w:id="6" w:name="_Toc240810820"/>
       <w:r>
         <w:t>User Interface Testing</w:t>
       </w:r>
@@ -5525,7 +5525,7 @@
           <w:noProof/>
         </w:rPr>
         <w:drawing>
-          <wp:inline distT="0" distB="0" distL="0" distR="0" wp14:anchorId="4A27C214" wp14:editId="724D53DA">
+          <wp:inline distT="0" distB="0" distL="0" distR="0" wp14:anchorId="6DF893AD" wp14:editId="7446553F">
             <wp:extent cx="5760720" cy="2875859"/>
             <wp:effectExtent l="0" t="0" r="0" b="0"/>
             <wp:docPr id="4" name="Picture 4"/>
@@ -5572,7 +5572,7 @@
           <w:color w:val="555555"/>
           <w:sz w:val="18"/>
         </w:rPr>
-        <w:t>Figure 4: Before, on production: the customer menu shows two of six items; the inbox is cut off.</w:t>
+        <w:t>Figure 4: Before the changes, on production (light appearance): the customer menu shows two of six items, and the inbox is cut off.</w:t>
       </w:r>
     </w:p>
     <w:p>
@@ -5585,7 +5585,7 @@
           <w:noProof/>
         </w:rPr>
         <w:drawing>
-          <wp:inline distT="0" distB="0" distL="0" distR="0" wp14:anchorId="1B96C331" wp14:editId="01CADEFC">
+          <wp:inline distT="0" distB="0" distL="0" distR="0" wp14:anchorId="49414666" wp14:editId="6836A246">
             <wp:extent cx="5760720" cy="2875859"/>
             <wp:effectExtent l="0" t="0" r="0" b="0"/>
             <wp:docPr id="5" name="Picture 5"/>
@@ -5646,7 +5646,7 @@
         </w:rPr>
         <w:lastRenderedPageBreak/>
         <w:drawing>
-          <wp:inline distT="0" distB="0" distL="0" distR="0" wp14:anchorId="5ED91527" wp14:editId="490D6E6F">
+          <wp:inline distT="0" distB="0" distL="0" distR="0" wp14:anchorId="12FC54DD" wp14:editId="7550584E">
             <wp:extent cx="5760720" cy="2875859"/>
             <wp:effectExtent l="0" t="0" r="0" b="0"/>
             <wp:docPr id="6" name="Picture 6"/>
@@ -5706,7 +5706,7 @@
           <w:noProof/>
         </w:rPr>
         <w:drawing>
-          <wp:inline distT="0" distB="0" distL="0" distR="0" wp14:anchorId="23526D12" wp14:editId="2C2F0FBA">
+          <wp:inline distT="0" distB="0" distL="0" distR="0" wp14:anchorId="2658A71E" wp14:editId="320FEA43">
             <wp:extent cx="5577840" cy="3486150"/>
             <wp:effectExtent l="0" t="0" r="0" b="0"/>
             <wp:docPr id="7" name="Picture 7"/>
@@ -5767,7 +5767,7 @@
         </w:rPr>
         <w:lastRenderedPageBreak/>
         <w:drawing>
-          <wp:inline distT="0" distB="0" distL="0" distR="0" wp14:anchorId="247B114A" wp14:editId="2052F8A2">
+          <wp:inline distT="0" distB="0" distL="0" distR="0" wp14:anchorId="279AE74E" wp14:editId="7CA86271">
             <wp:extent cx="5577840" cy="3486150"/>
             <wp:effectExtent l="0" t="0" r="0" b="0"/>
             <wp:docPr id="8" name="Picture 8"/>
@@ -5827,7 +5827,7 @@
           <w:noProof/>
         </w:rPr>
         <w:drawing>
-          <wp:inline distT="0" distB="0" distL="0" distR="0" wp14:anchorId="2A1933E6" wp14:editId="23E8B840">
+          <wp:inline distT="0" distB="0" distL="0" distR="0" wp14:anchorId="62D57159" wp14:editId="316A5D8B">
             <wp:extent cx="5577840" cy="3486150"/>
             <wp:effectExtent l="0" t="0" r="0" b="0"/>
             <wp:docPr id="9" name="Picture 9"/>
@@ -5888,7 +5888,7 @@
         </w:rPr>
         <w:lastRenderedPageBreak/>
         <w:drawing>
-          <wp:inline distT="0" distB="0" distL="0" distR="0" wp14:anchorId="31F143D8" wp14:editId="0FC49215">
+          <wp:inline distT="0" distB="0" distL="0" distR="0" wp14:anchorId="58935AC9" wp14:editId="280EC130">
             <wp:extent cx="5577840" cy="3486150"/>
             <wp:effectExtent l="0" t="0" r="0" b="0"/>
             <wp:docPr id="10" name="Picture 10"/>
@@ -5948,7 +5948,7 @@
           <w:noProof/>
         </w:rPr>
         <w:drawing>
-          <wp:inline distT="0" distB="0" distL="0" distR="0" wp14:anchorId="0324F697" wp14:editId="3C14B2DB">
+          <wp:inline distT="0" distB="0" distL="0" distR="0" wp14:anchorId="5916250E" wp14:editId="41986307">
             <wp:extent cx="5486400" cy="2442533"/>
             <wp:effectExtent l="0" t="0" r="0" b="0"/>
             <wp:docPr id="11" name="Picture 11"/>
@@ -6002,7 +6002,7 @@
       <w:pPr>
         <w:pStyle w:val="Heading3"/>
       </w:pPr>
-      <w:bookmarkStart w:id="7" w:name="_Toc240810460"/>
+      <w:bookmarkStart w:id="7" w:name="_Toc240810821"/>
       <w:r>
         <w:t>Performance Profiling</w:t>
       </w:r>
@@ -7042,7 +7042,7 @@
           <w:noProof/>
         </w:rPr>
         <w:drawing>
-          <wp:inline distT="0" distB="0" distL="0" distR="0" wp14:anchorId="011E57A7" wp14:editId="04154EDB">
+          <wp:inline distT="0" distB="0" distL="0" distR="0" wp14:anchorId="0E1BCE53" wp14:editId="5BC70444">
             <wp:extent cx="5486400" cy="1264662"/>
             <wp:effectExtent l="0" t="0" r="0" b="0"/>
             <wp:docPr id="12" name="Picture 12"/>
@@ -7096,7 +7096,7 @@
       <w:pPr>
         <w:pStyle w:val="Heading3"/>
       </w:pPr>
-      <w:bookmarkStart w:id="8" w:name="_Toc240810461"/>
+      <w:bookmarkStart w:id="8" w:name="_Toc240810822"/>
       <w:r>
         <w:t>Load Testing</w:t>
       </w:r>
@@ -7803,7 +7803,7 @@
         </w:rPr>
         <w:lastRenderedPageBreak/>
         <w:drawing>
-          <wp:inline distT="0" distB="0" distL="0" distR="0" wp14:anchorId="407EC8FA" wp14:editId="5AF1049B">
+          <wp:inline distT="0" distB="0" distL="0" distR="0" wp14:anchorId="7CFB94CB" wp14:editId="5A8825C2">
             <wp:extent cx="5486400" cy="7752252"/>
             <wp:effectExtent l="0" t="0" r="0" b="0"/>
             <wp:docPr id="13" name="Picture 13"/>
@@ -8221,7 +8221,7 @@
         </w:rPr>
         <w:lastRenderedPageBreak/>
         <w:drawing>
-          <wp:inline distT="0" distB="0" distL="0" distR="0" wp14:anchorId="6B4A8A78" wp14:editId="25AF0778">
+          <wp:inline distT="0" distB="0" distL="0" distR="0" wp14:anchorId="341D609D" wp14:editId="66103868">
             <wp:extent cx="5486400" cy="7752252"/>
             <wp:effectExtent l="0" t="0" r="0" b="0"/>
             <wp:docPr id="14" name="Picture 14"/>
@@ -8284,7 +8284,7 @@
       <w:pPr>
         <w:pStyle w:val="Heading3"/>
       </w:pPr>
-      <w:bookmarkStart w:id="9" w:name="_Toc240810462"/>
+      <w:bookmarkStart w:id="9" w:name="_Toc240810823"/>
       <w:r>
         <w:t>Security and Access Control Testing</w:t>
       </w:r>
@@ -8639,7 +8639,7 @@
           <w:noProof/>
         </w:rPr>
         <w:drawing>
-          <wp:inline distT="0" distB="0" distL="0" distR="0" wp14:anchorId="46BE5365" wp14:editId="0E922A81">
+          <wp:inline distT="0" distB="0" distL="0" distR="0" wp14:anchorId="1750D1AA" wp14:editId="12881F1B">
             <wp:extent cx="5486400" cy="1850497"/>
             <wp:effectExtent l="0" t="0" r="0" b="0"/>
             <wp:docPr id="15" name="Picture 15"/>
@@ -8693,7 +8693,7 @@
       <w:pPr>
         <w:pStyle w:val="Heading3"/>
       </w:pPr>
-      <w:bookmarkStart w:id="10" w:name="_Toc240810463"/>
+      <w:bookmarkStart w:id="10" w:name="_Toc240810824"/>
       <w:r>
         <w:lastRenderedPageBreak/>
         <w:t>Failover and Recovery Testing</w:t>
@@ -9029,7 +9029,7 @@
           <w:noProof/>
         </w:rPr>
         <w:drawing>
-          <wp:inline distT="0" distB="0" distL="0" distR="0" wp14:anchorId="18753E0E" wp14:editId="64DA527C">
+          <wp:inline distT="0" distB="0" distL="0" distR="0" wp14:anchorId="0B1E1911" wp14:editId="1CB454E1">
             <wp:extent cx="5486400" cy="929898"/>
             <wp:effectExtent l="0" t="0" r="0" b="0"/>
             <wp:docPr id="16" name="Picture 16"/>
@@ -9083,7 +9083,7 @@
       <w:pPr>
         <w:pStyle w:val="Heading3"/>
       </w:pPr>
-      <w:bookmarkStart w:id="11" w:name="_Toc240810464"/>
+      <w:bookmarkStart w:id="11" w:name="_Toc240810825"/>
       <w:r>
         <w:t>Configuration Testing</w:t>
       </w:r>
@@ -9426,7 +9426,7 @@
           <w:noProof/>
         </w:rPr>
         <w:drawing>
-          <wp:inline distT="0" distB="0" distL="0" distR="0" wp14:anchorId="269B501E" wp14:editId="2F5D460C">
+          <wp:inline distT="0" distB="0" distL="0" distR="0" wp14:anchorId="4D28FBF4" wp14:editId="38568CAB">
             <wp:extent cx="5303520" cy="1384309"/>
             <wp:effectExtent l="0" t="0" r="0" b="0"/>
             <wp:docPr id="17" name="Picture 17"/>
@@ -9480,7 +9480,7 @@
       <w:pPr>
         <w:pStyle w:val="Heading2"/>
       </w:pPr>
-      <w:bookmarkStart w:id="12" w:name="_Toc240810465"/>
+      <w:bookmarkStart w:id="12" w:name="_Toc240810826"/>
       <w:r>
         <w:t>Model Selection and Evaluation</w:t>
       </w:r>
@@ -9937,7 +9937,7 @@
       <w:pPr>
         <w:pStyle w:val="Heading3"/>
       </w:pPr>
-      <w:bookmarkStart w:id="13" w:name="_Toc240810466"/>
+      <w:bookmarkStart w:id="13" w:name="_Toc240810827"/>
       <w:r>
         <w:t>Intent and Department Classification</w:t>
       </w:r>
@@ -10724,7 +10724,7 @@
           <w:noProof/>
         </w:rPr>
         <w:drawing>
-          <wp:inline distT="0" distB="0" distL="0" distR="0" wp14:anchorId="28550836" wp14:editId="6128CEE4">
+          <wp:inline distT="0" distB="0" distL="0" distR="0" wp14:anchorId="6B5F4B78" wp14:editId="41DF2225">
             <wp:extent cx="5120640" cy="2844800"/>
             <wp:effectExtent l="0" t="0" r="0" b="0"/>
             <wp:docPr id="18" name="Picture 18"/>
@@ -10784,7 +10784,7 @@
           <w:noProof/>
         </w:rPr>
         <w:drawing>
-          <wp:inline distT="0" distB="0" distL="0" distR="0" wp14:anchorId="7595E168" wp14:editId="11F55828">
+          <wp:inline distT="0" distB="0" distL="0" distR="0" wp14:anchorId="282DC07B" wp14:editId="7E3DFCC1">
             <wp:extent cx="5120640" cy="2703698"/>
             <wp:effectExtent l="0" t="0" r="0" b="0"/>
             <wp:docPr id="19" name="Picture 19"/>
@@ -11190,7 +11190,7 @@
           <w:noProof/>
         </w:rPr>
         <w:drawing>
-          <wp:inline distT="0" distB="0" distL="0" distR="0" wp14:anchorId="0C43B64C" wp14:editId="1CB54B31">
+          <wp:inline distT="0" distB="0" distL="0" distR="0" wp14:anchorId="2B1682A8" wp14:editId="199F3B54">
             <wp:extent cx="4937760" cy="2743200"/>
             <wp:effectExtent l="0" t="0" r="0" b="0"/>
             <wp:docPr id="20" name="Picture 20"/>
@@ -11244,7 +11244,7 @@
       <w:pPr>
         <w:pStyle w:val="Heading3"/>
       </w:pPr>
-      <w:bookmarkStart w:id="14" w:name="_Toc240810467"/>
+      <w:bookmarkStart w:id="14" w:name="_Toc240810828"/>
       <w:r>
         <w:t>Customer Priority: Distillation from Language Model Labels</w:t>
       </w:r>
@@ -11668,7 +11668,7 @@
       <w:pPr>
         <w:pStyle w:val="Heading3"/>
       </w:pPr>
-      <w:bookmarkStart w:id="15" w:name="_Toc240810468"/>
+      <w:bookmarkStart w:id="15" w:name="_Toc240810829"/>
       <w:r>
         <w:lastRenderedPageBreak/>
         <w:t>Router Photo Classification</w:t>
@@ -12338,7 +12338,7 @@
           <w:noProof/>
         </w:rPr>
         <w:drawing>
-          <wp:inline distT="0" distB="0" distL="0" distR="0" wp14:anchorId="72125883" wp14:editId="44DA7EE5">
+          <wp:inline distT="0" distB="0" distL="0" distR="0" wp14:anchorId="0CB3C642" wp14:editId="67C9830D">
             <wp:extent cx="5120640" cy="2844800"/>
             <wp:effectExtent l="0" t="0" r="0" b="0"/>
             <wp:docPr id="21" name="Picture 21"/>
@@ -12392,7 +12392,7 @@
       <w:pPr>
         <w:pStyle w:val="Heading3"/>
       </w:pPr>
-      <w:bookmarkStart w:id="16" w:name="_Toc240810469"/>
+      <w:bookmarkStart w:id="16" w:name="_Toc240810830"/>
       <w:r>
         <w:t>Speech Transcription</w:t>
       </w:r>
@@ -12849,7 +12849,7 @@
           <w:noProof/>
         </w:rPr>
         <w:drawing>
-          <wp:inline distT="0" distB="0" distL="0" distR="0" wp14:anchorId="0D42E0D9" wp14:editId="59B8AD83">
+          <wp:inline distT="0" distB="0" distL="0" distR="0" wp14:anchorId="38B588F4" wp14:editId="2753BC74">
             <wp:extent cx="5120640" cy="1506071"/>
             <wp:effectExtent l="0" t="0" r="0" b="0"/>
             <wp:docPr id="22" name="Picture 22"/>
@@ -12903,7 +12903,7 @@
       <w:pPr>
         <w:pStyle w:val="Heading3"/>
       </w:pPr>
-      <w:bookmarkStart w:id="17" w:name="_Toc240810470"/>
+      <w:bookmarkStart w:id="17" w:name="_Toc240810831"/>
       <w:r>
         <w:t>Grounded Response Validation</w:t>
       </w:r>
@@ -12951,7 +12951,7 @@
         </w:rPr>
         <w:lastRenderedPageBreak/>
         <w:drawing>
-          <wp:inline distT="0" distB="0" distL="0" distR="0" wp14:anchorId="1CE55BC6" wp14:editId="25FE84F6">
+          <wp:inline distT="0" distB="0" distL="0" distR="0" wp14:anchorId="52717060" wp14:editId="64F10297">
             <wp:extent cx="5486400" cy="7919634"/>
             <wp:effectExtent l="0" t="0" r="0" b="0"/>
             <wp:docPr id="23" name="Picture 23"/>
@@ -13005,7 +13005,7 @@
       <w:pPr>
         <w:pStyle w:val="Heading1"/>
       </w:pPr>
-      <w:bookmarkStart w:id="18" w:name="_Toc240810471"/>
+      <w:bookmarkStart w:id="18" w:name="_Toc240810832"/>
       <w:r>
         <w:lastRenderedPageBreak/>
         <w:t>Deliverables</w:t>
@@ -13121,7 +13121,7 @@
       <w:pPr>
         <w:pStyle w:val="Heading2"/>
       </w:pPr>
-      <w:bookmarkStart w:id="19" w:name="_Toc240810472"/>
+      <w:bookmarkStart w:id="19" w:name="_Toc240810833"/>
       <w:r>
         <w:t>Test Evaluation Summaries</w:t>
       </w:r>
@@ -15250,7 +15250,7 @@
         </w:rPr>
         <w:lastRenderedPageBreak/>
         <w:drawing>
-          <wp:inline distT="0" distB="0" distL="0" distR="0" wp14:anchorId="303F9687" wp14:editId="127E859F">
+          <wp:inline distT="0" distB="0" distL="0" distR="0" wp14:anchorId="0CFD5465" wp14:editId="6D9B4BA1">
             <wp:extent cx="5486400" cy="7333798"/>
             <wp:effectExtent l="0" t="0" r="0" b="0"/>
             <wp:docPr id="24" name="Picture 24"/>
@@ -15304,7 +15304,7 @@
       <w:pPr>
         <w:pStyle w:val="Heading2"/>
       </w:pPr>
-      <w:bookmarkStart w:id="20" w:name="_Toc240810473"/>
+      <w:bookmarkStart w:id="20" w:name="_Toc240810834"/>
       <w:r>
         <w:t>Reporting on Test Coverage</w:t>
       </w:r>
@@ -16015,7 +16015,7 @@
         </w:rPr>
         <w:lastRenderedPageBreak/>
         <w:drawing>
-          <wp:inline distT="0" distB="0" distL="0" distR="0" wp14:anchorId="1AD8F0AB" wp14:editId="0F9583AD">
+          <wp:inline distT="0" distB="0" distL="0" distR="0" wp14:anchorId="79B14E61" wp14:editId="2218D8D9">
             <wp:extent cx="5943600" cy="3714750"/>
             <wp:effectExtent l="0" t="0" r="0" b="0"/>
             <wp:docPr id="25" name="Picture 25"/>
@@ -16069,7 +16069,7 @@
       <w:pPr>
         <w:pStyle w:val="Heading1"/>
       </w:pPr>
-      <w:bookmarkStart w:id="21" w:name="_Toc240810474"/>
+      <w:bookmarkStart w:id="21" w:name="_Toc240810835"/>
       <w:r>
         <w:t>Risks, Dependencies, Assumptions, and Constraints</w:t>
       </w:r>
@@ -16733,7 +16733,7 @@
       <w:pPr>
         <w:pStyle w:val="Heading1"/>
       </w:pPr>
-      <w:bookmarkStart w:id="22" w:name="_Toc240810475"/>
+      <w:bookmarkStart w:id="22" w:name="_Toc240810836"/>
       <w:r>
         <w:t>References</w:t>
       </w:r>

</xml_diff>

<commit_message>
Report: drafting and diagnosis answer on the server again
GROQ_API_KEY is a repository secret now, so the deployed stack reaches a
model: 755 ms for a draft and 558 ms for a diagnosis from the server. D24
records that rather than the blocked state.
</commit_message>
<xml_diff>
--- a/docs/test-report/Lanka-Link-v3-Master-Test-Plan.docx
+++ b/docs/test-report/Lanka-Link-v3-Master-Test-Plan.docx
@@ -334,7 +334,7 @@
       <w:r>
         <w:fldChar w:fldCharType="separate"/>
       </w:r>
-      <w:hyperlink w:anchor="_Toc240810814" w:history="1">
+      <w:hyperlink w:anchor="_Toc240812141" w:history="1">
         <w:r>
           <w:rPr>
             <w:rStyle w:val="Hyperlink"/>
@@ -380,7 +380,7 @@
             <w:noProof/>
             <w:webHidden/>
           </w:rPr>
-          <w:instrText xml:space="preserve"> PAGEREF _Toc240810814 \h </w:instrText>
+          <w:instrText xml:space="preserve"> PAGEREF _Toc240812141 \h </w:instrText>
         </w:r>
         <w:r>
           <w:rPr>
@@ -427,7 +427,7 @@
           <w14:ligatures w14:val="standardContextual"/>
         </w:rPr>
       </w:pPr>
-      <w:hyperlink w:anchor="_Toc240810815" w:history="1">
+      <w:hyperlink w:anchor="_Toc240812142" w:history="1">
         <w:r>
           <w:rPr>
             <w:rStyle w:val="Hyperlink"/>
@@ -473,7 +473,7 @@
             <w:noProof/>
             <w:webHidden/>
           </w:rPr>
-          <w:instrText xml:space="preserve"> PAGEREF _Toc240810815 \h </w:instrText>
+          <w:instrText xml:space="preserve"> PAGEREF _Toc240812142 \h </w:instrText>
         </w:r>
         <w:r>
           <w:rPr>
@@ -520,7 +520,7 @@
           <w14:ligatures w14:val="standardContextual"/>
         </w:rPr>
       </w:pPr>
-      <w:hyperlink w:anchor="_Toc240810816" w:history="1">
+      <w:hyperlink w:anchor="_Toc240812143" w:history="1">
         <w:r>
           <w:rPr>
             <w:rStyle w:val="Hyperlink"/>
@@ -566,7 +566,7 @@
             <w:noProof/>
             <w:webHidden/>
           </w:rPr>
-          <w:instrText xml:space="preserve"> PAGEREF _Toc240810816 \h </w:instrText>
+          <w:instrText xml:space="preserve"> PAGEREF _Toc240812143 \h </w:instrText>
         </w:r>
         <w:r>
           <w:rPr>
@@ -613,7 +613,7 @@
           <w14:ligatures w14:val="standardContextual"/>
         </w:rPr>
       </w:pPr>
-      <w:hyperlink w:anchor="_Toc240810817" w:history="1">
+      <w:hyperlink w:anchor="_Toc240812144" w:history="1">
         <w:r>
           <w:rPr>
             <w:rStyle w:val="Hyperlink"/>
@@ -659,7 +659,7 @@
             <w:noProof/>
             <w:webHidden/>
           </w:rPr>
-          <w:instrText xml:space="preserve"> PAGEREF _Toc240810817 \h </w:instrText>
+          <w:instrText xml:space="preserve"> PAGEREF _Toc240812144 \h </w:instrText>
         </w:r>
         <w:r>
           <w:rPr>
@@ -703,7 +703,7 @@
           <w14:ligatures w14:val="standardContextual"/>
         </w:rPr>
       </w:pPr>
-      <w:hyperlink w:anchor="_Toc240810818" w:history="1">
+      <w:hyperlink w:anchor="_Toc240812145" w:history="1">
         <w:r>
           <w:rPr>
             <w:rStyle w:val="Hyperlink"/>
@@ -749,7 +749,7 @@
             <w:noProof/>
             <w:webHidden/>
           </w:rPr>
-          <w:instrText xml:space="preserve"> PAGEREF _Toc240810818 \h </w:instrText>
+          <w:instrText xml:space="preserve"> PAGEREF _Toc240812145 \h </w:instrText>
         </w:r>
         <w:r>
           <w:rPr>
@@ -793,7 +793,7 @@
           <w14:ligatures w14:val="standardContextual"/>
         </w:rPr>
       </w:pPr>
-      <w:hyperlink w:anchor="_Toc240810819" w:history="1">
+      <w:hyperlink w:anchor="_Toc240812146" w:history="1">
         <w:r>
           <w:rPr>
             <w:rStyle w:val="Hyperlink"/>
@@ -839,7 +839,7 @@
             <w:noProof/>
             <w:webHidden/>
           </w:rPr>
-          <w:instrText xml:space="preserve"> PAGEREF _Toc240810819 \h </w:instrText>
+          <w:instrText xml:space="preserve"> PAGEREF _Toc240812146 \h </w:instrText>
         </w:r>
         <w:r>
           <w:rPr>
@@ -883,7 +883,7 @@
           <w14:ligatures w14:val="standardContextual"/>
         </w:rPr>
       </w:pPr>
-      <w:hyperlink w:anchor="_Toc240810820" w:history="1">
+      <w:hyperlink w:anchor="_Toc240812147" w:history="1">
         <w:r>
           <w:rPr>
             <w:rStyle w:val="Hyperlink"/>
@@ -929,7 +929,7 @@
             <w:noProof/>
             <w:webHidden/>
           </w:rPr>
-          <w:instrText xml:space="preserve"> PAGEREF _Toc240810820 \h </w:instrText>
+          <w:instrText xml:space="preserve"> PAGEREF _Toc240812147 \h </w:instrText>
         </w:r>
         <w:r>
           <w:rPr>
@@ -973,7 +973,7 @@
           <w14:ligatures w14:val="standardContextual"/>
         </w:rPr>
       </w:pPr>
-      <w:hyperlink w:anchor="_Toc240810821" w:history="1">
+      <w:hyperlink w:anchor="_Toc240812148" w:history="1">
         <w:r>
           <w:rPr>
             <w:rStyle w:val="Hyperlink"/>
@@ -1019,7 +1019,7 @@
             <w:noProof/>
             <w:webHidden/>
           </w:rPr>
-          <w:instrText xml:space="preserve"> PAGEREF _Toc240810821 \h </w:instrText>
+          <w:instrText xml:space="preserve"> PAGEREF _Toc240812148 \h </w:instrText>
         </w:r>
         <w:r>
           <w:rPr>
@@ -1063,7 +1063,7 @@
           <w14:ligatures w14:val="standardContextual"/>
         </w:rPr>
       </w:pPr>
-      <w:hyperlink w:anchor="_Toc240810822" w:history="1">
+      <w:hyperlink w:anchor="_Toc240812149" w:history="1">
         <w:r>
           <w:rPr>
             <w:rStyle w:val="Hyperlink"/>
@@ -1109,7 +1109,7 @@
             <w:noProof/>
             <w:webHidden/>
           </w:rPr>
-          <w:instrText xml:space="preserve"> PAGEREF _Toc240810822 \h </w:instrText>
+          <w:instrText xml:space="preserve"> PAGEREF _Toc240812149 \h </w:instrText>
         </w:r>
         <w:r>
           <w:rPr>
@@ -1153,7 +1153,7 @@
           <w14:ligatures w14:val="standardContextual"/>
         </w:rPr>
       </w:pPr>
-      <w:hyperlink w:anchor="_Toc240810823" w:history="1">
+      <w:hyperlink w:anchor="_Toc240812150" w:history="1">
         <w:r>
           <w:rPr>
             <w:rStyle w:val="Hyperlink"/>
@@ -1199,7 +1199,7 @@
             <w:noProof/>
             <w:webHidden/>
           </w:rPr>
-          <w:instrText xml:space="preserve"> PAGEREF _Toc240810823 \h </w:instrText>
+          <w:instrText xml:space="preserve"> PAGEREF _Toc240812150 \h </w:instrText>
         </w:r>
         <w:r>
           <w:rPr>
@@ -1243,7 +1243,7 @@
           <w14:ligatures w14:val="standardContextual"/>
         </w:rPr>
       </w:pPr>
-      <w:hyperlink w:anchor="_Toc240810824" w:history="1">
+      <w:hyperlink w:anchor="_Toc240812151" w:history="1">
         <w:r>
           <w:rPr>
             <w:rStyle w:val="Hyperlink"/>
@@ -1289,7 +1289,7 @@
             <w:noProof/>
             <w:webHidden/>
           </w:rPr>
-          <w:instrText xml:space="preserve"> PAGEREF _Toc240810824 \h </w:instrText>
+          <w:instrText xml:space="preserve"> PAGEREF _Toc240812151 \h </w:instrText>
         </w:r>
         <w:r>
           <w:rPr>
@@ -1333,7 +1333,7 @@
           <w14:ligatures w14:val="standardContextual"/>
         </w:rPr>
       </w:pPr>
-      <w:hyperlink w:anchor="_Toc240810825" w:history="1">
+      <w:hyperlink w:anchor="_Toc240812152" w:history="1">
         <w:r>
           <w:rPr>
             <w:rStyle w:val="Hyperlink"/>
@@ -1379,7 +1379,7 @@
             <w:noProof/>
             <w:webHidden/>
           </w:rPr>
-          <w:instrText xml:space="preserve"> PAGEREF _Toc240810825 \h </w:instrText>
+          <w:instrText xml:space="preserve"> PAGEREF _Toc240812152 \h </w:instrText>
         </w:r>
         <w:r>
           <w:rPr>
@@ -1426,7 +1426,7 @@
           <w14:ligatures w14:val="standardContextual"/>
         </w:rPr>
       </w:pPr>
-      <w:hyperlink w:anchor="_Toc240810826" w:history="1">
+      <w:hyperlink w:anchor="_Toc240812153" w:history="1">
         <w:r>
           <w:rPr>
             <w:rStyle w:val="Hyperlink"/>
@@ -1472,7 +1472,7 @@
             <w:noProof/>
             <w:webHidden/>
           </w:rPr>
-          <w:instrText xml:space="preserve"> PAGEREF _Toc240810826 \h </w:instrText>
+          <w:instrText xml:space="preserve"> PAGEREF _Toc240812153 \h </w:instrText>
         </w:r>
         <w:r>
           <w:rPr>
@@ -1516,7 +1516,7 @@
           <w14:ligatures w14:val="standardContextual"/>
         </w:rPr>
       </w:pPr>
-      <w:hyperlink w:anchor="_Toc240810827" w:history="1">
+      <w:hyperlink w:anchor="_Toc240812154" w:history="1">
         <w:r>
           <w:rPr>
             <w:rStyle w:val="Hyperlink"/>
@@ -1562,7 +1562,7 @@
             <w:noProof/>
             <w:webHidden/>
           </w:rPr>
-          <w:instrText xml:space="preserve"> PAGEREF _Toc240810827 \h </w:instrText>
+          <w:instrText xml:space="preserve"> PAGEREF _Toc240812154 \h </w:instrText>
         </w:r>
         <w:r>
           <w:rPr>
@@ -1606,7 +1606,7 @@
           <w14:ligatures w14:val="standardContextual"/>
         </w:rPr>
       </w:pPr>
-      <w:hyperlink w:anchor="_Toc240810828" w:history="1">
+      <w:hyperlink w:anchor="_Toc240812155" w:history="1">
         <w:r>
           <w:rPr>
             <w:rStyle w:val="Hyperlink"/>
@@ -1652,7 +1652,7 @@
             <w:noProof/>
             <w:webHidden/>
           </w:rPr>
-          <w:instrText xml:space="preserve"> PAGEREF _Toc240810828 \h </w:instrText>
+          <w:instrText xml:space="preserve"> PAGEREF _Toc240812155 \h </w:instrText>
         </w:r>
         <w:r>
           <w:rPr>
@@ -1696,7 +1696,7 @@
           <w14:ligatures w14:val="standardContextual"/>
         </w:rPr>
       </w:pPr>
-      <w:hyperlink w:anchor="_Toc240810829" w:history="1">
+      <w:hyperlink w:anchor="_Toc240812156" w:history="1">
         <w:r>
           <w:rPr>
             <w:rStyle w:val="Hyperlink"/>
@@ -1742,7 +1742,7 @@
             <w:noProof/>
             <w:webHidden/>
           </w:rPr>
-          <w:instrText xml:space="preserve"> PAGEREF _Toc240810829 \h </w:instrText>
+          <w:instrText xml:space="preserve"> PAGEREF _Toc240812156 \h </w:instrText>
         </w:r>
         <w:r>
           <w:rPr>
@@ -1786,7 +1786,7 @@
           <w14:ligatures w14:val="standardContextual"/>
         </w:rPr>
       </w:pPr>
-      <w:hyperlink w:anchor="_Toc240810830" w:history="1">
+      <w:hyperlink w:anchor="_Toc240812157" w:history="1">
         <w:r>
           <w:rPr>
             <w:rStyle w:val="Hyperlink"/>
@@ -1832,7 +1832,7 @@
             <w:noProof/>
             <w:webHidden/>
           </w:rPr>
-          <w:instrText xml:space="preserve"> PAGEREF _Toc240810830 \h </w:instrText>
+          <w:instrText xml:space="preserve"> PAGEREF _Toc240812157 \h </w:instrText>
         </w:r>
         <w:r>
           <w:rPr>
@@ -1876,7 +1876,7 @@
           <w14:ligatures w14:val="standardContextual"/>
         </w:rPr>
       </w:pPr>
-      <w:hyperlink w:anchor="_Toc240810831" w:history="1">
+      <w:hyperlink w:anchor="_Toc240812158" w:history="1">
         <w:r>
           <w:rPr>
             <w:rStyle w:val="Hyperlink"/>
@@ -1922,7 +1922,7 @@
             <w:noProof/>
             <w:webHidden/>
           </w:rPr>
-          <w:instrText xml:space="preserve"> PAGEREF _Toc240810831 \h </w:instrText>
+          <w:instrText xml:space="preserve"> PAGEREF _Toc240812158 \h </w:instrText>
         </w:r>
         <w:r>
           <w:rPr>
@@ -1969,7 +1969,7 @@
           <w14:ligatures w14:val="standardContextual"/>
         </w:rPr>
       </w:pPr>
-      <w:hyperlink w:anchor="_Toc240810832" w:history="1">
+      <w:hyperlink w:anchor="_Toc240812159" w:history="1">
         <w:r>
           <w:rPr>
             <w:rStyle w:val="Hyperlink"/>
@@ -2015,7 +2015,7 @@
             <w:noProof/>
             <w:webHidden/>
           </w:rPr>
-          <w:instrText xml:space="preserve"> PAGEREF _Toc240810832 \h </w:instrText>
+          <w:instrText xml:space="preserve"> PAGEREF _Toc240812159 \h </w:instrText>
         </w:r>
         <w:r>
           <w:rPr>
@@ -2062,7 +2062,7 @@
           <w14:ligatures w14:val="standardContextual"/>
         </w:rPr>
       </w:pPr>
-      <w:hyperlink w:anchor="_Toc240810833" w:history="1">
+      <w:hyperlink w:anchor="_Toc240812160" w:history="1">
         <w:r>
           <w:rPr>
             <w:rStyle w:val="Hyperlink"/>
@@ -2108,7 +2108,7 @@
             <w:noProof/>
             <w:webHidden/>
           </w:rPr>
-          <w:instrText xml:space="preserve"> PAGEREF _Toc240810833 \h </w:instrText>
+          <w:instrText xml:space="preserve"> PAGEREF _Toc240812160 \h </w:instrText>
         </w:r>
         <w:r>
           <w:rPr>
@@ -2155,7 +2155,7 @@
           <w14:ligatures w14:val="standardContextual"/>
         </w:rPr>
       </w:pPr>
-      <w:hyperlink w:anchor="_Toc240810834" w:history="1">
+      <w:hyperlink w:anchor="_Toc240812161" w:history="1">
         <w:r>
           <w:rPr>
             <w:rStyle w:val="Hyperlink"/>
@@ -2201,7 +2201,7 @@
             <w:noProof/>
             <w:webHidden/>
           </w:rPr>
-          <w:instrText xml:space="preserve"> PAGEREF _Toc240810834 \h </w:instrText>
+          <w:instrText xml:space="preserve"> PAGEREF _Toc240812161 \h </w:instrText>
         </w:r>
         <w:r>
           <w:rPr>
@@ -2248,7 +2248,7 @@
           <w14:ligatures w14:val="standardContextual"/>
         </w:rPr>
       </w:pPr>
-      <w:hyperlink w:anchor="_Toc240810835" w:history="1">
+      <w:hyperlink w:anchor="_Toc240812162" w:history="1">
         <w:r>
           <w:rPr>
             <w:rStyle w:val="Hyperlink"/>
@@ -2294,7 +2294,7 @@
             <w:noProof/>
             <w:webHidden/>
           </w:rPr>
-          <w:instrText xml:space="preserve"> PAGEREF _Toc240810835 \h </w:instrText>
+          <w:instrText xml:space="preserve"> PAGEREF _Toc240812162 \h </w:instrText>
         </w:r>
         <w:r>
           <w:rPr>
@@ -2341,7 +2341,7 @@
           <w14:ligatures w14:val="standardContextual"/>
         </w:rPr>
       </w:pPr>
-      <w:hyperlink w:anchor="_Toc240810836" w:history="1">
+      <w:hyperlink w:anchor="_Toc240812163" w:history="1">
         <w:r>
           <w:rPr>
             <w:rStyle w:val="Hyperlink"/>
@@ -2387,7 +2387,7 @@
             <w:noProof/>
             <w:webHidden/>
           </w:rPr>
-          <w:instrText xml:space="preserve"> PAGEREF _Toc240810836 \h </w:instrText>
+          <w:instrText xml:space="preserve"> PAGEREF _Toc240812163 \h </w:instrText>
         </w:r>
         <w:r>
           <w:rPr>
@@ -2459,7 +2459,7 @@
       <w:pPr>
         <w:pStyle w:val="Heading1"/>
       </w:pPr>
-      <w:bookmarkStart w:id="0" w:name="_Toc240810814"/>
+      <w:bookmarkStart w:id="0" w:name="_Toc240812141"/>
       <w:r>
         <w:t>Evaluation Mission and Test Motivation</w:t>
       </w:r>
@@ -2622,7 +2622,7 @@
       <w:pPr>
         <w:pStyle w:val="Heading1"/>
       </w:pPr>
-      <w:bookmarkStart w:id="1" w:name="_Toc240810815"/>
+      <w:bookmarkStart w:id="1" w:name="_Toc240812142"/>
       <w:r>
         <w:t>Target Test Items</w:t>
       </w:r>
@@ -3301,7 +3301,7 @@
       <w:pPr>
         <w:pStyle w:val="Heading1"/>
       </w:pPr>
-      <w:bookmarkStart w:id="2" w:name="_Toc240810816"/>
+      <w:bookmarkStart w:id="2" w:name="_Toc240812143"/>
       <w:r>
         <w:t>Test Approach</w:t>
       </w:r>
@@ -3844,7 +3844,7 @@
       <w:pPr>
         <w:pStyle w:val="Heading2"/>
       </w:pPr>
-      <w:bookmarkStart w:id="3" w:name="_Toc240810817"/>
+      <w:bookmarkStart w:id="3" w:name="_Toc240812144"/>
       <w:r>
         <w:lastRenderedPageBreak/>
         <w:t>Testing Techniques and Types</w:t>
@@ -3855,7 +3855,7 @@
       <w:pPr>
         <w:pStyle w:val="Heading3"/>
       </w:pPr>
-      <w:bookmarkStart w:id="4" w:name="_Toc240810818"/>
+      <w:bookmarkStart w:id="4" w:name="_Toc240812145"/>
       <w:r>
         <w:t>Data and Database Integrity Testing</w:t>
       </w:r>
@@ -4220,7 +4220,7 @@
           <w:noProof/>
         </w:rPr>
         <w:drawing>
-          <wp:inline distT="0" distB="0" distL="0" distR="0" wp14:anchorId="61159E97" wp14:editId="1571FD9F">
+          <wp:inline distT="0" distB="0" distL="0" distR="0" wp14:anchorId="18409B75" wp14:editId="01988630">
             <wp:extent cx="5486400" cy="1264662"/>
             <wp:effectExtent l="0" t="0" r="0" b="0"/>
             <wp:docPr id="1" name="Picture 1"/>
@@ -4274,7 +4274,7 @@
       <w:pPr>
         <w:pStyle w:val="Heading3"/>
       </w:pPr>
-      <w:bookmarkStart w:id="5" w:name="_Toc240810819"/>
+      <w:bookmarkStart w:id="5" w:name="_Toc240812146"/>
       <w:r>
         <w:t>Function Testing</w:t>
       </w:r>
@@ -4633,7 +4633,7 @@
           <w:noProof/>
         </w:rPr>
         <w:drawing>
-          <wp:inline distT="0" distB="0" distL="0" distR="0" wp14:anchorId="511B6C6A" wp14:editId="241B0C6E">
+          <wp:inline distT="0" distB="0" distL="0" distR="0" wp14:anchorId="53609922" wp14:editId="3BDF81F3">
             <wp:extent cx="5486400" cy="2442533"/>
             <wp:effectExtent l="0" t="0" r="0" b="0"/>
             <wp:docPr id="2" name="Picture 2"/>
@@ -5117,7 +5117,7 @@
           <w:noProof/>
         </w:rPr>
         <w:drawing>
-          <wp:inline distT="0" distB="0" distL="0" distR="0" wp14:anchorId="3CB89D58" wp14:editId="11791A74">
+          <wp:inline distT="0" distB="0" distL="0" distR="0" wp14:anchorId="088908FE" wp14:editId="0C2AB737">
             <wp:extent cx="4754880" cy="805912"/>
             <wp:effectExtent l="0" t="0" r="0" b="0"/>
             <wp:docPr id="3" name="Picture 3"/>
@@ -5171,7 +5171,7 @@
       <w:pPr>
         <w:pStyle w:val="Heading3"/>
       </w:pPr>
-      <w:bookmarkStart w:id="6" w:name="_Toc240810820"/>
+      <w:bookmarkStart w:id="6" w:name="_Toc240812147"/>
       <w:r>
         <w:t>User Interface Testing</w:t>
       </w:r>
@@ -5525,7 +5525,7 @@
           <w:noProof/>
         </w:rPr>
         <w:drawing>
-          <wp:inline distT="0" distB="0" distL="0" distR="0" wp14:anchorId="6DF893AD" wp14:editId="7446553F">
+          <wp:inline distT="0" distB="0" distL="0" distR="0" wp14:anchorId="5DC382A2" wp14:editId="30776FE6">
             <wp:extent cx="5760720" cy="2875859"/>
             <wp:effectExtent l="0" t="0" r="0" b="0"/>
             <wp:docPr id="4" name="Picture 4"/>
@@ -5585,7 +5585,7 @@
           <w:noProof/>
         </w:rPr>
         <w:drawing>
-          <wp:inline distT="0" distB="0" distL="0" distR="0" wp14:anchorId="49414666" wp14:editId="6836A246">
+          <wp:inline distT="0" distB="0" distL="0" distR="0" wp14:anchorId="710C855F" wp14:editId="08657DE8">
             <wp:extent cx="5760720" cy="2875859"/>
             <wp:effectExtent l="0" t="0" r="0" b="0"/>
             <wp:docPr id="5" name="Picture 5"/>
@@ -5646,7 +5646,7 @@
         </w:rPr>
         <w:lastRenderedPageBreak/>
         <w:drawing>
-          <wp:inline distT="0" distB="0" distL="0" distR="0" wp14:anchorId="12FC54DD" wp14:editId="7550584E">
+          <wp:inline distT="0" distB="0" distL="0" distR="0" wp14:anchorId="389BF271" wp14:editId="51B0A5A0">
             <wp:extent cx="5760720" cy="2875859"/>
             <wp:effectExtent l="0" t="0" r="0" b="0"/>
             <wp:docPr id="6" name="Picture 6"/>
@@ -5706,7 +5706,7 @@
           <w:noProof/>
         </w:rPr>
         <w:drawing>
-          <wp:inline distT="0" distB="0" distL="0" distR="0" wp14:anchorId="2658A71E" wp14:editId="320FEA43">
+          <wp:inline distT="0" distB="0" distL="0" distR="0" wp14:anchorId="00CEDD65" wp14:editId="1B101F3F">
             <wp:extent cx="5577840" cy="3486150"/>
             <wp:effectExtent l="0" t="0" r="0" b="0"/>
             <wp:docPr id="7" name="Picture 7"/>
@@ -5767,7 +5767,7 @@
         </w:rPr>
         <w:lastRenderedPageBreak/>
         <w:drawing>
-          <wp:inline distT="0" distB="0" distL="0" distR="0" wp14:anchorId="279AE74E" wp14:editId="7CA86271">
+          <wp:inline distT="0" distB="0" distL="0" distR="0" wp14:anchorId="548B662A" wp14:editId="02DB3A08">
             <wp:extent cx="5577840" cy="3486150"/>
             <wp:effectExtent l="0" t="0" r="0" b="0"/>
             <wp:docPr id="8" name="Picture 8"/>
@@ -5827,7 +5827,7 @@
           <w:noProof/>
         </w:rPr>
         <w:drawing>
-          <wp:inline distT="0" distB="0" distL="0" distR="0" wp14:anchorId="62D57159" wp14:editId="316A5D8B">
+          <wp:inline distT="0" distB="0" distL="0" distR="0" wp14:anchorId="2F4DFBC1" wp14:editId="5DBFF374">
             <wp:extent cx="5577840" cy="3486150"/>
             <wp:effectExtent l="0" t="0" r="0" b="0"/>
             <wp:docPr id="9" name="Picture 9"/>
@@ -5888,7 +5888,7 @@
         </w:rPr>
         <w:lastRenderedPageBreak/>
         <w:drawing>
-          <wp:inline distT="0" distB="0" distL="0" distR="0" wp14:anchorId="58935AC9" wp14:editId="280EC130">
+          <wp:inline distT="0" distB="0" distL="0" distR="0" wp14:anchorId="27EB9FE7" wp14:editId="156236F0">
             <wp:extent cx="5577840" cy="3486150"/>
             <wp:effectExtent l="0" t="0" r="0" b="0"/>
             <wp:docPr id="10" name="Picture 10"/>
@@ -5948,7 +5948,7 @@
           <w:noProof/>
         </w:rPr>
         <w:drawing>
-          <wp:inline distT="0" distB="0" distL="0" distR="0" wp14:anchorId="5916250E" wp14:editId="41986307">
+          <wp:inline distT="0" distB="0" distL="0" distR="0" wp14:anchorId="73E25CBE" wp14:editId="4E0CD0C5">
             <wp:extent cx="5486400" cy="2442533"/>
             <wp:effectExtent l="0" t="0" r="0" b="0"/>
             <wp:docPr id="11" name="Picture 11"/>
@@ -6002,7 +6002,7 @@
       <w:pPr>
         <w:pStyle w:val="Heading3"/>
       </w:pPr>
-      <w:bookmarkStart w:id="7" w:name="_Toc240810821"/>
+      <w:bookmarkStart w:id="7" w:name="_Toc240812148"/>
       <w:r>
         <w:t>Performance Profiling</w:t>
       </w:r>
@@ -7042,7 +7042,7 @@
           <w:noProof/>
         </w:rPr>
         <w:drawing>
-          <wp:inline distT="0" distB="0" distL="0" distR="0" wp14:anchorId="0E1BCE53" wp14:editId="5BC70444">
+          <wp:inline distT="0" distB="0" distL="0" distR="0" wp14:anchorId="5CB1F732" wp14:editId="32652D01">
             <wp:extent cx="5486400" cy="1264662"/>
             <wp:effectExtent l="0" t="0" r="0" b="0"/>
             <wp:docPr id="12" name="Picture 12"/>
@@ -7096,7 +7096,7 @@
       <w:pPr>
         <w:pStyle w:val="Heading3"/>
       </w:pPr>
-      <w:bookmarkStart w:id="8" w:name="_Toc240810822"/>
+      <w:bookmarkStart w:id="8" w:name="_Toc240812149"/>
       <w:r>
         <w:t>Load Testing</w:t>
       </w:r>
@@ -7803,7 +7803,7 @@
         </w:rPr>
         <w:lastRenderedPageBreak/>
         <w:drawing>
-          <wp:inline distT="0" distB="0" distL="0" distR="0" wp14:anchorId="7CFB94CB" wp14:editId="5A8825C2">
+          <wp:inline distT="0" distB="0" distL="0" distR="0" wp14:anchorId="6E7C5228" wp14:editId="3268BDB8">
             <wp:extent cx="5486400" cy="7752252"/>
             <wp:effectExtent l="0" t="0" r="0" b="0"/>
             <wp:docPr id="13" name="Picture 13"/>
@@ -8221,7 +8221,7 @@
         </w:rPr>
         <w:lastRenderedPageBreak/>
         <w:drawing>
-          <wp:inline distT="0" distB="0" distL="0" distR="0" wp14:anchorId="341D609D" wp14:editId="66103868">
+          <wp:inline distT="0" distB="0" distL="0" distR="0" wp14:anchorId="774318FA" wp14:editId="6422268E">
             <wp:extent cx="5486400" cy="7752252"/>
             <wp:effectExtent l="0" t="0" r="0" b="0"/>
             <wp:docPr id="14" name="Picture 14"/>
@@ -8284,7 +8284,7 @@
       <w:pPr>
         <w:pStyle w:val="Heading3"/>
       </w:pPr>
-      <w:bookmarkStart w:id="9" w:name="_Toc240810823"/>
+      <w:bookmarkStart w:id="9" w:name="_Toc240812150"/>
       <w:r>
         <w:t>Security and Access Control Testing</w:t>
       </w:r>
@@ -8639,7 +8639,7 @@
           <w:noProof/>
         </w:rPr>
         <w:drawing>
-          <wp:inline distT="0" distB="0" distL="0" distR="0" wp14:anchorId="1750D1AA" wp14:editId="12881F1B">
+          <wp:inline distT="0" distB="0" distL="0" distR="0" wp14:anchorId="0D2DF99E" wp14:editId="37CDE8AF">
             <wp:extent cx="5486400" cy="1850497"/>
             <wp:effectExtent l="0" t="0" r="0" b="0"/>
             <wp:docPr id="15" name="Picture 15"/>
@@ -8693,7 +8693,7 @@
       <w:pPr>
         <w:pStyle w:val="Heading3"/>
       </w:pPr>
-      <w:bookmarkStart w:id="10" w:name="_Toc240810824"/>
+      <w:bookmarkStart w:id="10" w:name="_Toc240812151"/>
       <w:r>
         <w:lastRenderedPageBreak/>
         <w:t>Failover and Recovery Testing</w:t>
@@ -9029,7 +9029,7 @@
           <w:noProof/>
         </w:rPr>
         <w:drawing>
-          <wp:inline distT="0" distB="0" distL="0" distR="0" wp14:anchorId="0B1E1911" wp14:editId="1CB454E1">
+          <wp:inline distT="0" distB="0" distL="0" distR="0" wp14:anchorId="71644395" wp14:editId="2E81AC4F">
             <wp:extent cx="5486400" cy="929898"/>
             <wp:effectExtent l="0" t="0" r="0" b="0"/>
             <wp:docPr id="16" name="Picture 16"/>
@@ -9083,7 +9083,7 @@
       <w:pPr>
         <w:pStyle w:val="Heading3"/>
       </w:pPr>
-      <w:bookmarkStart w:id="11" w:name="_Toc240810825"/>
+      <w:bookmarkStart w:id="11" w:name="_Toc240812152"/>
       <w:r>
         <w:t>Configuration Testing</w:t>
       </w:r>
@@ -9426,7 +9426,7 @@
           <w:noProof/>
         </w:rPr>
         <w:drawing>
-          <wp:inline distT="0" distB="0" distL="0" distR="0" wp14:anchorId="4D28FBF4" wp14:editId="38568CAB">
+          <wp:inline distT="0" distB="0" distL="0" distR="0" wp14:anchorId="3FBC0BDF" wp14:editId="2C203431">
             <wp:extent cx="5303520" cy="1384309"/>
             <wp:effectExtent l="0" t="0" r="0" b="0"/>
             <wp:docPr id="17" name="Picture 17"/>
@@ -9480,7 +9480,7 @@
       <w:pPr>
         <w:pStyle w:val="Heading2"/>
       </w:pPr>
-      <w:bookmarkStart w:id="12" w:name="_Toc240810826"/>
+      <w:bookmarkStart w:id="12" w:name="_Toc240812153"/>
       <w:r>
         <w:t>Model Selection and Evaluation</w:t>
       </w:r>
@@ -9937,7 +9937,7 @@
       <w:pPr>
         <w:pStyle w:val="Heading3"/>
       </w:pPr>
-      <w:bookmarkStart w:id="13" w:name="_Toc240810827"/>
+      <w:bookmarkStart w:id="13" w:name="_Toc240812154"/>
       <w:r>
         <w:t>Intent and Department Classification</w:t>
       </w:r>
@@ -10724,7 +10724,7 @@
           <w:noProof/>
         </w:rPr>
         <w:drawing>
-          <wp:inline distT="0" distB="0" distL="0" distR="0" wp14:anchorId="6B5F4B78" wp14:editId="41DF2225">
+          <wp:inline distT="0" distB="0" distL="0" distR="0" wp14:anchorId="6A7F0EE5" wp14:editId="276B51E4">
             <wp:extent cx="5120640" cy="2844800"/>
             <wp:effectExtent l="0" t="0" r="0" b="0"/>
             <wp:docPr id="18" name="Picture 18"/>
@@ -10784,7 +10784,7 @@
           <w:noProof/>
         </w:rPr>
         <w:drawing>
-          <wp:inline distT="0" distB="0" distL="0" distR="0" wp14:anchorId="282DC07B" wp14:editId="7E3DFCC1">
+          <wp:inline distT="0" distB="0" distL="0" distR="0" wp14:anchorId="5B31647A" wp14:editId="10E8958F">
             <wp:extent cx="5120640" cy="2703698"/>
             <wp:effectExtent l="0" t="0" r="0" b="0"/>
             <wp:docPr id="19" name="Picture 19"/>
@@ -11190,7 +11190,7 @@
           <w:noProof/>
         </w:rPr>
         <w:drawing>
-          <wp:inline distT="0" distB="0" distL="0" distR="0" wp14:anchorId="2B1682A8" wp14:editId="199F3B54">
+          <wp:inline distT="0" distB="0" distL="0" distR="0" wp14:anchorId="45BE3E61" wp14:editId="2E6BE841">
             <wp:extent cx="4937760" cy="2743200"/>
             <wp:effectExtent l="0" t="0" r="0" b="0"/>
             <wp:docPr id="20" name="Picture 20"/>
@@ -11244,7 +11244,7 @@
       <w:pPr>
         <w:pStyle w:val="Heading3"/>
       </w:pPr>
-      <w:bookmarkStart w:id="14" w:name="_Toc240810828"/>
+      <w:bookmarkStart w:id="14" w:name="_Toc240812155"/>
       <w:r>
         <w:t>Customer Priority: Distillation from Language Model Labels</w:t>
       </w:r>
@@ -11668,7 +11668,7 @@
       <w:pPr>
         <w:pStyle w:val="Heading3"/>
       </w:pPr>
-      <w:bookmarkStart w:id="15" w:name="_Toc240810829"/>
+      <w:bookmarkStart w:id="15" w:name="_Toc240812156"/>
       <w:r>
         <w:lastRenderedPageBreak/>
         <w:t>Router Photo Classification</w:t>
@@ -12338,7 +12338,7 @@
           <w:noProof/>
         </w:rPr>
         <w:drawing>
-          <wp:inline distT="0" distB="0" distL="0" distR="0" wp14:anchorId="0CB3C642" wp14:editId="67C9830D">
+          <wp:inline distT="0" distB="0" distL="0" distR="0" wp14:anchorId="7CB9D75B" wp14:editId="0087C4C9">
             <wp:extent cx="5120640" cy="2844800"/>
             <wp:effectExtent l="0" t="0" r="0" b="0"/>
             <wp:docPr id="21" name="Picture 21"/>
@@ -12392,7 +12392,7 @@
       <w:pPr>
         <w:pStyle w:val="Heading3"/>
       </w:pPr>
-      <w:bookmarkStart w:id="16" w:name="_Toc240810830"/>
+      <w:bookmarkStart w:id="16" w:name="_Toc240812157"/>
       <w:r>
         <w:t>Speech Transcription</w:t>
       </w:r>
@@ -12849,7 +12849,7 @@
           <w:noProof/>
         </w:rPr>
         <w:drawing>
-          <wp:inline distT="0" distB="0" distL="0" distR="0" wp14:anchorId="38B588F4" wp14:editId="2753BC74">
+          <wp:inline distT="0" distB="0" distL="0" distR="0" wp14:anchorId="7394F6E8" wp14:editId="34D122B6">
             <wp:extent cx="5120640" cy="1506071"/>
             <wp:effectExtent l="0" t="0" r="0" b="0"/>
             <wp:docPr id="22" name="Picture 22"/>
@@ -12903,7 +12903,7 @@
       <w:pPr>
         <w:pStyle w:val="Heading3"/>
       </w:pPr>
-      <w:bookmarkStart w:id="17" w:name="_Toc240810831"/>
+      <w:bookmarkStart w:id="17" w:name="_Toc240812158"/>
       <w:r>
         <w:t>Grounded Response Validation</w:t>
       </w:r>
@@ -12951,7 +12951,7 @@
         </w:rPr>
         <w:lastRenderedPageBreak/>
         <w:drawing>
-          <wp:inline distT="0" distB="0" distL="0" distR="0" wp14:anchorId="52717060" wp14:editId="64F10297">
+          <wp:inline distT="0" distB="0" distL="0" distR="0" wp14:anchorId="562D6BDE" wp14:editId="279015FE">
             <wp:extent cx="5486400" cy="7919634"/>
             <wp:effectExtent l="0" t="0" r="0" b="0"/>
             <wp:docPr id="23" name="Picture 23"/>
@@ -13005,7 +13005,7 @@
       <w:pPr>
         <w:pStyle w:val="Heading1"/>
       </w:pPr>
-      <w:bookmarkStart w:id="18" w:name="_Toc240810832"/>
+      <w:bookmarkStart w:id="18" w:name="_Toc240812159"/>
       <w:r>
         <w:lastRenderedPageBreak/>
         <w:t>Deliverables</w:t>
@@ -13121,7 +13121,7 @@
       <w:pPr>
         <w:pStyle w:val="Heading2"/>
       </w:pPr>
-      <w:bookmarkStart w:id="19" w:name="_Toc240810833"/>
+      <w:bookmarkStart w:id="19" w:name="_Toc240812160"/>
       <w:r>
         <w:t>Test Evaluation Summaries</w:t>
       </w:r>
@@ -15208,7 +15208,7 @@
               <w:spacing w:after="60"/>
             </w:pPr>
             <w:r>
-              <w:t>The Ollama Cloud key is rejected (401), Gemini refuses the server's region, and the Groq key is not in the secret store</w:t>
+              <w:t>The Ollama Cloud key is rejected (401), Gemini refuses the server's region ("User location is not supported"), and the Groq key was missing</w:t>
             </w:r>
           </w:p>
         </w:tc>
@@ -15222,13 +15222,7 @@
               <w:spacing w:after="60"/>
             </w:pPr>
             <w:r>
-              <w:rPr>
-                <w:b/>
-              </w:rPr>
-              <w:t>Open, needs the owner</w:t>
-            </w:r>
-            <w:r>
-              <w:t>: set GROQ_API_KEY (Groq answers from the server) or refresh the Ollama key</w:t>
+              <w:t>GROQ_API_KEY set as a repository secret; after the deploy, drafting answers in 755 ms and diagnosis in 558 ms from the server; fixed</w:t>
             </w:r>
           </w:p>
         </w:tc>
@@ -15248,9 +15242,8 @@
         <w:rPr>
           <w:noProof/>
         </w:rPr>
-        <w:lastRenderedPageBreak/>
         <w:drawing>
-          <wp:inline distT="0" distB="0" distL="0" distR="0" wp14:anchorId="0CFD5465" wp14:editId="6D9B4BA1">
+          <wp:inline distT="0" distB="0" distL="0" distR="0" wp14:anchorId="5DA86BCA" wp14:editId="213C1F44">
             <wp:extent cx="5486400" cy="7333798"/>
             <wp:effectExtent l="0" t="0" r="0" b="0"/>
             <wp:docPr id="24" name="Picture 24"/>
@@ -15304,7 +15297,7 @@
       <w:pPr>
         <w:pStyle w:val="Heading2"/>
       </w:pPr>
-      <w:bookmarkStart w:id="20" w:name="_Toc240810834"/>
+      <w:bookmarkStart w:id="20" w:name="_Toc240812161"/>
       <w:r>
         <w:t>Reporting on Test Coverage</w:t>
       </w:r>
@@ -15351,6 +15344,7 @@
               <w:rPr>
                 <w:b/>
               </w:rPr>
+              <w:lastRenderedPageBreak/>
               <w:t>Technique</w:t>
             </w:r>
           </w:p>
@@ -15403,7 +15397,6 @@
               <w:spacing w:after="60"/>
             </w:pPr>
             <w:r>
-              <w:lastRenderedPageBreak/>
               <w:t>Unit and contract</w:t>
             </w:r>
           </w:p>
@@ -16015,7 +16008,7 @@
         </w:rPr>
         <w:lastRenderedPageBreak/>
         <w:drawing>
-          <wp:inline distT="0" distB="0" distL="0" distR="0" wp14:anchorId="79B14E61" wp14:editId="2218D8D9">
+          <wp:inline distT="0" distB="0" distL="0" distR="0" wp14:anchorId="1A884959" wp14:editId="7972A668">
             <wp:extent cx="5943600" cy="3714750"/>
             <wp:effectExtent l="0" t="0" r="0" b="0"/>
             <wp:docPr id="25" name="Picture 25"/>
@@ -16069,7 +16062,7 @@
       <w:pPr>
         <w:pStyle w:val="Heading1"/>
       </w:pPr>
-      <w:bookmarkStart w:id="21" w:name="_Toc240810835"/>
+      <w:bookmarkStart w:id="21" w:name="_Toc240812162"/>
       <w:r>
         <w:t>Risks, Dependencies, Assumptions, and Constraints</w:t>
       </w:r>
@@ -16733,7 +16726,7 @@
       <w:pPr>
         <w:pStyle w:val="Heading1"/>
       </w:pPr>
-      <w:bookmarkStart w:id="22" w:name="_Toc240810836"/>
+      <w:bookmarkStart w:id="22" w:name="_Toc240812163"/>
       <w:r>
         <w:t>References</w:t>
       </w:r>

</xml_diff>

<commit_message>
Report: coloured listings, and references without the repository entry
The log listings carry the colours a terminal gives them: the command in
blue, a failure in red, a warning in amber, a pass in green. Reference [12],
the repository itself, is gone, and no entry carries an accessed date.
</commit_message>
<xml_diff>
--- a/docs/test-report/Lanka-Link-v3-Master-Test-Plan.docx
+++ b/docs/test-report/Lanka-Link-v3-Master-Test-Plan.docx
@@ -334,7 +334,7 @@
       <w:r>
         <w:fldChar w:fldCharType="separate"/>
       </w:r>
-      <w:hyperlink w:anchor="_Toc240829247" w:history="1">
+      <w:hyperlink w:anchor="_Toc240829741" w:history="1">
         <w:r>
           <w:rPr>
             <w:rStyle w:val="Hyperlink"/>
@@ -380,7 +380,7 @@
             <w:noProof/>
             <w:webHidden/>
           </w:rPr>
-          <w:instrText xml:space="preserve"> PAGEREF _Toc240829247 \h </w:instrText>
+          <w:instrText xml:space="preserve"> PAGEREF _Toc240829741 \h </w:instrText>
         </w:r>
         <w:r>
           <w:rPr>
@@ -427,7 +427,7 @@
           <w14:ligatures w14:val="standardContextual"/>
         </w:rPr>
       </w:pPr>
-      <w:hyperlink w:anchor="_Toc240829248" w:history="1">
+      <w:hyperlink w:anchor="_Toc240829742" w:history="1">
         <w:r>
           <w:rPr>
             <w:rStyle w:val="Hyperlink"/>
@@ -473,7 +473,7 @@
             <w:noProof/>
             <w:webHidden/>
           </w:rPr>
-          <w:instrText xml:space="preserve"> PAGEREF _Toc240829248 \h </w:instrText>
+          <w:instrText xml:space="preserve"> PAGEREF _Toc240829742 \h </w:instrText>
         </w:r>
         <w:r>
           <w:rPr>
@@ -520,7 +520,7 @@
           <w14:ligatures w14:val="standardContextual"/>
         </w:rPr>
       </w:pPr>
-      <w:hyperlink w:anchor="_Toc240829249" w:history="1">
+      <w:hyperlink w:anchor="_Toc240829743" w:history="1">
         <w:r>
           <w:rPr>
             <w:rStyle w:val="Hyperlink"/>
@@ -566,7 +566,7 @@
             <w:noProof/>
             <w:webHidden/>
           </w:rPr>
-          <w:instrText xml:space="preserve"> PAGEREF _Toc240829249 \h </w:instrText>
+          <w:instrText xml:space="preserve"> PAGEREF _Toc240829743 \h </w:instrText>
         </w:r>
         <w:r>
           <w:rPr>
@@ -613,7 +613,7 @@
           <w14:ligatures w14:val="standardContextual"/>
         </w:rPr>
       </w:pPr>
-      <w:hyperlink w:anchor="_Toc240829250" w:history="1">
+      <w:hyperlink w:anchor="_Toc240829744" w:history="1">
         <w:r>
           <w:rPr>
             <w:rStyle w:val="Hyperlink"/>
@@ -659,7 +659,7 @@
             <w:noProof/>
             <w:webHidden/>
           </w:rPr>
-          <w:instrText xml:space="preserve"> PAGEREF _Toc240829250 \h </w:instrText>
+          <w:instrText xml:space="preserve"> PAGEREF _Toc240829744 \h </w:instrText>
         </w:r>
         <w:r>
           <w:rPr>
@@ -703,7 +703,7 @@
           <w14:ligatures w14:val="standardContextual"/>
         </w:rPr>
       </w:pPr>
-      <w:hyperlink w:anchor="_Toc240829251" w:history="1">
+      <w:hyperlink w:anchor="_Toc240829745" w:history="1">
         <w:r>
           <w:rPr>
             <w:rStyle w:val="Hyperlink"/>
@@ -749,7 +749,7 @@
             <w:noProof/>
             <w:webHidden/>
           </w:rPr>
-          <w:instrText xml:space="preserve"> PAGEREF _Toc240829251 \h </w:instrText>
+          <w:instrText xml:space="preserve"> PAGEREF _Toc240829745 \h </w:instrText>
         </w:r>
         <w:r>
           <w:rPr>
@@ -793,7 +793,7 @@
           <w14:ligatures w14:val="standardContextual"/>
         </w:rPr>
       </w:pPr>
-      <w:hyperlink w:anchor="_Toc240829252" w:history="1">
+      <w:hyperlink w:anchor="_Toc240829746" w:history="1">
         <w:r>
           <w:rPr>
             <w:rStyle w:val="Hyperlink"/>
@@ -839,7 +839,7 @@
             <w:noProof/>
             <w:webHidden/>
           </w:rPr>
-          <w:instrText xml:space="preserve"> PAGEREF _Toc240829252 \h </w:instrText>
+          <w:instrText xml:space="preserve"> PAGEREF _Toc240829746 \h </w:instrText>
         </w:r>
         <w:r>
           <w:rPr>
@@ -883,7 +883,7 @@
           <w14:ligatures w14:val="standardContextual"/>
         </w:rPr>
       </w:pPr>
-      <w:hyperlink w:anchor="_Toc240829253" w:history="1">
+      <w:hyperlink w:anchor="_Toc240829747" w:history="1">
         <w:r>
           <w:rPr>
             <w:rStyle w:val="Hyperlink"/>
@@ -929,7 +929,7 @@
             <w:noProof/>
             <w:webHidden/>
           </w:rPr>
-          <w:instrText xml:space="preserve"> PAGEREF _Toc240829253 \h </w:instrText>
+          <w:instrText xml:space="preserve"> PAGEREF _Toc240829747 \h </w:instrText>
         </w:r>
         <w:r>
           <w:rPr>
@@ -973,7 +973,7 @@
           <w14:ligatures w14:val="standardContextual"/>
         </w:rPr>
       </w:pPr>
-      <w:hyperlink w:anchor="_Toc240829254" w:history="1">
+      <w:hyperlink w:anchor="_Toc240829748" w:history="1">
         <w:r>
           <w:rPr>
             <w:rStyle w:val="Hyperlink"/>
@@ -1019,7 +1019,7 @@
             <w:noProof/>
             <w:webHidden/>
           </w:rPr>
-          <w:instrText xml:space="preserve"> PAGEREF _Toc240829254 \h </w:instrText>
+          <w:instrText xml:space="preserve"> PAGEREF _Toc240829748 \h </w:instrText>
         </w:r>
         <w:r>
           <w:rPr>
@@ -1063,7 +1063,7 @@
           <w14:ligatures w14:val="standardContextual"/>
         </w:rPr>
       </w:pPr>
-      <w:hyperlink w:anchor="_Toc240829255" w:history="1">
+      <w:hyperlink w:anchor="_Toc240829749" w:history="1">
         <w:r>
           <w:rPr>
             <w:rStyle w:val="Hyperlink"/>
@@ -1109,7 +1109,7 @@
             <w:noProof/>
             <w:webHidden/>
           </w:rPr>
-          <w:instrText xml:space="preserve"> PAGEREF _Toc240829255 \h </w:instrText>
+          <w:instrText xml:space="preserve"> PAGEREF _Toc240829749 \h </w:instrText>
         </w:r>
         <w:r>
           <w:rPr>
@@ -1153,7 +1153,7 @@
           <w14:ligatures w14:val="standardContextual"/>
         </w:rPr>
       </w:pPr>
-      <w:hyperlink w:anchor="_Toc240829256" w:history="1">
+      <w:hyperlink w:anchor="_Toc240829750" w:history="1">
         <w:r>
           <w:rPr>
             <w:rStyle w:val="Hyperlink"/>
@@ -1199,7 +1199,7 @@
             <w:noProof/>
             <w:webHidden/>
           </w:rPr>
-          <w:instrText xml:space="preserve"> PAGEREF _Toc240829256 \h </w:instrText>
+          <w:instrText xml:space="preserve"> PAGEREF _Toc240829750 \h </w:instrText>
         </w:r>
         <w:r>
           <w:rPr>
@@ -1243,7 +1243,7 @@
           <w14:ligatures w14:val="standardContextual"/>
         </w:rPr>
       </w:pPr>
-      <w:hyperlink w:anchor="_Toc240829257" w:history="1">
+      <w:hyperlink w:anchor="_Toc240829751" w:history="1">
         <w:r>
           <w:rPr>
             <w:rStyle w:val="Hyperlink"/>
@@ -1289,7 +1289,7 @@
             <w:noProof/>
             <w:webHidden/>
           </w:rPr>
-          <w:instrText xml:space="preserve"> PAGEREF _Toc240829257 \h </w:instrText>
+          <w:instrText xml:space="preserve"> PAGEREF _Toc240829751 \h </w:instrText>
         </w:r>
         <w:r>
           <w:rPr>
@@ -1333,7 +1333,7 @@
           <w14:ligatures w14:val="standardContextual"/>
         </w:rPr>
       </w:pPr>
-      <w:hyperlink w:anchor="_Toc240829258" w:history="1">
+      <w:hyperlink w:anchor="_Toc240829752" w:history="1">
         <w:r>
           <w:rPr>
             <w:rStyle w:val="Hyperlink"/>
@@ -1379,7 +1379,7 @@
             <w:noProof/>
             <w:webHidden/>
           </w:rPr>
-          <w:instrText xml:space="preserve"> PAGEREF _Toc240829258 \h </w:instrText>
+          <w:instrText xml:space="preserve"> PAGEREF _Toc240829752 \h </w:instrText>
         </w:r>
         <w:r>
           <w:rPr>
@@ -1426,7 +1426,7 @@
           <w14:ligatures w14:val="standardContextual"/>
         </w:rPr>
       </w:pPr>
-      <w:hyperlink w:anchor="_Toc240829259" w:history="1">
+      <w:hyperlink w:anchor="_Toc240829753" w:history="1">
         <w:r>
           <w:rPr>
             <w:rStyle w:val="Hyperlink"/>
@@ -1472,7 +1472,7 @@
             <w:noProof/>
             <w:webHidden/>
           </w:rPr>
-          <w:instrText xml:space="preserve"> PAGEREF _Toc240829259 \h </w:instrText>
+          <w:instrText xml:space="preserve"> PAGEREF _Toc240829753 \h </w:instrText>
         </w:r>
         <w:r>
           <w:rPr>
@@ -1516,7 +1516,7 @@
           <w14:ligatures w14:val="standardContextual"/>
         </w:rPr>
       </w:pPr>
-      <w:hyperlink w:anchor="_Toc240829260" w:history="1">
+      <w:hyperlink w:anchor="_Toc240829754" w:history="1">
         <w:r>
           <w:rPr>
             <w:rStyle w:val="Hyperlink"/>
@@ -1562,7 +1562,7 @@
             <w:noProof/>
             <w:webHidden/>
           </w:rPr>
-          <w:instrText xml:space="preserve"> PAGEREF _Toc240829260 \h </w:instrText>
+          <w:instrText xml:space="preserve"> PAGEREF _Toc240829754 \h </w:instrText>
         </w:r>
         <w:r>
           <w:rPr>
@@ -1606,7 +1606,7 @@
           <w14:ligatures w14:val="standardContextual"/>
         </w:rPr>
       </w:pPr>
-      <w:hyperlink w:anchor="_Toc240829261" w:history="1">
+      <w:hyperlink w:anchor="_Toc240829755" w:history="1">
         <w:r>
           <w:rPr>
             <w:rStyle w:val="Hyperlink"/>
@@ -1652,7 +1652,7 @@
             <w:noProof/>
             <w:webHidden/>
           </w:rPr>
-          <w:instrText xml:space="preserve"> PAGEREF _Toc240829261 \h </w:instrText>
+          <w:instrText xml:space="preserve"> PAGEREF _Toc240829755 \h </w:instrText>
         </w:r>
         <w:r>
           <w:rPr>
@@ -1696,7 +1696,7 @@
           <w14:ligatures w14:val="standardContextual"/>
         </w:rPr>
       </w:pPr>
-      <w:hyperlink w:anchor="_Toc240829262" w:history="1">
+      <w:hyperlink w:anchor="_Toc240829756" w:history="1">
         <w:r>
           <w:rPr>
             <w:rStyle w:val="Hyperlink"/>
@@ -1742,7 +1742,7 @@
             <w:noProof/>
             <w:webHidden/>
           </w:rPr>
-          <w:instrText xml:space="preserve"> PAGEREF _Toc240829262 \h </w:instrText>
+          <w:instrText xml:space="preserve"> PAGEREF _Toc240829756 \h </w:instrText>
         </w:r>
         <w:r>
           <w:rPr>
@@ -1786,7 +1786,7 @@
           <w14:ligatures w14:val="standardContextual"/>
         </w:rPr>
       </w:pPr>
-      <w:hyperlink w:anchor="_Toc240829263" w:history="1">
+      <w:hyperlink w:anchor="_Toc240829757" w:history="1">
         <w:r>
           <w:rPr>
             <w:rStyle w:val="Hyperlink"/>
@@ -1832,7 +1832,7 @@
             <w:noProof/>
             <w:webHidden/>
           </w:rPr>
-          <w:instrText xml:space="preserve"> PAGEREF _Toc240829263 \h </w:instrText>
+          <w:instrText xml:space="preserve"> PAGEREF _Toc240829757 \h </w:instrText>
         </w:r>
         <w:r>
           <w:rPr>
@@ -1876,7 +1876,7 @@
           <w14:ligatures w14:val="standardContextual"/>
         </w:rPr>
       </w:pPr>
-      <w:hyperlink w:anchor="_Toc240829264" w:history="1">
+      <w:hyperlink w:anchor="_Toc240829758" w:history="1">
         <w:r>
           <w:rPr>
             <w:rStyle w:val="Hyperlink"/>
@@ -1922,7 +1922,7 @@
             <w:noProof/>
             <w:webHidden/>
           </w:rPr>
-          <w:instrText xml:space="preserve"> PAGEREF _Toc240829264 \h </w:instrText>
+          <w:instrText xml:space="preserve"> PAGEREF _Toc240829758 \h </w:instrText>
         </w:r>
         <w:r>
           <w:rPr>
@@ -1969,7 +1969,7 @@
           <w14:ligatures w14:val="standardContextual"/>
         </w:rPr>
       </w:pPr>
-      <w:hyperlink w:anchor="_Toc240829265" w:history="1">
+      <w:hyperlink w:anchor="_Toc240829759" w:history="1">
         <w:r>
           <w:rPr>
             <w:rStyle w:val="Hyperlink"/>
@@ -2015,7 +2015,7 @@
             <w:noProof/>
             <w:webHidden/>
           </w:rPr>
-          <w:instrText xml:space="preserve"> PAGEREF _Toc240829265 \h </w:instrText>
+          <w:instrText xml:space="preserve"> PAGEREF _Toc240829759 \h </w:instrText>
         </w:r>
         <w:r>
           <w:rPr>
@@ -2062,7 +2062,7 @@
           <w14:ligatures w14:val="standardContextual"/>
         </w:rPr>
       </w:pPr>
-      <w:hyperlink w:anchor="_Toc240829266" w:history="1">
+      <w:hyperlink w:anchor="_Toc240829760" w:history="1">
         <w:r>
           <w:rPr>
             <w:rStyle w:val="Hyperlink"/>
@@ -2108,7 +2108,7 @@
             <w:noProof/>
             <w:webHidden/>
           </w:rPr>
-          <w:instrText xml:space="preserve"> PAGEREF _Toc240829266 \h </w:instrText>
+          <w:instrText xml:space="preserve"> PAGEREF _Toc240829760 \h </w:instrText>
         </w:r>
         <w:r>
           <w:rPr>
@@ -2155,7 +2155,7 @@
           <w14:ligatures w14:val="standardContextual"/>
         </w:rPr>
       </w:pPr>
-      <w:hyperlink w:anchor="_Toc240829267" w:history="1">
+      <w:hyperlink w:anchor="_Toc240829761" w:history="1">
         <w:r>
           <w:rPr>
             <w:rStyle w:val="Hyperlink"/>
@@ -2201,7 +2201,7 @@
             <w:noProof/>
             <w:webHidden/>
           </w:rPr>
-          <w:instrText xml:space="preserve"> PAGEREF _Toc240829267 \h </w:instrText>
+          <w:instrText xml:space="preserve"> PAGEREF _Toc240829761 \h </w:instrText>
         </w:r>
         <w:r>
           <w:rPr>
@@ -2248,7 +2248,7 @@
           <w14:ligatures w14:val="standardContextual"/>
         </w:rPr>
       </w:pPr>
-      <w:hyperlink w:anchor="_Toc240829268" w:history="1">
+      <w:hyperlink w:anchor="_Toc240829762" w:history="1">
         <w:r>
           <w:rPr>
             <w:rStyle w:val="Hyperlink"/>
@@ -2294,7 +2294,7 @@
             <w:noProof/>
             <w:webHidden/>
           </w:rPr>
-          <w:instrText xml:space="preserve"> PAGEREF _Toc240829268 \h </w:instrText>
+          <w:instrText xml:space="preserve"> PAGEREF _Toc240829762 \h </w:instrText>
         </w:r>
         <w:r>
           <w:rPr>
@@ -2341,7 +2341,7 @@
           <w14:ligatures w14:val="standardContextual"/>
         </w:rPr>
       </w:pPr>
-      <w:hyperlink w:anchor="_Toc240829269" w:history="1">
+      <w:hyperlink w:anchor="_Toc240829763" w:history="1">
         <w:r>
           <w:rPr>
             <w:rStyle w:val="Hyperlink"/>
@@ -2387,7 +2387,7 @@
             <w:noProof/>
             <w:webHidden/>
           </w:rPr>
-          <w:instrText xml:space="preserve"> PAGEREF _Toc240829269 \h </w:instrText>
+          <w:instrText xml:space="preserve"> PAGEREF _Toc240829763 \h </w:instrText>
         </w:r>
         <w:r>
           <w:rPr>
@@ -2459,7 +2459,7 @@
       <w:pPr>
         <w:pStyle w:val="Heading1"/>
       </w:pPr>
-      <w:bookmarkStart w:id="0" w:name="_Toc240829247"/>
+      <w:bookmarkStart w:id="0" w:name="_Toc240829741"/>
       <w:r>
         <w:t>Evaluation Mission and Test Motivation</w:t>
       </w:r>
@@ -2622,7 +2622,7 @@
       <w:pPr>
         <w:pStyle w:val="Heading1"/>
       </w:pPr>
-      <w:bookmarkStart w:id="1" w:name="_Toc240829248"/>
+      <w:bookmarkStart w:id="1" w:name="_Toc240829742"/>
       <w:r>
         <w:t>Target Test Items</w:t>
       </w:r>
@@ -3301,7 +3301,7 @@
       <w:pPr>
         <w:pStyle w:val="Heading1"/>
       </w:pPr>
-      <w:bookmarkStart w:id="2" w:name="_Toc240829249"/>
+      <w:bookmarkStart w:id="2" w:name="_Toc240829743"/>
       <w:r>
         <w:t>Test Approach</w:t>
       </w:r>
@@ -3844,7 +3844,7 @@
       <w:pPr>
         <w:pStyle w:val="Heading2"/>
       </w:pPr>
-      <w:bookmarkStart w:id="3" w:name="_Toc240829250"/>
+      <w:bookmarkStart w:id="3" w:name="_Toc240829744"/>
       <w:r>
         <w:lastRenderedPageBreak/>
         <w:t>Testing Techniques and Types</w:t>
@@ -3855,7 +3855,7 @@
       <w:pPr>
         <w:pStyle w:val="Heading3"/>
       </w:pPr>
-      <w:bookmarkStart w:id="4" w:name="_Toc240829251"/>
+      <w:bookmarkStart w:id="4" w:name="_Toc240829745"/>
       <w:r>
         <w:t>Data and Database Integrity Testing</w:t>
       </w:r>
@@ -4221,6 +4221,8 @@
       <w:r>
         <w:rPr>
           <w:rFonts w:ascii="Consolas" w:hAnsi="Consolas" w:cs="Consolas"/>
+          <w:b/>
+          <w:color w:val="1F5FA8"/>
           <w:sz w:val="15"/>
         </w:rPr>
         <w:t>$ uv run pytest tests/system/test_data_integrity.py -v   (from the full run, 8 results)</w:t>
@@ -4237,6 +4239,7 @@
       <w:r>
         <w:rPr>
           <w:rFonts w:ascii="Consolas" w:hAnsi="Consolas" w:cs="Consolas"/>
+          <w:color w:val="1B7F3B"/>
           <w:sz w:val="15"/>
         </w:rPr>
         <w:t>tests/system/test_data_integrity.py::test_an_unknown_id_is_a_clean_404[/api/app/tickets/LL-999999] PASSED [ 50%]</w:t>
@@ -4253,6 +4256,7 @@
       <w:r>
         <w:rPr>
           <w:rFonts w:ascii="Consolas" w:hAnsi="Consolas" w:cs="Consolas"/>
+          <w:color w:val="1B7F3B"/>
           <w:sz w:val="15"/>
         </w:rPr>
         <w:t>tests/system/test_data_integrity.py::test_an_unknown_id_is_a_clean_404[/api/app/orders/00000000-0000-0000-0000-000000000000] PASSED [ 52%]</w:t>
@@ -4269,6 +4273,7 @@
       <w:r>
         <w:rPr>
           <w:rFonts w:ascii="Consolas" w:hAnsi="Consolas" w:cs="Consolas"/>
+          <w:color w:val="1B7F3B"/>
           <w:sz w:val="15"/>
         </w:rPr>
         <w:t>tests/system/test_data_integrity.py::test_an_unknown_case_is_a_clean_404 PASSED [ 54%]</w:t>
@@ -4285,6 +4290,7 @@
       <w:r>
         <w:rPr>
           <w:rFonts w:ascii="Consolas" w:hAnsi="Consolas" w:cs="Consolas"/>
+          <w:color w:val="1B7F3B"/>
           <w:sz w:val="15"/>
         </w:rPr>
         <w:t>tests/system/test_data_integrity.py::test_an_empty_message_is_refused PASSED [ 56%]</w:t>
@@ -4301,6 +4307,7 @@
       <w:r>
         <w:rPr>
           <w:rFonts w:ascii="Consolas" w:hAnsi="Consolas" w:cs="Consolas"/>
+          <w:color w:val="1B7F3B"/>
           <w:sz w:val="15"/>
         </w:rPr>
         <w:t>tests/system/test_data_integrity.py::test_a_message_survives_the_round_trip PASSED [ 58%]</w:t>
@@ -4317,6 +4324,7 @@
       <w:r>
         <w:rPr>
           <w:rFonts w:ascii="Consolas" w:hAnsi="Consolas" w:cs="Consolas"/>
+          <w:color w:val="1B7F3B"/>
           <w:sz w:val="15"/>
         </w:rPr>
         <w:t>tests/system/test_data_integrity.py::test_an_attachment_keeps_its_bytes PASSED [ 60%]</w:t>
@@ -4333,6 +4341,7 @@
       <w:r>
         <w:rPr>
           <w:rFonts w:ascii="Consolas" w:hAnsi="Consolas" w:cs="Consolas"/>
+          <w:color w:val="1B7F3B"/>
           <w:sz w:val="15"/>
         </w:rPr>
         <w:t>tests/system/test_data_integrity.py::test_a_case_revision_only_moves_forward PASSED [ 62%]</w:t>
@@ -4348,6 +4357,7 @@
       <w:r>
         <w:rPr>
           <w:rFonts w:ascii="Consolas" w:hAnsi="Consolas" w:cs="Consolas"/>
+          <w:color w:val="1B7F3B"/>
           <w:sz w:val="15"/>
         </w:rPr>
         <w:t>tests/system/test_data_integrity.py::test_the_bill_adds_up PASSED        [ 64%]</w:t>
@@ -4371,7 +4381,7 @@
       <w:pPr>
         <w:pStyle w:val="Heading3"/>
       </w:pPr>
-      <w:bookmarkStart w:id="5" w:name="_Toc240829252"/>
+      <w:bookmarkStart w:id="5" w:name="_Toc240829746"/>
       <w:r>
         <w:t>Function Testing</w:t>
       </w:r>
@@ -4731,6 +4741,8 @@
       <w:r>
         <w:rPr>
           <w:rFonts w:ascii="Consolas" w:hAnsi="Consolas" w:cs="Consolas"/>
+          <w:b/>
+          <w:color w:val="1F5FA8"/>
           <w:sz w:val="15"/>
         </w:rPr>
         <w:t>$ uv run --with httpx python scripts/demo_flow.py --strict</w:t>
@@ -4747,6 +4759,7 @@
       <w:r>
         <w:rPr>
           <w:rFonts w:ascii="Consolas" w:hAnsi="Consolas" w:cs="Consolas"/>
+          <w:color w:val="242428"/>
           <w:sz w:val="15"/>
         </w:rPr>
         <w:t>1. suspend_account on SUB-100002: 422 (already suspended)</w:t>
@@ -4763,6 +4776,7 @@
       <w:r>
         <w:rPr>
           <w:rFonts w:ascii="Consolas" w:hAnsi="Consolas" w:cs="Consolas"/>
+          <w:color w:val="242428"/>
           <w:sz w:val="15"/>
         </w:rPr>
         <w:t>2. Ravi wrote in Sinhala, acknowledged in 139 ms</w:t>
@@ -4779,6 +4793,7 @@
       <w:r>
         <w:rPr>
           <w:rFonts w:ascii="Consolas" w:hAnsi="Consolas" w:cs="Consolas"/>
+          <w:color w:val="242428"/>
           <w:sz w:val="15"/>
         </w:rPr>
         <w:t>3. LL-10312 drafted (held) after 24 s:</w:t>
@@ -4795,6 +4810,7 @@
       <w:r>
         <w:rPr>
           <w:rFonts w:ascii="Consolas" w:hAnsi="Consolas" w:cs="Consolas"/>
+          <w:color w:val="242428"/>
           <w:sz w:val="15"/>
         </w:rPr>
         <w:t xml:space="preserve">   Ravi, you said the internet has been down for two days and the internet LED is blinking irregularly. Because we have not received a photo of your router, we cannot identify the exact model to give you specific wiring steps. Please attach a picture of the back of the unit so we can guide you further. Our records show an active incident on the Colombo Central feeder that has cut the fibre serving your line, and the line is currently marked as down. In addition, your account is suspended due to an unpaid ba</w:t>
@@ -4802,6 +4818,7 @@
       <w:r>
         <w:rPr>
           <w:rFonts w:ascii="Consolas" w:hAnsi="Consolas" w:cs="Consolas"/>
+          <w:color w:val="242428"/>
           <w:sz w:val="15"/>
         </w:rPr>
         <w:t>lance of LKR 18,574.40, which also prevents service from being delivered. Both issues must be resolved before the connection can be restored. Please settle the outstanding balance of LKR 18,574.40; once the payment is processed the suspension will be lifted and the service will be restored as soon as the network repair is completed.</w:t>
@@ -4818,6 +4835,7 @@
       <w:r>
         <w:rPr>
           <w:rFonts w:ascii="Consolas" w:hAnsi="Consolas" w:cs="Consolas"/>
+          <w:color w:val="242428"/>
           <w:sz w:val="15"/>
         </w:rPr>
         <w:t xml:space="preserve"> </w:t>
@@ -4834,6 +4852,7 @@
       <w:r>
         <w:rPr>
           <w:rFonts w:ascii="Consolas" w:hAnsi="Consolas" w:cs="Consolas"/>
+          <w:color w:val="242428"/>
           <w:sz w:val="15"/>
         </w:rPr>
         <w:t>Lanka Link customer support</w:t>
@@ -4850,6 +4869,7 @@
       <w:r>
         <w:rPr>
           <w:rFonts w:ascii="Consolas" w:hAnsi="Consolas" w:cs="Consolas"/>
+          <w:color w:val="242428"/>
           <w:sz w:val="15"/>
         </w:rPr>
         <w:t xml:space="preserve">   cites payment: True, cites outage: True</w:t>
@@ -4866,6 +4886,7 @@
       <w:r>
         <w:rPr>
           <w:rFonts w:ascii="Consolas" w:hAnsi="Consolas" w:cs="Consolas"/>
+          <w:color w:val="242428"/>
           <w:sz w:val="15"/>
         </w:rPr>
         <w:t>4. agent approved</w:t>
@@ -4882,6 +4903,7 @@
       <w:r>
         <w:rPr>
           <w:rFonts w:ascii="Consolas" w:hAnsi="Consolas" w:cs="Consolas"/>
+          <w:color w:val="242428"/>
           <w:sz w:val="15"/>
         </w:rPr>
         <w:t xml:space="preserve">   Ravi received after 29 s (Sinhala):</w:t>
@@ -4898,6 +4920,7 @@
       <w:r>
         <w:rPr>
           <w:rFonts w:ascii="Nirmala UI" w:hAnsi="Nirmala UI" w:cs="Nirmala UI"/>
+          <w:color w:val="242428"/>
           <w:sz w:val="15"/>
         </w:rPr>
         <w:t xml:space="preserve">   රවි, ඔයා කිව්වා ඉන්ටර්නෙට් අක්‍රිය වෙලා දවස් දෙකයි කියලා. ඉන්ටර්නේට් LED එක අක්‍රමිකව බැලුවා කියලා. අපිට ඔයාගේ රවුටරයේ ඡායාරූපයක් ලැබිලා නැති හින්දා අපිට හරියටම මොඩලය හඳුනාගන්න බැහැ. කරුණාකර ඒකකයේ පිටුපස ඡායාරූපයක් අමුණන්න එවිට අපට තව දුරටත් ඔබට මග පෙන්විය හැකිය. අපේ වාර්තා පෙන්නුම් කරනවා කොලොම්බෝ සෙන්ට් රල් ෆීඩර් එකේ ක්‍රියාකාරී සිද්ධියක් වෙලා තියෙනවා ඒකෙන් ඔයාගේ රේඛාවට සේවය කරන ෆයිබර් එක කපලා. මීට අමතරව, රුපියල් 18,574.40 ක නොගෙවූ ශේෂයක් හේතුවෙන් ඔබගේ ගිණුම අත්හිටුවන අතර එමඟින් සේවාව ලබා දීම වළක්වයි. ස</w:t>
@@ -4905,6 +4928,7 @@
       <w:r>
         <w:rPr>
           <w:rFonts w:ascii="Nirmala UI" w:hAnsi="Nirmala UI" w:cs="Nirmala UI"/>
+          <w:color w:val="242428"/>
           <w:sz w:val="15"/>
         </w:rPr>
         <w:t>ම්බන්ධතාවය යථා තත්වයට පත් කරන්න කලින් ප්‍රශ්න දෙකම විසඳිය යුතුයි. කරුණාකර රුපියල් 18,574.40 ක ශේෂය විසඳන්න; ගෙවීම සකස් කළ පසු අත්හිටුවීම ඉවත් කරනු ඇති අතර ජාල අළුත්වැඩියා කිරීම අවසන් වූ වහාම සේවාව නැවත ආරම්භ කරනු ඇත.</w:t>
@@ -4921,6 +4945,7 @@
       <w:r>
         <w:rPr>
           <w:rFonts w:ascii="Consolas" w:hAnsi="Consolas" w:cs="Consolas"/>
+          <w:color w:val="242428"/>
           <w:sz w:val="15"/>
         </w:rPr>
         <w:t xml:space="preserve"> </w:t>
@@ -4937,6 +4962,7 @@
       <w:r>
         <w:rPr>
           <w:rFonts w:ascii="Consolas" w:hAnsi="Consolas" w:cs="Consolas"/>
+          <w:color w:val="242428"/>
           <w:sz w:val="15"/>
         </w:rPr>
         <w:t>Lanka Link customer support</w:t>
@@ -4952,6 +4978,7 @@
       <w:r>
         <w:rPr>
           <w:rFonts w:ascii="Consolas" w:hAnsi="Consolas" w:cs="Consolas"/>
+          <w:color w:val="1B7F3B"/>
           <w:sz w:val="15"/>
         </w:rPr>
         <w:t>demo flow OK</w:t>
@@ -5406,6 +5433,8 @@
       <w:r>
         <w:rPr>
           <w:rFonts w:ascii="Consolas" w:hAnsi="Consolas" w:cs="Consolas"/>
+          <w:b/>
+          <w:color w:val="1F5FA8"/>
           <w:sz w:val="15"/>
         </w:rPr>
         <w:t>$ uv run --with httpx python scripts/verify_hot_swap.py</w:t>
@@ -5422,6 +5451,7 @@
       <w:r>
         <w:rPr>
           <w:rFonts w:ascii="Consolas" w:hAnsi="Consolas" w:cs="Consolas"/>
+          <w:color w:val="242428"/>
           <w:sz w:val="15"/>
         </w:rPr>
         <w:t>before: ollama:gpt-oss:120b-cloud generation 3</w:t>
@@ -5438,6 +5468,7 @@
       <w:r>
         <w:rPr>
           <w:rFonts w:ascii="Consolas" w:hAnsi="Consolas" w:cs="Consolas"/>
+          <w:color w:val="242428"/>
           <w:sz w:val="15"/>
         </w:rPr>
         <w:t>swapped: stub probes reachable in 1 ms</w:t>
@@ -5454,6 +5485,7 @@
       <w:r>
         <w:rPr>
           <w:rFonts w:ascii="Consolas" w:hAnsi="Consolas" w:cs="Consolas"/>
+          <w:color w:val="242428"/>
           <w:sz w:val="15"/>
         </w:rPr>
         <w:t>restored: ollama:gpt-oss:120b-cloud generation 5</w:t>
@@ -5469,6 +5501,7 @@
       <w:r>
         <w:rPr>
           <w:rFonts w:ascii="Consolas" w:hAnsi="Consolas" w:cs="Consolas"/>
+          <w:color w:val="1B7F3B"/>
           <w:sz w:val="15"/>
         </w:rPr>
         <w:t>hot swap OK</w:t>
@@ -5492,7 +5525,7 @@
       <w:pPr>
         <w:pStyle w:val="Heading3"/>
       </w:pPr>
-      <w:bookmarkStart w:id="6" w:name="_Toc240829253"/>
+      <w:bookmarkStart w:id="6" w:name="_Toc240829747"/>
       <w:r>
         <w:t>User Interface Testing</w:t>
       </w:r>
@@ -5846,7 +5879,7 @@
           <w:noProof/>
         </w:rPr>
         <w:drawing>
-          <wp:inline distT="0" distB="0" distL="0" distR="0" wp14:anchorId="763F72D1" wp14:editId="7B24C02C">
+          <wp:inline distT="0" distB="0" distL="0" distR="0" wp14:anchorId="663E25BC" wp14:editId="793A8991">
             <wp:extent cx="5760720" cy="2875859"/>
             <wp:effectExtent l="0" t="0" r="0" b="0"/>
             <wp:docPr id="1" name="Picture 1"/>
@@ -5906,7 +5939,7 @@
           <w:noProof/>
         </w:rPr>
         <w:drawing>
-          <wp:inline distT="0" distB="0" distL="0" distR="0" wp14:anchorId="4BED48C0" wp14:editId="690CD5D3">
+          <wp:inline distT="0" distB="0" distL="0" distR="0" wp14:anchorId="55BC6B92" wp14:editId="3877AF75">
             <wp:extent cx="5760720" cy="2875859"/>
             <wp:effectExtent l="0" t="0" r="0" b="0"/>
             <wp:docPr id="2" name="Picture 2"/>
@@ -5967,7 +6000,7 @@
         </w:rPr>
         <w:lastRenderedPageBreak/>
         <w:drawing>
-          <wp:inline distT="0" distB="0" distL="0" distR="0" wp14:anchorId="2C73E4F5" wp14:editId="752354A8">
+          <wp:inline distT="0" distB="0" distL="0" distR="0" wp14:anchorId="6292F92A" wp14:editId="3B6D9C0C">
             <wp:extent cx="5760720" cy="2875859"/>
             <wp:effectExtent l="0" t="0" r="0" b="0"/>
             <wp:docPr id="3" name="Picture 3"/>
@@ -6027,7 +6060,7 @@
           <w:noProof/>
         </w:rPr>
         <w:drawing>
-          <wp:inline distT="0" distB="0" distL="0" distR="0" wp14:anchorId="6773A013" wp14:editId="59D0DA3C">
+          <wp:inline distT="0" distB="0" distL="0" distR="0" wp14:anchorId="77083F63" wp14:editId="1274C0AA">
             <wp:extent cx="5577840" cy="3486150"/>
             <wp:effectExtent l="0" t="0" r="0" b="0"/>
             <wp:docPr id="4" name="Picture 4"/>
@@ -6088,7 +6121,7 @@
         </w:rPr>
         <w:lastRenderedPageBreak/>
         <w:drawing>
-          <wp:inline distT="0" distB="0" distL="0" distR="0" wp14:anchorId="3C5107C3" wp14:editId="0BA3A720">
+          <wp:inline distT="0" distB="0" distL="0" distR="0" wp14:anchorId="240FEB70" wp14:editId="11C7EB93">
             <wp:extent cx="5577840" cy="3486150"/>
             <wp:effectExtent l="0" t="0" r="0" b="0"/>
             <wp:docPr id="5" name="Picture 5"/>
@@ -6148,7 +6181,7 @@
           <w:noProof/>
         </w:rPr>
         <w:drawing>
-          <wp:inline distT="0" distB="0" distL="0" distR="0" wp14:anchorId="204F1D97" wp14:editId="162EEEB8">
+          <wp:inline distT="0" distB="0" distL="0" distR="0" wp14:anchorId="3DA52F9C" wp14:editId="052038E9">
             <wp:extent cx="5577840" cy="3486150"/>
             <wp:effectExtent l="0" t="0" r="0" b="0"/>
             <wp:docPr id="6" name="Picture 6"/>
@@ -6209,7 +6242,7 @@
         </w:rPr>
         <w:lastRenderedPageBreak/>
         <w:drawing>
-          <wp:inline distT="0" distB="0" distL="0" distR="0" wp14:anchorId="2188B98D" wp14:editId="15430C40">
+          <wp:inline distT="0" distB="0" distL="0" distR="0" wp14:anchorId="4033EFD4" wp14:editId="23845FCD">
             <wp:extent cx="5577840" cy="3486150"/>
             <wp:effectExtent l="0" t="0" r="0" b="0"/>
             <wp:docPr id="7" name="Picture 7"/>
@@ -6270,6 +6303,8 @@
       <w:r>
         <w:rPr>
           <w:rFonts w:ascii="Consolas" w:hAnsi="Consolas" w:cs="Consolas"/>
+          <w:b/>
+          <w:color w:val="1F5FA8"/>
           <w:sz w:val="15"/>
         </w:rPr>
         <w:t>$ bash -c cd web &amp;&amp; SHOTS_DIR='/d/DSEP22/v3/reports/2026-09-20-final/screens/mobile' PLAYWRIGHT_JUNIT_OUTPUT_NAME='/d/DSEP22/v3/reports/2026-09-20-final/junit-browser.xml' npx playwright test --reporter=list,junit</w:t>
@@ -6286,6 +6321,7 @@
       <w:r>
         <w:rPr>
           <w:rFonts w:ascii="Consolas" w:hAnsi="Consolas" w:cs="Consolas"/>
+          <w:color w:val="242428"/>
           <w:sz w:val="15"/>
         </w:rPr>
         <w:t xml:space="preserve"> </w:t>
@@ -6302,6 +6338,7 @@
       <w:r>
         <w:rPr>
           <w:rFonts w:ascii="Consolas" w:hAnsi="Consolas" w:cs="Consolas"/>
+          <w:color w:val="242428"/>
           <w:sz w:val="15"/>
         </w:rPr>
         <w:t>Running 16 tests using 4 workers</w:t>
@@ -6318,6 +6355,7 @@
       <w:r>
         <w:rPr>
           <w:rFonts w:ascii="Consolas" w:hAnsi="Consolas" w:cs="Consolas"/>
+          <w:color w:val="242428"/>
           <w:sz w:val="15"/>
         </w:rPr>
         <w:t xml:space="preserve"> </w:t>
@@ -6334,6 +6372,7 @@
       <w:r>
         <w:rPr>
           <w:rFonts w:ascii="Consolas" w:hAnsi="Consolas" w:cs="Consolas"/>
+          <w:color w:val="1B7F3B"/>
           <w:sz w:val="15"/>
         </w:rPr>
         <w:t xml:space="preserve">  ok  3 [chromium] › e2e\staff.spec.ts:5:5 › the console queue opens a case with its draft and its evidence (3.3s)</w:t>
@@ -6350,6 +6389,7 @@
       <w:r>
         <w:rPr>
           <w:rFonts w:ascii="Consolas" w:hAnsi="Consolas" w:cs="Consolas"/>
+          <w:color w:val="1B7F3B"/>
           <w:sz w:val="15"/>
         </w:rPr>
         <w:t xml:space="preserve">  ok  2 [chromium] › e2e\auth.spec.ts:5:5 › an agent lands in the console and cannot open admin or sim (3.8s)</w:t>
@@ -6366,6 +6406,7 @@
       <w:r>
         <w:rPr>
           <w:rFonts w:ascii="Consolas" w:hAnsi="Consolas" w:cs="Consolas"/>
+          <w:color w:val="1B7F3B"/>
           <w:sz w:val="15"/>
         </w:rPr>
         <w:t xml:space="preserve">  ok  1 [chromium] › e2e\customer.spec.ts:7:5 › immersion: no customer page shows back office words (12.7s)</w:t>
@@ -6382,6 +6423,7 @@
       <w:r>
         <w:rPr>
           <w:rFonts w:ascii="Consolas" w:hAnsi="Consolas" w:cs="Consolas"/>
+          <w:color w:val="1B7F3B"/>
           <w:sz w:val="15"/>
         </w:rPr>
         <w:t xml:space="preserve">  ok  7 [chromium] › e2e\customer.spec.ts:20:5 › opening a ticket is acknowledged and shows progress (1.1s)</w:t>
@@ -6398,6 +6440,7 @@
       <w:r>
         <w:rPr>
           <w:rFonts w:ascii="Consolas" w:hAnsi="Consolas" w:cs="Consolas"/>
+          <w:color w:val="1B7F3B"/>
           <w:sz w:val="15"/>
         </w:rPr>
         <w:t xml:space="preserve">  ok  4 [mobile] › e2e\mobile.spec.ts:33:5 › public pages fit a phone (15.1s)</w:t>
@@ -6414,6 +6457,7 @@
       <w:r>
         <w:rPr>
           <w:rFonts w:ascii="Consolas" w:hAnsi="Consolas" w:cs="Consolas"/>
+          <w:color w:val="1B7F3B"/>
           <w:sz w:val="15"/>
         </w:rPr>
         <w:t xml:space="preserve">  ok  5 [chromium] › e2e\staff.spec.ts:17:5 › the models map draws every stage and opens one (14.8s)</w:t>
@@ -6430,6 +6474,7 @@
       <w:r>
         <w:rPr>
           <w:rFonts w:ascii="Consolas" w:hAnsi="Consolas" w:cs="Consolas"/>
+          <w:color w:val="1B7F3B"/>
           <w:sz w:val="15"/>
         </w:rPr>
         <w:t xml:space="preserve">  ok  8 [mobile] › e2e\mobile.spec.ts:39:5 › customer pages fit a phone (16.8s)</w:t>
@@ -6446,6 +6491,7 @@
       <w:r>
         <w:rPr>
           <w:rFonts w:ascii="Consolas" w:hAnsi="Consolas" w:cs="Consolas"/>
+          <w:color w:val="1B7F3B"/>
           <w:sz w:val="15"/>
         </w:rPr>
         <w:t xml:space="preserve">  ok  9 [chromium] › e2e\staff.spec.ts:27:5 › a customer is kept out of the staff areas (14.6s)</w:t>
@@ -6462,6 +6508,7 @@
       <w:r>
         <w:rPr>
           <w:rFonts w:ascii="Consolas" w:hAnsi="Consolas" w:cs="Consolas"/>
+          <w:color w:val="1B7F3B"/>
           <w:sz w:val="15"/>
         </w:rPr>
         <w:t xml:space="preserve">  ok 11 [chromium] › e2e\staff.spec.ts:35:5 › the session survives a reload and shows on the landing page (886ms)</w:t>
@@ -6478,6 +6525,7 @@
       <w:r>
         <w:rPr>
           <w:rFonts w:ascii="Consolas" w:hAnsi="Consolas" w:cs="Consolas"/>
+          <w:color w:val="1B7F3B"/>
           <w:sz w:val="15"/>
         </w:rPr>
         <w:t xml:space="preserve">  ok 10 [mobile] › e2e\mobile.spec.ts:52:5 › console fits a phone (4.8s)</w:t>
@@ -6494,6 +6542,7 @@
       <w:r>
         <w:rPr>
           <w:rFonts w:ascii="Consolas" w:hAnsi="Consolas" w:cs="Consolas"/>
+          <w:color w:val="1B7F3B"/>
           <w:sz w:val="15"/>
         </w:rPr>
         <w:t xml:space="preserve">  ok 12 [chromium] › e2e\staff.spec.ts:43:5 › signing out ends the session (14.2s)</w:t>
@@ -6510,6 +6559,7 @@
       <w:r>
         <w:rPr>
           <w:rFonts w:ascii="Consolas" w:hAnsi="Consolas" w:cs="Consolas"/>
+          <w:color w:val="1B7F3B"/>
           <w:sz w:val="15"/>
         </w:rPr>
         <w:t xml:space="preserve">  ok  6 [chromium] › e2e\auth.spec.ts:14:5 › an operator lands in the simulation panel (49.5s)</w:t>
@@ -6526,6 +6576,7 @@
       <w:r>
         <w:rPr>
           <w:rFonts w:ascii="Consolas" w:hAnsi="Consolas" w:cs="Consolas"/>
+          <w:color w:val="1B7F3B"/>
           <w:sz w:val="15"/>
         </w:rPr>
         <w:t xml:space="preserve">  ok 14 [chromium] › e2e\auth.spec.ts:20:5 › a wrong password is refused in plain words (327ms)</w:t>
@@ -6542,6 +6593,7 @@
       <w:r>
         <w:rPr>
           <w:rFonts w:ascii="Consolas" w:hAnsi="Consolas" w:cs="Consolas"/>
+          <w:color w:val="1B7F3B"/>
           <w:sz w:val="15"/>
         </w:rPr>
         <w:t xml:space="preserve">  ok 15 [chromium] › e2e\auth.spec.ts:28:5 › sign up with email reaches onboarding (596ms)</w:t>
@@ -6558,6 +6610,7 @@
       <w:r>
         <w:rPr>
           <w:rFonts w:ascii="Consolas" w:hAnsi="Consolas" w:cs="Consolas"/>
+          <w:color w:val="1B7F3B"/>
           <w:sz w:val="15"/>
         </w:rPr>
         <w:t xml:space="preserve">  ok 13 [mobile] › e2e\mobile.spec.ts:64:5 › admin fits a phone (24.6s)</w:t>
@@ -6574,6 +6627,7 @@
       <w:r>
         <w:rPr>
           <w:rFonts w:ascii="Consolas" w:hAnsi="Consolas" w:cs="Consolas"/>
+          <w:color w:val="1B7F3B"/>
           <w:sz w:val="15"/>
         </w:rPr>
         <w:t xml:space="preserve">  ok 16 [mobile] › e2e\mobile.spec.ts:72:5 › simulation fits a phone (25.5s)</w:t>
@@ -6590,6 +6644,7 @@
       <w:r>
         <w:rPr>
           <w:rFonts w:ascii="Consolas" w:hAnsi="Consolas" w:cs="Consolas"/>
+          <w:color w:val="242428"/>
           <w:sz w:val="15"/>
         </w:rPr>
         <w:t xml:space="preserve"> </w:t>
@@ -6605,6 +6660,7 @@
       <w:r>
         <w:rPr>
           <w:rFonts w:ascii="Consolas" w:hAnsi="Consolas" w:cs="Consolas"/>
+          <w:color w:val="1B7F3B"/>
           <w:sz w:val="15"/>
         </w:rPr>
         <w:t xml:space="preserve">  16 passed (1.5m)</w:t>
@@ -6628,7 +6684,7 @@
       <w:pPr>
         <w:pStyle w:val="Heading3"/>
       </w:pPr>
-      <w:bookmarkStart w:id="7" w:name="_Toc240829254"/>
+      <w:bookmarkStart w:id="7" w:name="_Toc240829748"/>
       <w:r>
         <w:t>Performance Profiling</w:t>
       </w:r>
@@ -7675,6 +7731,8 @@
       <w:r>
         <w:rPr>
           <w:rFonts w:ascii="Consolas" w:hAnsi="Consolas" w:cs="Consolas"/>
+          <w:b/>
+          <w:color w:val="1F5FA8"/>
           <w:sz w:val="15"/>
         </w:rPr>
         <w:t>$ uv run pytest tests/system/test_performance.py -v   (from the full run, 8 results)</w:t>
@@ -7691,6 +7749,7 @@
       <w:r>
         <w:rPr>
           <w:rFonts w:ascii="Consolas" w:hAnsi="Consolas" w:cs="Consolas"/>
+          <w:color w:val="1B7F3B"/>
           <w:sz w:val="15"/>
         </w:rPr>
         <w:t>tests/system/test_performance.py::test_a_warm_account_screen_is_within_budget[/api/me-800] PASSED [ 78%]</w:t>
@@ -7707,6 +7766,7 @@
       <w:r>
         <w:rPr>
           <w:rFonts w:ascii="Consolas" w:hAnsi="Consolas" w:cs="Consolas"/>
+          <w:color w:val="1B7F3B"/>
           <w:sz w:val="15"/>
         </w:rPr>
         <w:t>tests/system/test_performance.py::test_a_warm_account_screen_is_within_budget[/api/app/overview-1500] PASSED [ 80%]</w:t>
@@ -7723,6 +7783,7 @@
       <w:r>
         <w:rPr>
           <w:rFonts w:ascii="Consolas" w:hAnsi="Consolas" w:cs="Consolas"/>
+          <w:color w:val="1B7F3B"/>
           <w:sz w:val="15"/>
         </w:rPr>
         <w:t>tests/system/test_performance.py::test_a_warm_account_screen_is_within_budget[/api/app/billing-800] PASSED [ 82%]</w:t>
@@ -7739,6 +7800,7 @@
       <w:r>
         <w:rPr>
           <w:rFonts w:ascii="Consolas" w:hAnsi="Consolas" w:cs="Consolas"/>
+          <w:color w:val="1B7F3B"/>
           <w:sz w:val="15"/>
         </w:rPr>
         <w:t>tests/system/test_performance.py::test_a_warm_account_screen_is_within_budget[/api/app/plan-800] PASSED [ 84%]</w:t>
@@ -7755,6 +7817,7 @@
       <w:r>
         <w:rPr>
           <w:rFonts w:ascii="Consolas" w:hAnsi="Consolas" w:cs="Consolas"/>
+          <w:color w:val="1B7F3B"/>
           <w:sz w:val="15"/>
         </w:rPr>
         <w:t>tests/system/test_performance.py::test_a_warm_account_screen_is_within_budget[/api/app/usage-1200] PASSED [ 86%]</w:t>
@@ -7771,6 +7834,7 @@
       <w:r>
         <w:rPr>
           <w:rFonts w:ascii="Consolas" w:hAnsi="Consolas" w:cs="Consolas"/>
+          <w:color w:val="1B7F3B"/>
           <w:sz w:val="15"/>
         </w:rPr>
         <w:t>tests/system/test_performance.py::test_a_warm_account_screen_is_within_budget[/api/app/notices-800] PASSED [ 88%]</w:t>
@@ -7787,6 +7851,7 @@
       <w:r>
         <w:rPr>
           <w:rFonts w:ascii="Consolas" w:hAnsi="Consolas" w:cs="Consolas"/>
+          <w:color w:val="1B7F3B"/>
           <w:sz w:val="15"/>
         </w:rPr>
         <w:t>tests/system/test_performance.py::test_the_acknowledgement_is_immediate PASSED [ 90%]</w:t>
@@ -7802,6 +7867,7 @@
       <w:r>
         <w:rPr>
           <w:rFonts w:ascii="Consolas" w:hAnsi="Consolas" w:cs="Consolas"/>
+          <w:color w:val="1B7F3B"/>
           <w:sz w:val="15"/>
         </w:rPr>
         <w:t>tests/system/test_performance.py::test_the_console_queue_loads_within_budget PASSED [ 92%]</w:t>
@@ -7825,7 +7891,7 @@
       <w:pPr>
         <w:pStyle w:val="Heading3"/>
       </w:pPr>
-      <w:bookmarkStart w:id="8" w:name="_Toc240829255"/>
+      <w:bookmarkStart w:id="8" w:name="_Toc240829749"/>
       <w:r>
         <w:t>Load Testing</w:t>
       </w:r>
@@ -8532,6 +8598,8 @@
       <w:r>
         <w:rPr>
           <w:rFonts w:ascii="Consolas" w:hAnsi="Consolas" w:cs="Consolas"/>
+          <w:b/>
+          <w:color w:val="1F5FA8"/>
           <w:sz w:val="15"/>
         </w:rPr>
         <w:lastRenderedPageBreak/>
@@ -8549,6 +8617,7 @@
       <w:r>
         <w:rPr>
           <w:rFonts w:ascii="Consolas" w:hAnsi="Consolas" w:cs="Consolas"/>
+          <w:color w:val="242428"/>
           <w:sz w:val="15"/>
         </w:rPr>
         <w:t xml:space="preserve"> </w:t>
@@ -8565,6 +8634,7 @@
       <w:r>
         <w:rPr>
           <w:rFonts w:ascii="Consolas" w:hAnsi="Consolas" w:cs="Consolas"/>
+          <w:color w:val="242428"/>
           <w:sz w:val="15"/>
         </w:rPr>
         <w:t xml:space="preserve">         /\      Grafana   /‾‾/</w:t>
@@ -8581,6 +8651,7 @@
       <w:r>
         <w:rPr>
           <w:rFonts w:ascii="Consolas" w:hAnsi="Consolas" w:cs="Consolas"/>
+          <w:color w:val="242428"/>
           <w:sz w:val="15"/>
         </w:rPr>
         <w:t xml:space="preserve">    /\  /  \     |\  __   /  /</w:t>
@@ -8597,6 +8668,7 @@
       <w:r>
         <w:rPr>
           <w:rFonts w:ascii="Consolas" w:hAnsi="Consolas" w:cs="Consolas"/>
+          <w:color w:val="242428"/>
           <w:sz w:val="15"/>
         </w:rPr>
         <w:t xml:space="preserve">   /  \/    \    | |/ /  /   ‾‾\</w:t>
@@ -8613,6 +8685,7 @@
       <w:r>
         <w:rPr>
           <w:rFonts w:ascii="Consolas" w:hAnsi="Consolas" w:cs="Consolas"/>
+          <w:color w:val="242428"/>
           <w:sz w:val="15"/>
         </w:rPr>
         <w:t xml:space="preserve">  /          \   |   (  |  (‾)  |</w:t>
@@ -8629,6 +8702,7 @@
       <w:r>
         <w:rPr>
           <w:rFonts w:ascii="Consolas" w:hAnsi="Consolas" w:cs="Consolas"/>
+          <w:color w:val="242428"/>
           <w:sz w:val="15"/>
         </w:rPr>
         <w:t xml:space="preserve"> / __________ \  |_|\_\  \_____/</w:t>
@@ -8645,6 +8719,7 @@
       <w:r>
         <w:rPr>
           <w:rFonts w:ascii="Consolas" w:hAnsi="Consolas" w:cs="Consolas"/>
+          <w:color w:val="242428"/>
           <w:sz w:val="15"/>
         </w:rPr>
         <w:t xml:space="preserve"> </w:t>
@@ -8661,6 +8736,7 @@
       <w:r>
         <w:rPr>
           <w:rFonts w:ascii="Consolas" w:hAnsi="Consolas" w:cs="Consolas"/>
+          <w:color w:val="242428"/>
           <w:sz w:val="15"/>
         </w:rPr>
         <w:t xml:space="preserve"> </w:t>
@@ -8677,6 +8753,7 @@
       <w:r>
         <w:rPr>
           <w:rFonts w:ascii="Consolas" w:hAnsi="Consolas" w:cs="Consolas"/>
+          <w:color w:val="242428"/>
           <w:sz w:val="15"/>
         </w:rPr>
         <w:t xml:space="preserve">     execution: local</w:t>
@@ -8693,6 +8770,7 @@
       <w:r>
         <w:rPr>
           <w:rFonts w:ascii="Consolas" w:hAnsi="Consolas" w:cs="Consolas"/>
+          <w:color w:val="242428"/>
           <w:sz w:val="15"/>
         </w:rPr>
         <w:t xml:space="preserve">        script: /work/load/ack.js</w:t>
@@ -8709,6 +8787,7 @@
       <w:r>
         <w:rPr>
           <w:rFonts w:ascii="Consolas" w:hAnsi="Consolas" w:cs="Consolas"/>
+          <w:color w:val="242428"/>
           <w:sz w:val="15"/>
         </w:rPr>
         <w:t xml:space="preserve">        output: -</w:t>
@@ -8725,6 +8804,7 @@
       <w:r>
         <w:rPr>
           <w:rFonts w:ascii="Consolas" w:hAnsi="Consolas" w:cs="Consolas"/>
+          <w:color w:val="242428"/>
           <w:sz w:val="15"/>
         </w:rPr>
         <w:t xml:space="preserve"> </w:t>
@@ -8741,6 +8821,7 @@
       <w:r>
         <w:rPr>
           <w:rFonts w:ascii="Consolas" w:hAnsi="Consolas" w:cs="Consolas"/>
+          <w:color w:val="242428"/>
           <w:sz w:val="15"/>
         </w:rPr>
         <w:t xml:space="preserve">     scenarios: (100.00%) 1 scenario, 20 max VUs, 1m30s max duration (incl. graceful stop):</w:t>
@@ -8757,6 +8838,7 @@
       <w:r>
         <w:rPr>
           <w:rFonts w:ascii="Consolas" w:hAnsi="Consolas" w:cs="Consolas"/>
+          <w:color w:val="242428"/>
           <w:sz w:val="15"/>
         </w:rPr>
         <w:t xml:space="preserve">              * chat: 5.00 iterations/s for 1m0s (maxVUs: 20, gracefulStop: 30s)</w:t>
@@ -8773,6 +8855,7 @@
       <w:r>
         <w:rPr>
           <w:rFonts w:ascii="Consolas" w:hAnsi="Consolas" w:cs="Consolas"/>
+          <w:color w:val="242428"/>
           <w:sz w:val="15"/>
         </w:rPr>
         <w:t xml:space="preserve"> </w:t>
@@ -8789,6 +8872,7 @@
       <w:r>
         <w:rPr>
           <w:rFonts w:ascii="Consolas" w:hAnsi="Consolas" w:cs="Consolas"/>
+          <w:color w:val="242428"/>
           <w:sz w:val="15"/>
         </w:rPr>
         <w:t xml:space="preserve"> </w:t>
@@ -8805,6 +8889,7 @@
       <w:r>
         <w:rPr>
           <w:rFonts w:ascii="Consolas" w:hAnsi="Consolas" w:cs="Consolas"/>
+          <w:color w:val="242428"/>
           <w:sz w:val="15"/>
         </w:rPr>
         <w:t>running (0m01.0s), 00/20 VUs, 5 complete and 0 interrupted iterations</w:t>
@@ -8821,6 +8906,7 @@
       <w:r>
         <w:rPr>
           <w:rFonts w:ascii="Consolas" w:hAnsi="Consolas" w:cs="Consolas"/>
+          <w:color w:val="242428"/>
           <w:sz w:val="15"/>
         </w:rPr>
         <w:t>chat   [   1% ] 00/20 VUs  0m00.9s/1m0s  5.00 iters/s</w:t>
@@ -8837,6 +8923,7 @@
       <w:r>
         <w:rPr>
           <w:rFonts w:ascii="Consolas" w:hAnsi="Consolas" w:cs="Consolas"/>
+          <w:color w:val="242428"/>
           <w:sz w:val="15"/>
         </w:rPr>
         <w:t xml:space="preserve"> </w:t>
@@ -8853,6 +8940,7 @@
       <w:r>
         <w:rPr>
           <w:rFonts w:ascii="Consolas" w:hAnsi="Consolas" w:cs="Consolas"/>
+          <w:color w:val="242428"/>
           <w:sz w:val="15"/>
         </w:rPr>
         <w:t>running (0m02.0s), 00/20 VUs, 10 complete and 0 interrupted iterations</w:t>
@@ -8869,6 +8957,7 @@
       <w:r>
         <w:rPr>
           <w:rFonts w:ascii="Consolas" w:hAnsi="Consolas" w:cs="Consolas"/>
+          <w:color w:val="242428"/>
           <w:sz w:val="15"/>
         </w:rPr>
         <w:t>chat   [   3% ] 00/20 VUs  0m01.9s/1m0s  5.00 iters/s</w:t>
@@ -8885,6 +8974,7 @@
       <w:r>
         <w:rPr>
           <w:rFonts w:ascii="Consolas" w:hAnsi="Consolas" w:cs="Consolas"/>
+          <w:color w:val="242428"/>
           <w:sz w:val="15"/>
         </w:rPr>
         <w:t xml:space="preserve"> </w:t>
@@ -8901,6 +8991,7 @@
       <w:r>
         <w:rPr>
           <w:rFonts w:ascii="Consolas" w:hAnsi="Consolas" w:cs="Consolas"/>
+          <w:color w:val="242428"/>
           <w:sz w:val="15"/>
         </w:rPr>
         <w:t>running (0m03.0s), 00/20 VUs, 15 complete and 0 interrupted iterations</w:t>
@@ -8917,6 +9008,7 @@
       <w:r>
         <w:rPr>
           <w:rFonts w:ascii="Consolas" w:hAnsi="Consolas" w:cs="Consolas"/>
+          <w:color w:val="242428"/>
           <w:sz w:val="15"/>
         </w:rPr>
         <w:t>chat   [   5% ] 00/20 VUs  0m02.9s/1m0s  5.00 iters/s</w:t>
@@ -8933,6 +9025,7 @@
       <w:r>
         <w:rPr>
           <w:rFonts w:ascii="Consolas" w:hAnsi="Consolas" w:cs="Consolas"/>
+          <w:color w:val="A56B00"/>
           <w:sz w:val="15"/>
         </w:rPr>
         <w:t>... 206 lines omitted ...</w:t>
@@ -8949,6 +9042,7 @@
       <w:r>
         <w:rPr>
           <w:rFonts w:ascii="Consolas" w:hAnsi="Consolas" w:cs="Consolas"/>
+          <w:color w:val="242428"/>
           <w:sz w:val="15"/>
         </w:rPr>
         <w:t xml:space="preserve">    iterations.....................: 301    5.006217/s</w:t>
@@ -8965,6 +9059,7 @@
       <w:r>
         <w:rPr>
           <w:rFonts w:ascii="Consolas" w:hAnsi="Consolas" w:cs="Consolas"/>
+          <w:color w:val="242428"/>
           <w:sz w:val="15"/>
         </w:rPr>
         <w:t xml:space="preserve">    vus............................: 0      min=0        max=1</w:t>
@@ -8981,6 +9076,7 @@
       <w:r>
         <w:rPr>
           <w:rFonts w:ascii="Consolas" w:hAnsi="Consolas" w:cs="Consolas"/>
+          <w:color w:val="242428"/>
           <w:sz w:val="15"/>
         </w:rPr>
         <w:t xml:space="preserve">    vus_max........................: 20     min=20       max=20</w:t>
@@ -8997,6 +9093,7 @@
       <w:r>
         <w:rPr>
           <w:rFonts w:ascii="Consolas" w:hAnsi="Consolas" w:cs="Consolas"/>
+          <w:color w:val="242428"/>
           <w:sz w:val="15"/>
         </w:rPr>
         <w:t xml:space="preserve"> </w:t>
@@ -9013,6 +9110,7 @@
       <w:r>
         <w:rPr>
           <w:rFonts w:ascii="Consolas" w:hAnsi="Consolas" w:cs="Consolas"/>
+          <w:color w:val="242428"/>
           <w:sz w:val="15"/>
         </w:rPr>
         <w:t xml:space="preserve">    NETWORK</w:t>
@@ -9029,6 +9127,7 @@
       <w:r>
         <w:rPr>
           <w:rFonts w:ascii="Consolas" w:hAnsi="Consolas" w:cs="Consolas"/>
+          <w:color w:val="242428"/>
           <w:sz w:val="15"/>
         </w:rPr>
         <w:t xml:space="preserve">    data_received..................: 492 kB 8.2 kB/s</w:t>
@@ -9045,6 +9144,7 @@
       <w:r>
         <w:rPr>
           <w:rFonts w:ascii="Consolas" w:hAnsi="Consolas" w:cs="Consolas"/>
+          <w:color w:val="242428"/>
           <w:sz w:val="15"/>
         </w:rPr>
         <w:t xml:space="preserve">    data_sent......................: 378 kB 6.3 kB/s</w:t>
@@ -9061,6 +9161,7 @@
       <w:r>
         <w:rPr>
           <w:rFonts w:ascii="Consolas" w:hAnsi="Consolas" w:cs="Consolas"/>
+          <w:color w:val="242428"/>
           <w:sz w:val="15"/>
         </w:rPr>
         <w:t xml:space="preserve"> </w:t>
@@ -9077,6 +9178,7 @@
       <w:r>
         <w:rPr>
           <w:rFonts w:ascii="Consolas" w:hAnsi="Consolas" w:cs="Consolas"/>
+          <w:color w:val="242428"/>
           <w:sz w:val="15"/>
         </w:rPr>
         <w:t xml:space="preserve"> </w:t>
@@ -9093,6 +9195,7 @@
       <w:r>
         <w:rPr>
           <w:rFonts w:ascii="Consolas" w:hAnsi="Consolas" w:cs="Consolas"/>
+          <w:color w:val="242428"/>
           <w:sz w:val="15"/>
         </w:rPr>
         <w:t xml:space="preserve"> </w:t>
@@ -9109,6 +9212,7 @@
       <w:r>
         <w:rPr>
           <w:rFonts w:ascii="Consolas" w:hAnsi="Consolas" w:cs="Consolas"/>
+          <w:color w:val="242428"/>
           <w:sz w:val="15"/>
         </w:rPr>
         <w:t xml:space="preserve"> </w:t>
@@ -9125,6 +9229,7 @@
       <w:r>
         <w:rPr>
           <w:rFonts w:ascii="Consolas" w:hAnsi="Consolas" w:cs="Consolas"/>
+          <w:color w:val="242428"/>
           <w:sz w:val="15"/>
         </w:rPr>
         <w:t>running (1m00.1s), 00/20 VUs, 301 complete and 0 interrupted iterations</w:t>
@@ -9140,6 +9245,7 @@
       <w:r>
         <w:rPr>
           <w:rFonts w:ascii="Consolas" w:hAnsi="Consolas" w:cs="Consolas"/>
+          <w:color w:val="1B7F3B"/>
           <w:sz w:val="15"/>
         </w:rPr>
         <w:t>chat ✓ [ 100% ] 00/20 VUs  1m0s  5.00 iters/s</w:t>
@@ -9526,6 +9632,7 @@
       <w:r>
         <w:rPr>
           <w:rFonts w:ascii="Consolas" w:hAnsi="Consolas" w:cs="Consolas"/>
+          <w:color w:val="242428"/>
           <w:sz w:val="15"/>
         </w:rPr>
         <w:lastRenderedPageBreak/>
@@ -9543,6 +9650,7 @@
       <w:r>
         <w:rPr>
           <w:rFonts w:ascii="Consolas" w:hAnsi="Consolas" w:cs="Consolas"/>
+          <w:color w:val="242428"/>
           <w:sz w:val="15"/>
         </w:rPr>
         <w:t xml:space="preserve">         /\      Grafana   /‾‾/</w:t>
@@ -9559,6 +9667,7 @@
       <w:r>
         <w:rPr>
           <w:rFonts w:ascii="Consolas" w:hAnsi="Consolas" w:cs="Consolas"/>
+          <w:color w:val="242428"/>
           <w:sz w:val="15"/>
         </w:rPr>
         <w:t xml:space="preserve">    /\  /  \     |\  __   /  /</w:t>
@@ -9575,6 +9684,7 @@
       <w:r>
         <w:rPr>
           <w:rFonts w:ascii="Consolas" w:hAnsi="Consolas" w:cs="Consolas"/>
+          <w:color w:val="242428"/>
           <w:sz w:val="15"/>
         </w:rPr>
         <w:t xml:space="preserve">   /  \/    \    | |/ /  /   ‾‾\</w:t>
@@ -9591,6 +9701,7 @@
       <w:r>
         <w:rPr>
           <w:rFonts w:ascii="Consolas" w:hAnsi="Consolas" w:cs="Consolas"/>
+          <w:color w:val="242428"/>
           <w:sz w:val="15"/>
         </w:rPr>
         <w:t xml:space="preserve">  /          \   |   (  |  (‾)  |</w:t>
@@ -9607,6 +9718,7 @@
       <w:r>
         <w:rPr>
           <w:rFonts w:ascii="Consolas" w:hAnsi="Consolas" w:cs="Consolas"/>
+          <w:color w:val="242428"/>
           <w:sz w:val="15"/>
         </w:rPr>
         <w:t xml:space="preserve"> / __________ \  |_|\_\  \_____/</w:t>
@@ -9623,6 +9735,7 @@
       <w:r>
         <w:rPr>
           <w:rFonts w:ascii="Consolas" w:hAnsi="Consolas" w:cs="Consolas"/>
+          <w:color w:val="242428"/>
           <w:sz w:val="15"/>
         </w:rPr>
         <w:t xml:space="preserve"> </w:t>
@@ -9639,6 +9752,7 @@
       <w:r>
         <w:rPr>
           <w:rFonts w:ascii="Consolas" w:hAnsi="Consolas" w:cs="Consolas"/>
+          <w:color w:val="242428"/>
           <w:sz w:val="15"/>
         </w:rPr>
         <w:t xml:space="preserve"> </w:t>
@@ -9655,6 +9769,7 @@
       <w:r>
         <w:rPr>
           <w:rFonts w:ascii="Consolas" w:hAnsi="Consolas" w:cs="Consolas"/>
+          <w:color w:val="242428"/>
           <w:sz w:val="15"/>
         </w:rPr>
         <w:t xml:space="preserve">     execution: local</w:t>
@@ -9671,6 +9786,7 @@
       <w:r>
         <w:rPr>
           <w:rFonts w:ascii="Consolas" w:hAnsi="Consolas" w:cs="Consolas"/>
+          <w:color w:val="242428"/>
           <w:sz w:val="15"/>
         </w:rPr>
         <w:t xml:space="preserve">        script: /work/load/browse.js</w:t>
@@ -9687,6 +9803,7 @@
       <w:r>
         <w:rPr>
           <w:rFonts w:ascii="Consolas" w:hAnsi="Consolas" w:cs="Consolas"/>
+          <w:color w:val="242428"/>
           <w:sz w:val="15"/>
         </w:rPr>
         <w:t xml:space="preserve">        output: -</w:t>
@@ -9703,6 +9820,7 @@
       <w:r>
         <w:rPr>
           <w:rFonts w:ascii="Consolas" w:hAnsi="Consolas" w:cs="Consolas"/>
+          <w:color w:val="242428"/>
           <w:sz w:val="15"/>
         </w:rPr>
         <w:t xml:space="preserve"> </w:t>
@@ -9719,6 +9837,7 @@
       <w:r>
         <w:rPr>
           <w:rFonts w:ascii="Consolas" w:hAnsi="Consolas" w:cs="Consolas"/>
+          <w:color w:val="242428"/>
           <w:sz w:val="15"/>
         </w:rPr>
         <w:t xml:space="preserve">     scenarios: (100.00%) 1 scenario, 20 max VUs, 5m30s max duration (incl. graceful stop):</w:t>
@@ -9735,6 +9854,7 @@
       <w:r>
         <w:rPr>
           <w:rFonts w:ascii="Consolas" w:hAnsi="Consolas" w:cs="Consolas"/>
+          <w:color w:val="242428"/>
           <w:sz w:val="15"/>
         </w:rPr>
         <w:t xml:space="preserve">              * browse: Up to 20 looping VUs for 5m0s over 3 stages (gracefulRampDown: 30s, gracefulStop: 30s)</w:t>
@@ -9751,6 +9871,7 @@
       <w:r>
         <w:rPr>
           <w:rFonts w:ascii="Consolas" w:hAnsi="Consolas" w:cs="Consolas"/>
+          <w:color w:val="242428"/>
           <w:sz w:val="15"/>
         </w:rPr>
         <w:t xml:space="preserve"> </w:t>
@@ -9767,6 +9888,7 @@
       <w:r>
         <w:rPr>
           <w:rFonts w:ascii="Consolas" w:hAnsi="Consolas" w:cs="Consolas"/>
+          <w:color w:val="242428"/>
           <w:sz w:val="15"/>
         </w:rPr>
         <w:t xml:space="preserve"> </w:t>
@@ -9783,6 +9905,7 @@
       <w:r>
         <w:rPr>
           <w:rFonts w:ascii="Consolas" w:hAnsi="Consolas" w:cs="Consolas"/>
+          <w:color w:val="242428"/>
           <w:sz w:val="15"/>
         </w:rPr>
         <w:t>running (0m01.0s), 01/20 VUs, 0 complete and 0 interrupted iterations</w:t>
@@ -9799,6 +9922,7 @@
       <w:r>
         <w:rPr>
           <w:rFonts w:ascii="Consolas" w:hAnsi="Consolas" w:cs="Consolas"/>
+          <w:color w:val="242428"/>
           <w:sz w:val="15"/>
         </w:rPr>
         <w:t>browse   [   0% ] 01/20 VUs  0m00.1s/5m00.0s</w:t>
@@ -9815,6 +9939,7 @@
       <w:r>
         <w:rPr>
           <w:rFonts w:ascii="Consolas" w:hAnsi="Consolas" w:cs="Consolas"/>
+          <w:color w:val="242428"/>
           <w:sz w:val="15"/>
         </w:rPr>
         <w:t xml:space="preserve"> </w:t>
@@ -9831,6 +9956,7 @@
       <w:r>
         <w:rPr>
           <w:rFonts w:ascii="Consolas" w:hAnsi="Consolas" w:cs="Consolas"/>
+          <w:color w:val="242428"/>
           <w:sz w:val="15"/>
         </w:rPr>
         <w:t>running (0m02.0s), 01/20 VUs, 0 complete and 0 interrupted iterations</w:t>
@@ -9847,6 +9973,7 @@
       <w:r>
         <w:rPr>
           <w:rFonts w:ascii="Consolas" w:hAnsi="Consolas" w:cs="Consolas"/>
+          <w:color w:val="242428"/>
           <w:sz w:val="15"/>
         </w:rPr>
         <w:t>browse   [   0% ] 01/20 VUs  0m01.1s/5m00.0s</w:t>
@@ -9863,6 +9990,7 @@
       <w:r>
         <w:rPr>
           <w:rFonts w:ascii="Consolas" w:hAnsi="Consolas" w:cs="Consolas"/>
+          <w:color w:val="242428"/>
           <w:sz w:val="15"/>
         </w:rPr>
         <w:t xml:space="preserve"> </w:t>
@@ -9879,6 +10007,7 @@
       <w:r>
         <w:rPr>
           <w:rFonts w:ascii="Consolas" w:hAnsi="Consolas" w:cs="Consolas"/>
+          <w:color w:val="242428"/>
           <w:sz w:val="15"/>
         </w:rPr>
         <w:t>running (0m03.0s), 01/20 VUs, 0 complete and 0 interrupted iterations</w:t>
@@ -9895,6 +10024,7 @@
       <w:r>
         <w:rPr>
           <w:rFonts w:ascii="Consolas" w:hAnsi="Consolas" w:cs="Consolas"/>
+          <w:color w:val="242428"/>
           <w:sz w:val="15"/>
         </w:rPr>
         <w:t>browse   [   1% ] 01/20 VUs  0m02.1s/5m00.0s</w:t>
@@ -9911,6 +10041,7 @@
       <w:r>
         <w:rPr>
           <w:rFonts w:ascii="Consolas" w:hAnsi="Consolas" w:cs="Consolas"/>
+          <w:color w:val="242428"/>
           <w:sz w:val="15"/>
         </w:rPr>
         <w:t xml:space="preserve"> </w:t>
@@ -9927,6 +10058,7 @@
       <w:r>
         <w:rPr>
           <w:rFonts w:ascii="Consolas" w:hAnsi="Consolas" w:cs="Consolas"/>
+          <w:color w:val="A56B00"/>
           <w:sz w:val="15"/>
         </w:rPr>
         <w:t>... 940 lines omitted ...</w:t>
@@ -9943,6 +10075,7 @@
       <w:r>
         <w:rPr>
           <w:rFonts w:ascii="Consolas" w:hAnsi="Consolas" w:cs="Consolas"/>
+          <w:color w:val="242428"/>
           <w:sz w:val="15"/>
         </w:rPr>
         <w:t xml:space="preserve">    iterations.....................: 891    2.927195/s</w:t>
@@ -9959,6 +10092,7 @@
       <w:r>
         <w:rPr>
           <w:rFonts w:ascii="Consolas" w:hAnsi="Consolas" w:cs="Consolas"/>
+          <w:color w:val="242428"/>
           <w:sz w:val="15"/>
         </w:rPr>
         <w:t xml:space="preserve">    vus............................: 1      min=1         max=20</w:t>
@@ -9975,6 +10109,7 @@
       <w:r>
         <w:rPr>
           <w:rFonts w:ascii="Consolas" w:hAnsi="Consolas" w:cs="Consolas"/>
+          <w:color w:val="242428"/>
           <w:sz w:val="15"/>
         </w:rPr>
         <w:t xml:space="preserve">    vus_max........................: 20     min=20        max=20</w:t>
@@ -9991,6 +10126,7 @@
       <w:r>
         <w:rPr>
           <w:rFonts w:ascii="Consolas" w:hAnsi="Consolas" w:cs="Consolas"/>
+          <w:color w:val="242428"/>
           <w:sz w:val="15"/>
         </w:rPr>
         <w:t xml:space="preserve"> </w:t>
@@ -10007,6 +10143,7 @@
       <w:r>
         <w:rPr>
           <w:rFonts w:ascii="Consolas" w:hAnsi="Consolas" w:cs="Consolas"/>
+          <w:color w:val="242428"/>
           <w:sz w:val="15"/>
         </w:rPr>
         <w:t xml:space="preserve">    NETWORK</w:t>
@@ -10023,6 +10160,7 @@
       <w:r>
         <w:rPr>
           <w:rFonts w:ascii="Consolas" w:hAnsi="Consolas" w:cs="Consolas"/>
+          <w:color w:val="242428"/>
           <w:sz w:val="15"/>
         </w:rPr>
         <w:t xml:space="preserve">    data_received..................: 160 MB 527 kB/s</w:t>
@@ -10039,6 +10177,7 @@
       <w:r>
         <w:rPr>
           <w:rFonts w:ascii="Consolas" w:hAnsi="Consolas" w:cs="Consolas"/>
+          <w:color w:val="242428"/>
           <w:sz w:val="15"/>
         </w:rPr>
         <w:t xml:space="preserve">    data_sent......................: 749 kB 2.5 kB/s</w:t>
@@ -10055,6 +10194,7 @@
       <w:r>
         <w:rPr>
           <w:rFonts w:ascii="Consolas" w:hAnsi="Consolas" w:cs="Consolas"/>
+          <w:color w:val="242428"/>
           <w:sz w:val="15"/>
         </w:rPr>
         <w:t xml:space="preserve"> </w:t>
@@ -10071,6 +10211,7 @@
       <w:r>
         <w:rPr>
           <w:rFonts w:ascii="Consolas" w:hAnsi="Consolas" w:cs="Consolas"/>
+          <w:color w:val="242428"/>
           <w:sz w:val="15"/>
         </w:rPr>
         <w:t xml:space="preserve"> </w:t>
@@ -10087,6 +10228,7 @@
       <w:r>
         <w:rPr>
           <w:rFonts w:ascii="Consolas" w:hAnsi="Consolas" w:cs="Consolas"/>
+          <w:color w:val="242428"/>
           <w:sz w:val="15"/>
         </w:rPr>
         <w:t xml:space="preserve"> </w:t>
@@ -10103,6 +10245,7 @@
       <w:r>
         <w:rPr>
           <w:rFonts w:ascii="Consolas" w:hAnsi="Consolas" w:cs="Consolas"/>
+          <w:color w:val="242428"/>
           <w:sz w:val="15"/>
         </w:rPr>
         <w:t xml:space="preserve"> </w:t>
@@ -10119,6 +10262,7 @@
       <w:r>
         <w:rPr>
           <w:rFonts w:ascii="Consolas" w:hAnsi="Consolas" w:cs="Consolas"/>
+          <w:color w:val="242428"/>
           <w:sz w:val="15"/>
         </w:rPr>
         <w:t>running (5m04.4s), 00/20 VUs, 891 complete and 0 interrupted iterations</w:t>
@@ -10134,6 +10278,7 @@
       <w:r>
         <w:rPr>
           <w:rFonts w:ascii="Consolas" w:hAnsi="Consolas" w:cs="Consolas"/>
+          <w:color w:val="1B7F3B"/>
           <w:sz w:val="15"/>
         </w:rPr>
         <w:t>browse ✓ [ 100% ] 00/20 VUs  5m0s</w:t>
@@ -10165,7 +10310,7 @@
       <w:pPr>
         <w:pStyle w:val="Heading3"/>
       </w:pPr>
-      <w:bookmarkStart w:id="9" w:name="_Toc240829256"/>
+      <w:bookmarkStart w:id="9" w:name="_Toc240829750"/>
       <w:r>
         <w:t>Security and Access Control Testing</w:t>
       </w:r>
@@ -10522,6 +10667,8 @@
       <w:r>
         <w:rPr>
           <w:rFonts w:ascii="Consolas" w:hAnsi="Consolas" w:cs="Consolas"/>
+          <w:b/>
+          <w:color w:val="1F5FA8"/>
           <w:sz w:val="15"/>
         </w:rPr>
         <w:t>$ uv run pytest tests/system/test_access_control.py -v   (from the full run, 15 results)</w:t>
@@ -10538,6 +10685,7 @@
       <w:r>
         <w:rPr>
           <w:rFonts w:ascii="Consolas" w:hAnsi="Consolas" w:cs="Consolas"/>
+          <w:color w:val="1B7F3B"/>
           <w:sz w:val="15"/>
         </w:rPr>
         <w:t>tests/system/test_access_control.py::test_no_token_is_rejected[/api/me] PASSED [  1%]</w:t>
@@ -10554,6 +10702,7 @@
       <w:r>
         <w:rPr>
           <w:rFonts w:ascii="Consolas" w:hAnsi="Consolas" w:cs="Consolas"/>
+          <w:color w:val="1B7F3B"/>
           <w:sz w:val="15"/>
         </w:rPr>
         <w:t>tests/system/test_access_control.py::test_no_token_is_rejected[/api/app/billing] PASSED [  3%]</w:t>
@@ -10570,6 +10719,7 @@
       <w:r>
         <w:rPr>
           <w:rFonts w:ascii="Consolas" w:hAnsi="Consolas" w:cs="Consolas"/>
+          <w:color w:val="1B7F3B"/>
           <w:sz w:val="15"/>
         </w:rPr>
         <w:t>tests/system/test_access_control.py::test_no_token_is_rejected[/api/console/cases] PASSED [  5%]</w:t>
@@ -10586,6 +10736,7 @@
       <w:r>
         <w:rPr>
           <w:rFonts w:ascii="Consolas" w:hAnsi="Consolas" w:cs="Consolas"/>
+          <w:color w:val="1B7F3B"/>
           <w:sz w:val="15"/>
         </w:rPr>
         <w:t>tests/system/test_access_control.py::test_no_token_is_rejected[/api/admin/models] PASSED [  7%]</w:t>
@@ -10602,6 +10753,7 @@
       <w:r>
         <w:rPr>
           <w:rFonts w:ascii="Consolas" w:hAnsi="Consolas" w:cs="Consolas"/>
+          <w:color w:val="1B7F3B"/>
           <w:sz w:val="15"/>
         </w:rPr>
         <w:t>tests/system/test_access_control.py::test_a_customer_cannot_reach_staff_surfaces[/api/console/cases] PASSED [  9%]</w:t>
@@ -10618,6 +10770,7 @@
       <w:r>
         <w:rPr>
           <w:rFonts w:ascii="Consolas" w:hAnsi="Consolas" w:cs="Consolas"/>
+          <w:color w:val="1B7F3B"/>
           <w:sz w:val="15"/>
         </w:rPr>
         <w:t>tests/system/test_access_control.py::test_a_customer_cannot_reach_staff_surfaces[/api/console/ping] PASSED [ 11%]</w:t>
@@ -10634,6 +10787,7 @@
       <w:r>
         <w:rPr>
           <w:rFonts w:ascii="Consolas" w:hAnsi="Consolas" w:cs="Consolas"/>
+          <w:color w:val="1B7F3B"/>
           <w:sz w:val="15"/>
         </w:rPr>
         <w:t>tests/system/test_access_control.py::test_a_customer_cannot_reach_staff_surfaces[/api/admin/models] PASSED [ 13%]</w:t>
@@ -10650,6 +10804,7 @@
       <w:r>
         <w:rPr>
           <w:rFonts w:ascii="Consolas" w:hAnsi="Consolas" w:cs="Consolas"/>
+          <w:color w:val="1B7F3B"/>
           <w:sz w:val="15"/>
         </w:rPr>
         <w:t>tests/system/test_access_control.py::test_a_customer_cannot_reach_staff_surfaces[/api/lab/requests] PASSED [ 15%]</w:t>
@@ -10666,6 +10821,7 @@
       <w:r>
         <w:rPr>
           <w:rFonts w:ascii="Consolas" w:hAnsi="Consolas" w:cs="Consolas"/>
+          <w:color w:val="1B7F3B"/>
           <w:sz w:val="15"/>
         </w:rPr>
         <w:t>tests/system/test_access_control.py::test_an_agent_cannot_reach_admin_surfaces[/api/admin/models] PASSED [ 17%]</w:t>
@@ -10682,6 +10838,7 @@
       <w:r>
         <w:rPr>
           <w:rFonts w:ascii="Consolas" w:hAnsi="Consolas" w:cs="Consolas"/>
+          <w:color w:val="1B7F3B"/>
           <w:sz w:val="15"/>
         </w:rPr>
         <w:t>tests/system/test_access_control.py::test_an_agent_cannot_reach_admin_surfaces[/api/admin/traces] PASSED [ 19%]</w:t>
@@ -10698,6 +10855,7 @@
       <w:r>
         <w:rPr>
           <w:rFonts w:ascii="Consolas" w:hAnsi="Consolas" w:cs="Consolas"/>
+          <w:color w:val="1B7F3B"/>
           <w:sz w:val="15"/>
         </w:rPr>
         <w:t>tests/system/test_access_control.py::test_an_agent_cannot_reach_admin_surfaces[/api/lab/requests] PASSED [ 21%]</w:t>
@@ -10714,6 +10872,7 @@
       <w:r>
         <w:rPr>
           <w:rFonts w:ascii="Consolas" w:hAnsi="Consolas" w:cs="Consolas"/>
+          <w:color w:val="1B7F3B"/>
           <w:sz w:val="15"/>
         </w:rPr>
         <w:t>tests/system/test_access_control.py::test_each_role_reaches_its_own_surface PASSED [ 23%]</w:t>
@@ -10730,6 +10889,7 @@
       <w:r>
         <w:rPr>
           <w:rFonts w:ascii="Consolas" w:hAnsi="Consolas" w:cs="Consolas"/>
+          <w:color w:val="1B7F3B"/>
           <w:sz w:val="15"/>
         </w:rPr>
         <w:t>tests/system/test_access_control.py::test_a_customer_cannot_read_another_customers_ticket PASSED [ 25%]</w:t>
@@ -10746,6 +10906,7 @@
       <w:r>
         <w:rPr>
           <w:rFonts w:ascii="Consolas" w:hAnsi="Consolas" w:cs="Consolas"/>
+          <w:color w:val="1B7F3B"/>
           <w:sz w:val="15"/>
         </w:rPr>
         <w:t>tests/system/test_access_control.py::test_a_tampered_token_is_rejected PASSED [ 27%]</w:t>
@@ -10761,6 +10922,7 @@
       <w:r>
         <w:rPr>
           <w:rFonts w:ascii="Consolas" w:hAnsi="Consolas" w:cs="Consolas"/>
+          <w:color w:val="1B7F3B"/>
           <w:sz w:val="15"/>
         </w:rPr>
         <w:t>tests/system/test_access_control.py::test_sign_in_rejects_a_wrong_password PASSED [ 29%]</w:t>
@@ -10784,7 +10946,7 @@
       <w:pPr>
         <w:pStyle w:val="Heading3"/>
       </w:pPr>
-      <w:bookmarkStart w:id="10" w:name="_Toc240829257"/>
+      <w:bookmarkStart w:id="10" w:name="_Toc240829751"/>
       <w:r>
         <w:t>Failover and Recovery Testing</w:t>
       </w:r>
@@ -11121,6 +11283,8 @@
       <w:r>
         <w:rPr>
           <w:rFonts w:ascii="Consolas" w:hAnsi="Consolas" w:cs="Consolas"/>
+          <w:b/>
+          <w:color w:val="1F5FA8"/>
           <w:sz w:val="15"/>
         </w:rPr>
         <w:t>$ uv run pytest tests/system/test_resilience.py -v   (from the full run, 4 results)</w:t>
@@ -11137,6 +11301,7 @@
       <w:r>
         <w:rPr>
           <w:rFonts w:ascii="Consolas" w:hAnsi="Consolas" w:cs="Consolas"/>
+          <w:color w:val="1B7F3B"/>
           <w:sz w:val="15"/>
         </w:rPr>
         <w:t>tests/system/test_resilience.py::test_a_dead_translation_service_still_answers_the_customer PASSED [ 94%]</w:t>
@@ -11153,6 +11318,7 @@
       <w:r>
         <w:rPr>
           <w:rFonts w:ascii="Consolas" w:hAnsi="Consolas" w:cs="Consolas"/>
+          <w:color w:val="1B7F3B"/>
           <w:sz w:val="15"/>
         </w:rPr>
         <w:t>tests/system/test_resilience.py::test_a_dead_audio_service_does_not_lose_the_ticket PASSED [ 96%]</w:t>
@@ -11169,6 +11335,7 @@
       <w:r>
         <w:rPr>
           <w:rFonts w:ascii="Consolas" w:hAnsi="Consolas" w:cs="Consolas"/>
+          <w:color w:val="1B7F3B"/>
           <w:sz w:val="15"/>
         </w:rPr>
         <w:t>tests/system/test_resilience.py::test_the_edge_reports_a_stopped_dependency PASSED [ 98%]</w:t>
@@ -11184,6 +11351,7 @@
       <w:r>
         <w:rPr>
           <w:rFonts w:ascii="Consolas" w:hAnsi="Consolas" w:cs="Consolas"/>
+          <w:color w:val="1B7F3B"/>
           <w:sz w:val="15"/>
         </w:rPr>
         <w:t>tests/system/test_resilience.py::test_a_restarted_service_is_healthy_again PASSED [100%]</w:t>
@@ -11207,7 +11375,7 @@
       <w:pPr>
         <w:pStyle w:val="Heading3"/>
       </w:pPr>
-      <w:bookmarkStart w:id="11" w:name="_Toc240829258"/>
+      <w:bookmarkStart w:id="11" w:name="_Toc240829752"/>
       <w:r>
         <w:t>Configuration Testing</w:t>
       </w:r>
@@ -11550,6 +11718,8 @@
       <w:r>
         <w:rPr>
           <w:rFonts w:ascii="Consolas" w:hAnsi="Consolas" w:cs="Consolas"/>
+          <w:b/>
+          <w:color w:val="1F5FA8"/>
           <w:sz w:val="15"/>
         </w:rPr>
         <w:lastRenderedPageBreak/>
@@ -11567,6 +11737,7 @@
       <w:r>
         <w:rPr>
           <w:rFonts w:ascii="Consolas" w:hAnsi="Consolas" w:cs="Consolas"/>
+          <w:color w:val="1B7F3B"/>
           <w:sz w:val="15"/>
         </w:rPr>
         <w:t>tests/system/test_configuration.py::test_the_compose_file_is_valid[yaml] PASSED [ 31%]</w:t>
@@ -11583,6 +11754,7 @@
       <w:r>
         <w:rPr>
           <w:rFonts w:ascii="Consolas" w:hAnsi="Consolas" w:cs="Consolas"/>
+          <w:color w:val="1B7F3B"/>
           <w:sz w:val="15"/>
         </w:rPr>
         <w:t>tests/system/test_configuration.py::test_the_compose_file_is_valid[yaml+lite] PASSED [ 33%]</w:t>
@@ -11599,6 +11771,7 @@
       <w:r>
         <w:rPr>
           <w:rFonts w:ascii="Consolas" w:hAnsi="Consolas" w:cs="Consolas"/>
+          <w:color w:val="1B7F3B"/>
           <w:sz w:val="15"/>
         </w:rPr>
         <w:t>tests/system/test_configuration.py::test_the_compose_file_is_valid[yaml+ci] PASSED [ 35%]</w:t>
@@ -11615,6 +11788,7 @@
       <w:r>
         <w:rPr>
           <w:rFonts w:ascii="Consolas" w:hAnsi="Consolas" w:cs="Consolas"/>
+          <w:color w:val="1B7F3B"/>
           <w:sz w:val="15"/>
         </w:rPr>
         <w:t>tests/system/test_configuration.py::test_the_compose_file_is_valid[yaml+gpu] PASSED [ 37%]</w:t>
@@ -11631,6 +11805,7 @@
       <w:r>
         <w:rPr>
           <w:rFonts w:ascii="Consolas" w:hAnsi="Consolas" w:cs="Consolas"/>
+          <w:color w:val="1B7F3B"/>
           <w:sz w:val="15"/>
         </w:rPr>
         <w:t>tests/system/test_configuration.py::test_the_compose_file_is_valid[yaml+prod] PASSED [ 39%]</w:t>
@@ -11647,6 +11822,7 @@
       <w:r>
         <w:rPr>
           <w:rFonts w:ascii="Consolas" w:hAnsi="Consolas" w:cs="Consolas"/>
+          <w:color w:val="1B7F3B"/>
           <w:sz w:val="15"/>
         </w:rPr>
         <w:t>tests/system/test_configuration.py::test_the_compose_file_is_valid[yaml+test] PASSED [ 41%]</w:t>
@@ -11663,6 +11839,7 @@
       <w:r>
         <w:rPr>
           <w:rFonts w:ascii="Consolas" w:hAnsi="Consolas" w:cs="Consolas"/>
+          <w:color w:val="1B7F3B"/>
           <w:sz w:val="15"/>
         </w:rPr>
         <w:t>tests/system/test_configuration.py::test_the_compose_file_is_valid[yaml+ci+test] PASSED [ 43%]</w:t>
@@ -11679,6 +11856,7 @@
       <w:r>
         <w:rPr>
           <w:rFonts w:ascii="Consolas" w:hAnsi="Consolas" w:cs="Consolas"/>
+          <w:color w:val="1B7F3B"/>
           <w:sz w:val="15"/>
         </w:rPr>
         <w:t>tests/system/test_configuration.py::test_the_compose_file_is_valid[yaml+prod+monitoring] PASSED [ 45%]</w:t>
@@ -11695,6 +11873,7 @@
       <w:r>
         <w:rPr>
           <w:rFonts w:ascii="Consolas" w:hAnsi="Consolas" w:cs="Consolas"/>
+          <w:color w:val="1B7F3B"/>
           <w:sz w:val="15"/>
         </w:rPr>
         <w:t>tests/system/test_configuration.py::test_the_mlops_profile_adds_airflow_and_mlflow PASSED [ 47%]</w:t>
@@ -11710,6 +11889,7 @@
       <w:r>
         <w:rPr>
           <w:rFonts w:ascii="Consolas" w:hAnsi="Consolas" w:cs="Consolas"/>
+          <w:color w:val="1B7F3B"/>
           <w:sz w:val="15"/>
         </w:rPr>
         <w:t>tests/system/test_configuration.py::test_every_variable_the_compose_file_reads_is_in_the_example PASSED [ 49%]</w:t>
@@ -11733,7 +11913,7 @@
       <w:pPr>
         <w:pStyle w:val="Heading2"/>
       </w:pPr>
-      <w:bookmarkStart w:id="12" w:name="_Toc240829259"/>
+      <w:bookmarkStart w:id="12" w:name="_Toc240829753"/>
       <w:r>
         <w:t>Model Selection and Evaluation</w:t>
       </w:r>
@@ -12190,7 +12370,7 @@
       <w:pPr>
         <w:pStyle w:val="Heading3"/>
       </w:pPr>
-      <w:bookmarkStart w:id="13" w:name="_Toc240829260"/>
+      <w:bookmarkStart w:id="13" w:name="_Toc240829754"/>
       <w:r>
         <w:t>Intent and Department Classification</w:t>
       </w:r>
@@ -12977,7 +13157,7 @@
           <w:noProof/>
         </w:rPr>
         <w:drawing>
-          <wp:inline distT="0" distB="0" distL="0" distR="0" wp14:anchorId="4839A54D" wp14:editId="668761B3">
+          <wp:inline distT="0" distB="0" distL="0" distR="0" wp14:anchorId="285BEF66" wp14:editId="69FBF12C">
             <wp:extent cx="5120640" cy="2844800"/>
             <wp:effectExtent l="0" t="0" r="0" b="0"/>
             <wp:docPr id="8" name="Picture 8"/>
@@ -13037,7 +13217,7 @@
           <w:noProof/>
         </w:rPr>
         <w:drawing>
-          <wp:inline distT="0" distB="0" distL="0" distR="0" wp14:anchorId="72BBEAFD" wp14:editId="2E32D962">
+          <wp:inline distT="0" distB="0" distL="0" distR="0" wp14:anchorId="01600C04" wp14:editId="5CB99F90">
             <wp:extent cx="5120640" cy="2703698"/>
             <wp:effectExtent l="0" t="0" r="0" b="0"/>
             <wp:docPr id="9" name="Picture 9"/>
@@ -13443,7 +13623,7 @@
           <w:noProof/>
         </w:rPr>
         <w:drawing>
-          <wp:inline distT="0" distB="0" distL="0" distR="0" wp14:anchorId="6FCA469C" wp14:editId="3E03CFD9">
+          <wp:inline distT="0" distB="0" distL="0" distR="0" wp14:anchorId="582B344C" wp14:editId="0C823CE0">
             <wp:extent cx="4937760" cy="2743200"/>
             <wp:effectExtent l="0" t="0" r="0" b="0"/>
             <wp:docPr id="10" name="Picture 10"/>
@@ -13497,7 +13677,7 @@
       <w:pPr>
         <w:pStyle w:val="Heading3"/>
       </w:pPr>
-      <w:bookmarkStart w:id="14" w:name="_Toc240829261"/>
+      <w:bookmarkStart w:id="14" w:name="_Toc240829755"/>
       <w:r>
         <w:t>Customer Priority: Distillation from Language Model Labels</w:t>
       </w:r>
@@ -13921,7 +14101,7 @@
       <w:pPr>
         <w:pStyle w:val="Heading3"/>
       </w:pPr>
-      <w:bookmarkStart w:id="15" w:name="_Toc240829262"/>
+      <w:bookmarkStart w:id="15" w:name="_Toc240829756"/>
       <w:r>
         <w:t>Router Photo Classification</w:t>
       </w:r>
@@ -14591,7 +14771,7 @@
           <w:noProof/>
         </w:rPr>
         <w:drawing>
-          <wp:inline distT="0" distB="0" distL="0" distR="0" wp14:anchorId="3349975E" wp14:editId="2940BB54">
+          <wp:inline distT="0" distB="0" distL="0" distR="0" wp14:anchorId="7B661B1D" wp14:editId="172B1B27">
             <wp:extent cx="5120640" cy="2844800"/>
             <wp:effectExtent l="0" t="0" r="0" b="0"/>
             <wp:docPr id="11" name="Picture 11"/>
@@ -14645,7 +14825,7 @@
       <w:pPr>
         <w:pStyle w:val="Heading3"/>
       </w:pPr>
-      <w:bookmarkStart w:id="16" w:name="_Toc240829263"/>
+      <w:bookmarkStart w:id="16" w:name="_Toc240829757"/>
       <w:r>
         <w:t>Speech Transcription</w:t>
       </w:r>
@@ -15102,7 +15282,7 @@
         </w:rPr>
         <w:lastRenderedPageBreak/>
         <w:drawing>
-          <wp:inline distT="0" distB="0" distL="0" distR="0" wp14:anchorId="335F589D" wp14:editId="6BD7435E">
+          <wp:inline distT="0" distB="0" distL="0" distR="0" wp14:anchorId="6BBD6522" wp14:editId="5BDDAB82">
             <wp:extent cx="5120640" cy="1506071"/>
             <wp:effectExtent l="0" t="0" r="0" b="0"/>
             <wp:docPr id="12" name="Picture 12"/>
@@ -15156,7 +15336,7 @@
       <w:pPr>
         <w:pStyle w:val="Heading3"/>
       </w:pPr>
-      <w:bookmarkStart w:id="17" w:name="_Toc240829264"/>
+      <w:bookmarkStart w:id="17" w:name="_Toc240829758"/>
       <w:r>
         <w:t>Grounded Response Validation</w:t>
       </w:r>
@@ -15204,6 +15384,7 @@
       <w:r>
         <w:rPr>
           <w:rFonts w:ascii="Consolas" w:hAnsi="Consolas" w:cs="Consolas"/>
+          <w:color w:val="242428"/>
           <w:sz w:val="15"/>
         </w:rPr>
         <w:t>D:\DSEP22\response-prototype\.venv\Lib\site-packages\pydantic_settings\sources\utils.py:47: IncompleteFieldDefinitionWarning: Field 'lifespan' has an incomplete definition: its annotation contains an unresolved forward reference, so settings sources may fail to correctly resolve its value. Call `model_rebuild()` on the model where the field is defined, once all the referenced types are defined.</w:t>
@@ -15220,6 +15401,7 @@
       <w:r>
         <w:rPr>
           <w:rFonts w:ascii="Consolas" w:hAnsi="Consolas" w:cs="Consolas"/>
+          <w:color w:val="242428"/>
           <w:sz w:val="15"/>
         </w:rPr>
         <w:t xml:space="preserve">  warnings.warn(</w:t>
@@ -15236,6 +15418,7 @@
       <w:r>
         <w:rPr>
           <w:rFonts w:ascii="Consolas" w:hAnsi="Consolas" w:cs="Consolas"/>
+          <w:color w:val="242428"/>
           <w:sz w:val="15"/>
         </w:rPr>
         <w:t>Processing request of type ListToolsRequest</w:t>
@@ -15252,6 +15435,7 @@
       <w:r>
         <w:rPr>
           <w:rFonts w:ascii="Consolas" w:hAnsi="Consolas" w:cs="Consolas"/>
+          <w:color w:val="242428"/>
           <w:sz w:val="15"/>
         </w:rPr>
         <w:t>Processing request of type CallToolRequest</w:t>
@@ -15268,6 +15452,7 @@
       <w:r>
         <w:rPr>
           <w:rFonts w:ascii="Consolas" w:hAnsi="Consolas" w:cs="Consolas"/>
+          <w:color w:val="242428"/>
           <w:sz w:val="15"/>
         </w:rPr>
         <w:t>Processing request of type CallToolRequest</w:t>
@@ -15284,6 +15469,7 @@
       <w:r>
         <w:rPr>
           <w:rFonts w:ascii="Consolas" w:hAnsi="Consolas" w:cs="Consolas"/>
+          <w:color w:val="242428"/>
           <w:sz w:val="15"/>
         </w:rPr>
         <w:t>Processing request of type CallToolRequest</w:t>
@@ -15300,6 +15486,7 @@
       <w:r>
         <w:rPr>
           <w:rFonts w:ascii="Consolas" w:hAnsi="Consolas" w:cs="Consolas"/>
+          <w:color w:val="242428"/>
           <w:sz w:val="15"/>
         </w:rPr>
         <w:t>Processing request of type CallToolRequest</w:t>
@@ -15316,6 +15503,7 @@
       <w:r>
         <w:rPr>
           <w:rFonts w:ascii="Consolas" w:hAnsi="Consolas" w:cs="Consolas"/>
+          <w:color w:val="242428"/>
           <w:sz w:val="15"/>
         </w:rPr>
         <w:t>Processing request of type CallToolRequest</w:t>
@@ -15332,6 +15520,7 @@
       <w:r>
         <w:rPr>
           <w:rFonts w:ascii="Consolas" w:hAnsi="Consolas" w:cs="Consolas"/>
+          <w:color w:val="242428"/>
           <w:sz w:val="15"/>
         </w:rPr>
         <w:t>Processing request of type CallToolRequest</w:t>
@@ -15348,6 +15537,7 @@
       <w:r>
         <w:rPr>
           <w:rFonts w:ascii="Consolas" w:hAnsi="Consolas" w:cs="Consolas"/>
+          <w:color w:val="242428"/>
           <w:sz w:val="15"/>
         </w:rPr>
         <w:t>Processing request of type CallToolRequest</w:t>
@@ -15364,6 +15554,7 @@
       <w:r>
         <w:rPr>
           <w:rFonts w:ascii="Consolas" w:hAnsi="Consolas" w:cs="Consolas"/>
+          <w:color w:val="242428"/>
           <w:sz w:val="15"/>
         </w:rPr>
         <w:t>Processing request of type CallToolRequest</w:t>
@@ -15380,6 +15571,7 @@
       <w:r>
         <w:rPr>
           <w:rFonts w:ascii="Consolas" w:hAnsi="Consolas" w:cs="Consolas"/>
+          <w:color w:val="242428"/>
           <w:sz w:val="15"/>
         </w:rPr>
         <w:t>Processing request of type CallToolRequest</w:t>
@@ -15396,6 +15588,7 @@
       <w:r>
         <w:rPr>
           <w:rFonts w:ascii="Consolas" w:hAnsi="Consolas" w:cs="Consolas"/>
+          <w:color w:val="242428"/>
           <w:sz w:val="15"/>
         </w:rPr>
         <w:t>Processing request of type CallToolRequest</w:t>
@@ -15412,6 +15605,7 @@
       <w:r>
         <w:rPr>
           <w:rFonts w:ascii="Consolas" w:hAnsi="Consolas" w:cs="Consolas"/>
+          <w:color w:val="242428"/>
           <w:sz w:val="15"/>
         </w:rPr>
         <w:t>Processing request of type CallToolRequest</w:t>
@@ -15428,6 +15622,7 @@
       <w:r>
         <w:rPr>
           <w:rFonts w:ascii="Consolas" w:hAnsi="Consolas" w:cs="Consolas"/>
+          <w:color w:val="242428"/>
           <w:sz w:val="15"/>
         </w:rPr>
         <w:t>Processing request of type CallToolRequest</w:t>
@@ -15444,6 +15639,7 @@
       <w:r>
         <w:rPr>
           <w:rFonts w:ascii="Consolas" w:hAnsi="Consolas" w:cs="Consolas"/>
+          <w:color w:val="242428"/>
           <w:sz w:val="15"/>
         </w:rPr>
         <w:t>Processing request of type CallToolRequest</w:t>
@@ -15460,6 +15656,7 @@
       <w:r>
         <w:rPr>
           <w:rFonts w:ascii="Consolas" w:hAnsi="Consolas" w:cs="Consolas"/>
+          <w:color w:val="242428"/>
           <w:sz w:val="15"/>
         </w:rPr>
         <w:t>Processing request of type CallToolRequest</w:t>
@@ -15476,6 +15673,7 @@
       <w:r>
         <w:rPr>
           <w:rFonts w:ascii="Consolas" w:hAnsi="Consolas" w:cs="Consolas"/>
+          <w:color w:val="242428"/>
           <w:sz w:val="15"/>
         </w:rPr>
         <w:t>MCP tools loaded: ['get_customer_by_id', 'get_payment_status', 'get_network_access_status', 'get_plan_details']</w:t>
@@ -15492,6 +15690,7 @@
       <w:r>
         <w:rPr>
           <w:rFonts w:ascii="Consolas" w:hAnsi="Consolas" w:cs="Consolas"/>
+          <w:color w:val="242428"/>
           <w:sz w:val="15"/>
         </w:rPr>
         <w:t xml:space="preserve"> </w:t>
@@ -15508,6 +15707,7 @@
       <w:r>
         <w:rPr>
           <w:rFonts w:ascii="Consolas" w:hAnsi="Consolas" w:cs="Consolas"/>
+          <w:color w:val="1B7F3B"/>
           <w:sz w:val="15"/>
         </w:rPr>
         <w:t xml:space="preserve">    PASS  server exposes 4 tools</w:t>
@@ -15524,6 +15724,7 @@
       <w:r>
         <w:rPr>
           <w:rFonts w:ascii="Consolas" w:hAnsi="Consolas" w:cs="Consolas"/>
+          <w:color w:val="A56B00"/>
           <w:sz w:val="15"/>
         </w:rPr>
         <w:t>... 58 lines omitted ...</w:t>
@@ -15540,6 +15741,7 @@
       <w:r>
         <w:rPr>
           <w:rFonts w:ascii="Consolas" w:hAnsi="Consolas" w:cs="Consolas"/>
+          <w:color w:val="1B7F3B"/>
           <w:sz w:val="15"/>
         </w:rPr>
         <w:t xml:space="preserve">    PASS  generate node ran once</w:t>
@@ -15556,6 +15758,7 @@
       <w:r>
         <w:rPr>
           <w:rFonts w:ascii="Consolas" w:hAnsi="Consolas" w:cs="Consolas"/>
+          <w:color w:val="1B7F3B"/>
           <w:sz w:val="15"/>
         </w:rPr>
         <w:t xml:space="preserve">    PASS  grounding block present in prompt</w:t>
@@ -15572,6 +15775,7 @@
       <w:r>
         <w:rPr>
           <w:rFonts w:ascii="Consolas" w:hAnsi="Consolas" w:cs="Consolas"/>
+          <w:color w:val="1B7F3B"/>
           <w:sz w:val="15"/>
         </w:rPr>
         <w:t xml:space="preserve">    PASS  fact found=False embedded in grounding prompt</w:t>
@@ -15588,6 +15792,7 @@
       <w:r>
         <w:rPr>
           <w:rFonts w:ascii="Consolas" w:hAnsi="Consolas" w:cs="Consolas"/>
+          <w:color w:val="1B7F3B"/>
           <w:sz w:val="15"/>
         </w:rPr>
         <w:t xml:space="preserve">    PASS  answer written to state</w:t>
@@ -15604,6 +15809,7 @@
       <w:r>
         <w:rPr>
           <w:rFonts w:ascii="Consolas" w:hAnsi="Consolas" w:cs="Consolas"/>
+          <w:color w:val="242428"/>
           <w:sz w:val="15"/>
         </w:rPr>
         <w:t xml:space="preserve"> </w:t>
@@ -15620,6 +15826,7 @@
       <w:r>
         <w:rPr>
           <w:rFonts w:ascii="Consolas" w:hAnsi="Consolas" w:cs="Consolas"/>
+          <w:color w:val="242428"/>
           <w:sz w:val="15"/>
         </w:rPr>
         <w:t>KEY ASSERTION - connectivity multi-tool chain:</w:t>
@@ -15636,6 +15843,7 @@
       <w:r>
         <w:rPr>
           <w:rFonts w:ascii="Consolas" w:hAnsi="Consolas" w:cs="Consolas"/>
+          <w:color w:val="1B7F3B"/>
           <w:sz w:val="15"/>
         </w:rPr>
         <w:t xml:space="preserve">    PASS  connectivity chained network AND payment lookups</w:t>
@@ -15652,6 +15860,7 @@
       <w:r>
         <w:rPr>
           <w:rFonts w:ascii="Consolas" w:hAnsi="Consolas" w:cs="Consolas"/>
+          <w:color w:val="242428"/>
           <w:sz w:val="15"/>
         </w:rPr>
         <w:t xml:space="preserve"> </w:t>
@@ -15668,6 +15877,7 @@
       <w:r>
         <w:rPr>
           <w:rFonts w:ascii="Consolas" w:hAnsi="Consolas" w:cs="Consolas"/>
+          <w:color w:val="242428"/>
           <w:sz w:val="15"/>
         </w:rPr>
         <w:t>============================================================</w:t>
@@ -15683,6 +15893,7 @@
       <w:r>
         <w:rPr>
           <w:rFonts w:ascii="Consolas" w:hAnsi="Consolas" w:cs="Consolas"/>
+          <w:color w:val="1B7F3B"/>
           <w:sz w:val="15"/>
         </w:rPr>
         <w:t>ALL CHECKS PASSED</w:t>
@@ -15706,7 +15917,7 @@
       <w:pPr>
         <w:pStyle w:val="Heading1"/>
       </w:pPr>
-      <w:bookmarkStart w:id="18" w:name="_Toc240829265"/>
+      <w:bookmarkStart w:id="18" w:name="_Toc240829759"/>
       <w:r>
         <w:t>Deliverables</w:t>
       </w:r>
@@ -15832,7 +16043,7 @@
       <w:pPr>
         <w:pStyle w:val="Heading2"/>
       </w:pPr>
-      <w:bookmarkStart w:id="19" w:name="_Toc240829266"/>
+      <w:bookmarkStart w:id="19" w:name="_Toc240829760"/>
       <w:r>
         <w:t>Test Evaluation Summaries</w:t>
       </w:r>
@@ -17955,6 +18166,8 @@
       <w:r>
         <w:rPr>
           <w:rFonts w:ascii="Consolas" w:hAnsi="Consolas" w:cs="Consolas"/>
+          <w:b/>
+          <w:color w:val="1F5FA8"/>
           <w:sz w:val="15"/>
         </w:rPr>
         <w:t>$ bash scripts/test-all.sh</w:t>
@@ -17971,6 +18184,7 @@
       <w:r>
         <w:rPr>
           <w:rFonts w:ascii="Consolas" w:hAnsi="Consolas" w:cs="Consolas"/>
+          <w:color w:val="242428"/>
           <w:sz w:val="15"/>
         </w:rPr>
         <w:t>Resolved 106 packages in 8ms</w:t>
@@ -17987,6 +18201,7 @@
       <w:r>
         <w:rPr>
           <w:rFonts w:ascii="Consolas" w:hAnsi="Consolas" w:cs="Consolas"/>
+          <w:color w:val="242428"/>
           <w:sz w:val="15"/>
         </w:rPr>
         <w:t>Audited 74 packages in 0.43ms</w:t>
@@ -18003,6 +18218,7 @@
       <w:r>
         <w:rPr>
           <w:rFonts w:ascii="Consolas" w:hAnsi="Consolas" w:cs="Consolas"/>
+          <w:color w:val="1B7F3B"/>
           <w:sz w:val="15"/>
         </w:rPr>
         <w:t>All checks passed!</w:t>
@@ -18019,6 +18235,7 @@
       <w:r>
         <w:rPr>
           <w:rFonts w:ascii="Consolas" w:hAnsi="Consolas" w:cs="Consolas"/>
+          <w:color w:val="1B7F3B"/>
           <w:sz w:val="15"/>
         </w:rPr>
         <w:t>.....                                                                    [100%]</w:t>
@@ -18035,6 +18252,7 @@
       <w:r>
         <w:rPr>
           <w:rFonts w:ascii="Consolas" w:hAnsi="Consolas" w:cs="Consolas"/>
+          <w:color w:val="1B7F3B"/>
           <w:sz w:val="15"/>
         </w:rPr>
         <w:t>5 passed in 0.09s</w:t>
@@ -18051,6 +18269,7 @@
       <w:r>
         <w:rPr>
           <w:rFonts w:ascii="Consolas" w:hAnsi="Consolas" w:cs="Consolas"/>
+          <w:color w:val="1B7F3B"/>
           <w:sz w:val="15"/>
         </w:rPr>
         <w:t>.........                                                                [100%]</w:t>
@@ -18067,6 +18286,7 @@
       <w:r>
         <w:rPr>
           <w:rFonts w:ascii="Consolas" w:hAnsi="Consolas" w:cs="Consolas"/>
+          <w:color w:val="242428"/>
           <w:sz w:val="15"/>
         </w:rPr>
         <w:t>============================== warnings summary ===============================</w:t>
@@ -18083,6 +18303,7 @@
       <w:r>
         <w:rPr>
           <w:rFonts w:ascii="Consolas" w:hAnsi="Consolas" w:cs="Consolas"/>
+          <w:color w:val="242428"/>
           <w:sz w:val="15"/>
         </w:rPr>
         <w:t>services/gateway/tests/test_jwks.py::test_hs256_alg_confusion_rejected</w:t>
@@ -18099,6 +18320,7 @@
       <w:r>
         <w:rPr>
           <w:rFonts w:ascii="Consolas" w:hAnsi="Consolas" w:cs="Consolas"/>
+          <w:color w:val="242428"/>
           <w:sz w:val="15"/>
         </w:rPr>
         <w:t xml:space="preserve">  D:\DSEP22\v3\.venv\Lib\site-packages\jwt\api_jwt.py:149: InsecureKeyLengthWarning: The HMAC key is 6 bytes long, which is below the minimum recommended length of 32 bytes for SHA256. See RFC 7518 Section 3.2.</w:t>
@@ -18115,6 +18337,7 @@
       <w:r>
         <w:rPr>
           <w:rFonts w:ascii="Consolas" w:hAnsi="Consolas" w:cs="Consolas"/>
+          <w:color w:val="242428"/>
           <w:sz w:val="15"/>
         </w:rPr>
         <w:t xml:space="preserve">    return self._jws.encode(</w:t>
@@ -18131,6 +18354,7 @@
       <w:r>
         <w:rPr>
           <w:rFonts w:ascii="Consolas" w:hAnsi="Consolas" w:cs="Consolas"/>
+          <w:color w:val="242428"/>
           <w:sz w:val="15"/>
         </w:rPr>
         <w:t xml:space="preserve"> </w:t>
@@ -18147,6 +18371,7 @@
       <w:r>
         <w:rPr>
           <w:rFonts w:ascii="Consolas" w:hAnsi="Consolas" w:cs="Consolas"/>
+          <w:color w:val="6A6A6A"/>
           <w:sz w:val="15"/>
         </w:rPr>
         <w:t>-- Docs: https://docs.pytest.org/en/stable/how-to/capture-warnings.html</w:t>
@@ -18163,6 +18388,7 @@
       <w:r>
         <w:rPr>
           <w:rFonts w:ascii="Consolas" w:hAnsi="Consolas" w:cs="Consolas"/>
+          <w:color w:val="A56B00"/>
           <w:sz w:val="15"/>
         </w:rPr>
         <w:t>9 passed, 1 warning in 0.11s</w:t>
@@ -18179,6 +18405,7 @@
       <w:r>
         <w:rPr>
           <w:rFonts w:ascii="Consolas" w:hAnsi="Consolas" w:cs="Consolas"/>
+          <w:color w:val="1B7F3B"/>
           <w:sz w:val="15"/>
         </w:rPr>
         <w:t>....................                                                     [100%]</w:t>
@@ -18195,6 +18422,7 @@
       <w:r>
         <w:rPr>
           <w:rFonts w:ascii="Consolas" w:hAnsi="Consolas" w:cs="Consolas"/>
+          <w:color w:val="1B7F3B"/>
           <w:sz w:val="15"/>
         </w:rPr>
         <w:t>20 passed in 0.63s</w:t>
@@ -18211,6 +18439,7 @@
       <w:r>
         <w:rPr>
           <w:rFonts w:ascii="Consolas" w:hAnsi="Consolas" w:cs="Consolas"/>
+          <w:color w:val="1B7F3B"/>
           <w:sz w:val="15"/>
         </w:rPr>
         <w:t>.....                                                                    [100%]</w:t>
@@ -18227,6 +18456,7 @@
       <w:r>
         <w:rPr>
           <w:rFonts w:ascii="Consolas" w:hAnsi="Consolas" w:cs="Consolas"/>
+          <w:color w:val="1B7F3B"/>
           <w:sz w:val="15"/>
         </w:rPr>
         <w:t>5 passed in 0.02s</w:t>
@@ -18243,6 +18473,7 @@
       <w:r>
         <w:rPr>
           <w:rFonts w:ascii="Consolas" w:hAnsi="Consolas" w:cs="Consolas"/>
+          <w:color w:val="1B7F3B"/>
           <w:sz w:val="15"/>
         </w:rPr>
         <w:t>.......................                                                  [100%]</w:t>
@@ -18259,6 +18490,7 @@
       <w:r>
         <w:rPr>
           <w:rFonts w:ascii="Consolas" w:hAnsi="Consolas" w:cs="Consolas"/>
+          <w:color w:val="242428"/>
           <w:sz w:val="15"/>
         </w:rPr>
         <w:t>============================== warnings summary ===============================</w:t>
@@ -18275,6 +18507,7 @@
       <w:r>
         <w:rPr>
           <w:rFonts w:ascii="Consolas" w:hAnsi="Consolas" w:cs="Consolas"/>
+          <w:color w:val="242428"/>
           <w:sz w:val="15"/>
         </w:rPr>
         <w:t>app\main.py:80</w:t>
@@ -18291,6 +18524,7 @@
       <w:r>
         <w:rPr>
           <w:rFonts w:ascii="Consolas" w:hAnsi="Consolas" w:cs="Consolas"/>
+          <w:color w:val="242428"/>
           <w:sz w:val="15"/>
         </w:rPr>
         <w:t xml:space="preserve">  D:\DSEP22\v3\services\triage\app\main.py:80: DeprecationWarning:</w:t>
@@ -18307,6 +18541,7 @@
       <w:r>
         <w:rPr>
           <w:rFonts w:ascii="Consolas" w:hAnsi="Consolas" w:cs="Consolas"/>
+          <w:color w:val="A56B00"/>
           <w:sz w:val="15"/>
         </w:rPr>
         <w:t>... 46 lines omitted ...</w:t>
@@ -18323,6 +18558,7 @@
       <w:r>
         <w:rPr>
           <w:rFonts w:ascii="Consolas" w:hAnsi="Consolas" w:cs="Consolas"/>
+          <w:color w:val="242428"/>
           <w:sz w:val="15"/>
         </w:rPr>
         <w:t xml:space="preserve">  type: 'test'</w:t>
@@ -18339,6 +18575,7 @@
       <w:r>
         <w:rPr>
           <w:rFonts w:ascii="Consolas" w:hAnsi="Consolas" w:cs="Consolas"/>
+          <w:color w:val="242428"/>
           <w:sz w:val="15"/>
         </w:rPr>
         <w:t xml:space="preserve">  ...</w:t>
@@ -18355,6 +18592,7 @@
       <w:r>
         <w:rPr>
           <w:rFonts w:ascii="Consolas" w:hAnsi="Consolas" w:cs="Consolas"/>
+          <w:color w:val="242428"/>
           <w:sz w:val="15"/>
         </w:rPr>
         <w:t>1..2</w:t>
@@ -18371,6 +18609,7 @@
       <w:r>
         <w:rPr>
           <w:rFonts w:ascii="Consolas" w:hAnsi="Consolas" w:cs="Consolas"/>
+          <w:color w:val="6A6A6A"/>
           <w:sz w:val="15"/>
         </w:rPr>
         <w:t># tests 2</w:t>
@@ -18387,6 +18626,7 @@
       <w:r>
         <w:rPr>
           <w:rFonts w:ascii="Consolas" w:hAnsi="Consolas" w:cs="Consolas"/>
+          <w:color w:val="6A6A6A"/>
           <w:sz w:val="15"/>
         </w:rPr>
         <w:t># suites 0</w:t>
@@ -18403,6 +18643,7 @@
       <w:r>
         <w:rPr>
           <w:rFonts w:ascii="Consolas" w:hAnsi="Consolas" w:cs="Consolas"/>
+          <w:color w:val="6A6A6A"/>
           <w:sz w:val="15"/>
         </w:rPr>
         <w:t># pass 2</w:t>
@@ -18419,6 +18660,7 @@
       <w:r>
         <w:rPr>
           <w:rFonts w:ascii="Consolas" w:hAnsi="Consolas" w:cs="Consolas"/>
+          <w:color w:val="6A6A6A"/>
           <w:sz w:val="15"/>
         </w:rPr>
         <w:t># fail 0</w:t>
@@ -18435,6 +18677,7 @@
       <w:r>
         <w:rPr>
           <w:rFonts w:ascii="Consolas" w:hAnsi="Consolas" w:cs="Consolas"/>
+          <w:color w:val="6A6A6A"/>
           <w:sz w:val="15"/>
         </w:rPr>
         <w:t># cancelled 0</w:t>
@@ -18451,6 +18694,7 @@
       <w:r>
         <w:rPr>
           <w:rFonts w:ascii="Consolas" w:hAnsi="Consolas" w:cs="Consolas"/>
+          <w:color w:val="A56B00"/>
           <w:sz w:val="15"/>
         </w:rPr>
         <w:t># skipped 0</w:t>
@@ -18467,6 +18711,7 @@
       <w:r>
         <w:rPr>
           <w:rFonts w:ascii="Consolas" w:hAnsi="Consolas" w:cs="Consolas"/>
+          <w:color w:val="6A6A6A"/>
           <w:sz w:val="15"/>
         </w:rPr>
         <w:t># todo 0</w:t>
@@ -18483,6 +18728,7 @@
       <w:r>
         <w:rPr>
           <w:rFonts w:ascii="Consolas" w:hAnsi="Consolas" w:cs="Consolas"/>
+          <w:color w:val="6A6A6A"/>
           <w:sz w:val="15"/>
         </w:rPr>
         <w:t># duration_ms 217.914</w:t>
@@ -18498,6 +18744,7 @@
       <w:r>
         <w:rPr>
           <w:rFonts w:ascii="Consolas" w:hAnsi="Consolas" w:cs="Consolas"/>
+          <w:color w:val="1B7F3B"/>
           <w:sz w:val="15"/>
         </w:rPr>
         <w:t>test-all OK</w:t>
@@ -18521,7 +18768,7 @@
       <w:pPr>
         <w:pStyle w:val="Heading2"/>
       </w:pPr>
-      <w:bookmarkStart w:id="20" w:name="_Toc240829267"/>
+      <w:bookmarkStart w:id="20" w:name="_Toc240829761"/>
       <w:r>
         <w:t>Reporting on Test Coverage</w:t>
       </w:r>
@@ -19224,7 +19471,7 @@
           <w:noProof/>
         </w:rPr>
         <w:drawing>
-          <wp:inline distT="0" distB="0" distL="0" distR="0" wp14:anchorId="3C40602A" wp14:editId="0CB5FE35">
+          <wp:inline distT="0" distB="0" distL="0" distR="0" wp14:anchorId="62097244" wp14:editId="1F7184F4">
             <wp:extent cx="5943600" cy="3714750"/>
             <wp:effectExtent l="0" t="0" r="0" b="0"/>
             <wp:docPr id="13" name="Picture 13"/>
@@ -19278,7 +19525,7 @@
       <w:pPr>
         <w:pStyle w:val="Heading1"/>
       </w:pPr>
-      <w:bookmarkStart w:id="21" w:name="_Toc240829268"/>
+      <w:bookmarkStart w:id="21" w:name="_Toc240829762"/>
       <w:r>
         <w:t>Risks, Dependencies, Assumptions, and Constraints</w:t>
       </w:r>
@@ -19942,7 +20189,7 @@
       <w:pPr>
         <w:pStyle w:val="Heading1"/>
       </w:pPr>
-      <w:bookmarkStart w:id="22" w:name="_Toc240829269"/>
+      <w:bookmarkStart w:id="22" w:name="_Toc240829763"/>
       <w:r>
         <w:t>References</w:t>
       </w:r>
@@ -19953,47 +20200,71 @@
         <w:pStyle w:val="BodyText"/>
       </w:pPr>
       <w:r>
-        <w:t>[1] IBM, "Rational Unified Process: Master Test Plan template." Provided by the course. Accessed: Sep. 20, 2026.</w:t>
-      </w:r>
-    </w:p>
-    <w:p>
-      <w:pPr>
-        <w:pStyle w:val="BodyText"/>
-      </w:pPr>
-      <w:r>
-        <w:t>[2] Microsoft, "Playwright: fast and reliable end-to-end testing." [Online]. Available: https://playwright.dev/ (Accessed: Sep. 20, 2026).</w:t>
-      </w:r>
-    </w:p>
-    <w:p>
-      <w:pPr>
-        <w:pStyle w:val="BodyText"/>
-      </w:pPr>
-      <w:r>
-        <w:t>[3] Grafana Labs, "k6: load testing for engineering teams." [Online]. Available: https://k6.io/ (Accessed: Sep. 20, 2026).</w:t>
-      </w:r>
-    </w:p>
-    <w:p>
-      <w:pPr>
-        <w:pStyle w:val="BodyText"/>
-      </w:pPr>
-      <w:r>
-        <w:t>[4] pytest developers, "pytest documentation." [Online]. Available: https://docs.pytest.org/ (Accessed: Sep. 20, 2026).</w:t>
-      </w:r>
-    </w:p>
-    <w:p>
-      <w:pPr>
-        <w:pStyle w:val="BodyText"/>
-      </w:pPr>
-      <w:r>
-        <w:t>[5] Prometheus authors, "Prometheus: monitoring system and time series database." [Online]. Available: https://prometheus.io/ (Accessed: Sep. 20, 2026).</w:t>
-      </w:r>
-    </w:p>
-    <w:p>
-      <w:pPr>
-        <w:pStyle w:val="BodyText"/>
-      </w:pPr>
-      <w:r>
-        <w:t>[6] Grafana Labs, "Grafana documentation: provisioning." [Online]. Available: https://grafana.com/docs/grafana/latest/administration/provisioning/ (Accessed: Sep. 20, 2026).</w:t>
+        <w:t>[1] IBM, "Rational Unified Process: Master Test Plan template." Provided by the course.</w:t>
+      </w:r>
+    </w:p>
+    <w:p>
+      <w:pPr>
+        <w:pStyle w:val="BodyText"/>
+      </w:pPr>
+      <w:r>
+        <w:t>[2] Microsoft, "Playwright: fast and reliable end-to-end testing." [Online]. Available: https://playwright.dev/.</w:t>
+      </w:r>
+    </w:p>
+    <w:p>
+      <w:pPr>
+        <w:pStyle w:val="BodyText"/>
+      </w:pPr>
+      <w:r>
+        <w:t>[3] Grafana Labs, "k6: load testing for engineering teams." [Online]. Available: https://k6.io/.</w:t>
+      </w:r>
+    </w:p>
+    <w:p>
+      <w:pPr>
+        <w:pStyle w:val="BodyText"/>
+      </w:pPr>
+      <w:r>
+        <w:t>[4] pytest developers, "pytest documentation." [Online]. Available: https://docs.pytest.org/.</w:t>
+      </w:r>
+    </w:p>
+    <w:p>
+      <w:pPr>
+        <w:pStyle w:val="BodyText"/>
+      </w:pPr>
+      <w:r>
+        <w:t>[5] Prometheus authors, "Prometheus: monitoring system and time series database." [Online]. Available: https://prometheus.io/.</w:t>
+      </w:r>
+    </w:p>
+    <w:p>
+      <w:pPr>
+        <w:pStyle w:val="BodyText"/>
+      </w:pPr>
+      <w:r>
+        <w:t>[6] Grafana Labs, "Grafana documentation: provisioning." [Online]. Available: https://grafana.com/docs/grafana/latest/administration/provisioning/.</w:t>
+      </w:r>
+    </w:p>
+    <w:p>
+      <w:pPr>
+        <w:pStyle w:val="BodyText"/>
+      </w:pPr>
+      <w:r>
+        <w:t>[7] Google, "cAdvisor: container advisor." [Online]. Available: https://github.com/google/cadvisor.</w:t>
+      </w:r>
+    </w:p>
+    <w:p>
+      <w:pPr>
+        <w:pStyle w:val="BodyText"/>
+      </w:pPr>
+      <w:r>
+        <w:t>[8] Groq, "GroqCloud API reference and rate limits." [Online]. Available: https://console.groq.com/docs/rate-limits.</w:t>
+      </w:r>
+    </w:p>
+    <w:p>
+      <w:pPr>
+        <w:pStyle w:val="BodyText"/>
+      </w:pPr>
+      <w:r>
+        <w:t>[9] Gitleaks, "Gitleaks: find secrets with Gitleaks." [Online]. Available: https://github.com/gitleaks/gitleaks.</w:t>
       </w:r>
     </w:p>
     <w:p>
@@ -20002,30 +20273,6 @@
       </w:pPr>
       <w:r>
         <w:lastRenderedPageBreak/>
-        <w:t>[7] Google, "cAdvisor: container advisor." [Online]. Available: https://github.com/google/cadvisor (Accessed: Sep. 20, 2026).</w:t>
-      </w:r>
-    </w:p>
-    <w:p>
-      <w:pPr>
-        <w:pStyle w:val="BodyText"/>
-      </w:pPr>
-      <w:r>
-        <w:t>[8] Groq, "GroqCloud API reference and rate limits." [Online]. Available: https://console.groq.com/docs/rate-limits (Accessed: Sep. 20, 2026).</w:t>
-      </w:r>
-    </w:p>
-    <w:p>
-      <w:pPr>
-        <w:pStyle w:val="BodyText"/>
-      </w:pPr>
-      <w:r>
-        <w:t>[9] Gitleaks, "Gitleaks: find secrets with Gitleaks." [Online]. Available: https://github.com/gitleaks/gitleaks (Accessed: Sep. 20, 2026).</w:t>
-      </w:r>
-    </w:p>
-    <w:p>
-      <w:pPr>
-        <w:pStyle w:val="BodyText"/>
-      </w:pPr>
-      <w:r>
         <w:t>[10] NLLB Team et al., "No Language Left Behind: Scaling human-centered machine translation," arXiv:2207.04672, 2022.</w:t>
       </w:r>
     </w:p>
@@ -20035,14 +20282,6 @@
       </w:pPr>
       <w:r>
         <w:t>[11] A. Radford et al., "Robust speech recognition via large-scale weak supervision," arXiv:2212.04356, 2022.</w:t>
-      </w:r>
-    </w:p>
-    <w:p>
-      <w:pPr>
-        <w:pStyle w:val="BodyText"/>
-      </w:pPr>
-      <w:r>
-        <w:t>[12] Lanka Link v3 repository, docs/TEST-PLAN.md and docs/DEPLOYMENT.md. [Online]. Available: https://github.com/DSEP-G22/v3 (Accessed: Sep. 20, 2026).</w:t>
       </w:r>
     </w:p>
     <w:sectPr>

</xml_diff>